<commit_message>
nmv 12 07 2026
</commit_message>
<xml_diff>
--- a/TS Jatai Ghanam Project/TS 2.4/TS 2.4 Jatai Malayalam Corrections.docx
+++ b/TS Jatai Ghanam Project/TS 2.4/TS 2.4 Jatai Malayalam Corrections.docx
@@ -1,7 +1,2229 @@
 
 <file path=word/document.xml><?xml version="1.0" encoding="utf-8"?>
-<w:document xmlns:wpc="http://schemas.microsoft.com/office/word/2010/wordprocessingCanvas" xmlns:cx="http://schemas.microsoft.com/office/drawing/2014/chartex" xmlns:cx1="http://schemas.microsoft.com/office/drawing/2015/9/8/chartex" xmlns:cx2="http://schemas.microsoft.com/office/drawing/2015/10/21/chartex" xmlns:cx3="http://schemas.microsoft.com/office/drawing/2016/5/9/chartex" xmlns:cx4="http://schemas.microsoft.com/office/drawing/2016/5/10/chartex" xmlns:cx5="http://schemas.microsoft.com/office/drawing/2016/5/11/chartex" xmlns:cx6="http://schemas.microsoft.com/office/drawing/2016/5/12/chartex" xmlns:cx7="http://schemas.microsoft.com/office/drawing/2016/5/13/chartex" xmlns:cx8="http://schemas.microsoft.com/office/drawing/2016/5/14/chartex" xmlns:mc="http://schemas.openxmlformats.org/markup-compatibility/2006" xmlns:aink="http://schemas.microsoft.com/office/drawing/2016/ink" xmlns:am3d="http://schemas.microsoft.com/office/drawing/2017/model3d" xmlns:o="urn:schemas-microsoft-com:office:office" xmlns:oel="http://schemas.microsoft.com/office/2019/extlst" xmlns:r="http://schemas.openxmlformats.org/officeDocument/2006/relationships" xmlns:m="http://schemas.openxmlformats.org/officeDocument/2006/math" xmlns:v="urn:schemas-microsoft-com:vml" xmlns:wp14="http://schemas.microsoft.com/office/word/2010/wordprocessingDrawing" xmlns:wp="http://schemas.openxmlformats.org/drawingml/2006/wordprocessingDrawing" xmlns:w10="urn:schemas-microsoft-com:office:word" xmlns:w="http://schemas.openxmlformats.org/wordprocessingml/2006/main" xmlns:w14="http://schemas.microsoft.com/office/word/2010/wordml" xmlns:w15="http://schemas.microsoft.com/office/word/2012/wordml" xmlns:w16cex="http://schemas.microsoft.com/office/word/2018/wordml/cex" xmlns:w16cid="http://schemas.microsoft.com/office/word/2016/wordml/cid" xmlns:w16="http://schemas.microsoft.com/office/word/2018/wordml" xmlns:w16sdtdh="http://schemas.microsoft.com/office/word/2020/wordml/sdtdatahash" xmlns:w16se="http://schemas.microsoft.com/office/word/2015/wordml/symex" xmlns:wpg="http://schemas.microsoft.com/office/word/2010/wordprocessingGroup" xmlns:wpi="http://schemas.microsoft.com/office/word/2010/wordprocessingInk" xmlns:wne="http://schemas.microsoft.com/office/word/2006/wordml" xmlns:wps="http://schemas.microsoft.com/office/word/2010/wordprocessingShape" mc:Ignorable="w14 w15 w16se w16cid w16 w16cex w16sdtdh wp14">
+<w:document xmlns:wpc="http://schemas.microsoft.com/office/word/2010/wordprocessingCanvas" xmlns:cx="http://schemas.microsoft.com/office/drawing/2014/chartex" xmlns:cx1="http://schemas.microsoft.com/office/drawing/2015/9/8/chartex" xmlns:cx2="http://schemas.microsoft.com/office/drawing/2015/10/21/chartex" xmlns:cx3="http://schemas.microsoft.com/office/drawing/2016/5/9/chartex" xmlns:cx4="http://schemas.microsoft.com/office/drawing/2016/5/10/chartex" xmlns:cx5="http://schemas.microsoft.com/office/drawing/2016/5/11/chartex" xmlns:cx6="http://schemas.microsoft.com/office/drawing/2016/5/12/chartex" xmlns:cx7="http://schemas.microsoft.com/office/drawing/2016/5/13/chartex" xmlns:cx8="http://schemas.microsoft.com/office/drawing/2016/5/14/chartex" xmlns:mc="http://schemas.openxmlformats.org/markup-compatibility/2006" xmlns:aink="http://schemas.microsoft.com/office/drawing/2016/ink" xmlns:am3d="http://schemas.microsoft.com/office/drawing/2017/model3d" xmlns:o="urn:schemas-microsoft-com:office:office" xmlns:oel="http://schemas.microsoft.com/office/2019/extlst" xmlns:r="http://schemas.openxmlformats.org/officeDocument/2006/relationships" xmlns:m="http://schemas.openxmlformats.org/officeDocument/2006/math" xmlns:v="urn:schemas-microsoft-com:vml" xmlns:wp14="http://schemas.microsoft.com/office/word/2010/wordprocessingDrawing" xmlns:wp="http://schemas.openxmlformats.org/drawingml/2006/wordprocessingDrawing" xmlns:w10="urn:schemas-microsoft-com:office:word" xmlns:w="http://schemas.openxmlformats.org/wordprocessingml/2006/main" xmlns:w14="http://schemas.microsoft.com/office/word/2010/wordml" xmlns:w15="http://schemas.microsoft.com/office/word/2012/wordml" xmlns:w16cex="http://schemas.microsoft.com/office/word/2018/wordml/cex" xmlns:w16cid="http://schemas.microsoft.com/office/word/2016/wordml/cid" xmlns:w16="http://schemas.microsoft.com/office/word/2018/wordml" xmlns:w16du="http://schemas.microsoft.com/office/word/2023/wordml/word16du" xmlns:w16sdtdh="http://schemas.microsoft.com/office/word/2020/wordml/sdtdatahash" xmlns:w16sdtfl="http://schemas.microsoft.com/office/word/2024/wordml/sdtformatlock" xmlns:w16se="http://schemas.microsoft.com/office/word/2015/wordml/symex" xmlns:wpg="http://schemas.microsoft.com/office/word/2010/wordprocessingGroup" xmlns:wpi="http://schemas.microsoft.com/office/word/2010/wordprocessingInk" xmlns:wne="http://schemas.microsoft.com/office/word/2006/wordml" xmlns:wps="http://schemas.microsoft.com/office/word/2010/wordprocessingShape" mc:Ignorable="w14 w15 w16se w16cid w16 w16cex w16sdtdh w16sdtfl w16du wp14">
   <w:body>
+    <w:p>
+      <w:pPr>
+        <w:spacing w:before="0" w:line="240" w:lineRule="auto"/>
+        <w:jc w:val="center"/>
+        <w:rPr>
+          <w:b/>
+          <w:bCs/>
+          <w:sz w:val="32"/>
+          <w:szCs w:val="32"/>
+          <w:u w:val="single"/>
+        </w:rPr>
+      </w:pPr>
+      <w:r>
+        <w:rPr>
+          <w:b/>
+          <w:bCs/>
+          <w:sz w:val="32"/>
+          <w:szCs w:val="32"/>
+          <w:u w:val="single"/>
+        </w:rPr>
+        <w:t xml:space="preserve">TS Jatai – TS 2.4 Malayalam Corrections – Observed till </w:t>
+      </w:r>
+      <w:r>
+        <w:rPr>
+          <w:b/>
+          <w:bCs/>
+          <w:sz w:val="32"/>
+          <w:szCs w:val="32"/>
+          <w:highlight w:val="red"/>
+          <w:u w:val="single"/>
+        </w:rPr>
+        <w:t>??????</w:t>
+      </w:r>
+    </w:p>
+    <w:p>
+      <w:pPr>
+        <w:spacing w:before="0" w:line="240" w:lineRule="auto"/>
+        <w:jc w:val="center"/>
+        <w:rPr>
+          <w:b/>
+          <w:bCs/>
+          <w:sz w:val="28"/>
+          <w:szCs w:val="32"/>
+        </w:rPr>
+      </w:pPr>
+      <w:r>
+        <w:rPr>
+          <w:b/>
+          <w:bCs/>
+          <w:sz w:val="28"/>
+          <w:szCs w:val="32"/>
+        </w:rPr>
+        <w:t>(ignore those which are already incorporated in your book’s version and date)</w:t>
+      </w:r>
+    </w:p>
+    <w:tbl>
+      <w:tblPr>
+        <w:tblW w:w="14821" w:type="dxa"/>
+        <w:tblInd w:w="-792" w:type="dxa"/>
+        <w:tblBorders>
+          <w:top w:val="single" w:sz="4" w:space="0" w:color="000000"/>
+          <w:left w:val="single" w:sz="4" w:space="0" w:color="000000"/>
+          <w:bottom w:val="single" w:sz="4" w:space="0" w:color="000000"/>
+          <w:right w:val="single" w:sz="4" w:space="0" w:color="000000"/>
+          <w:insideH w:val="single" w:sz="4" w:space="0" w:color="000000"/>
+          <w:insideV w:val="single" w:sz="4" w:space="0" w:color="000000"/>
+        </w:tblBorders>
+        <w:tblLook w:val="04A0" w:firstRow="1" w:lastRow="0" w:firstColumn="1" w:lastColumn="0" w:noHBand="0" w:noVBand="1"/>
+      </w:tblPr>
+      <w:tblGrid>
+        <w:gridCol w:w="7308"/>
+        <w:gridCol w:w="7371"/>
+        <w:gridCol w:w="142"/>
+      </w:tblGrid>
+      <w:tr>
+        <w:trPr>
+          <w:gridAfter w:val="1"/>
+          <w:wAfter w:w="142" w:type="dxa"/>
+        </w:trPr>
+        <w:tc>
+          <w:tcPr>
+            <w:tcW w:w="7308" w:type="dxa"/>
+          </w:tcPr>
+          <w:p>
+            <w:pPr>
+              <w:spacing w:before="0" w:line="240" w:lineRule="auto"/>
+              <w:jc w:val="center"/>
+              <w:rPr>
+                <w:b/>
+                <w:sz w:val="32"/>
+                <w:szCs w:val="32"/>
+              </w:rPr>
+            </w:pPr>
+            <w:r>
+              <w:rPr>
+                <w:b/>
+                <w:sz w:val="32"/>
+                <w:szCs w:val="32"/>
+              </w:rPr>
+              <w:t>As Printed</w:t>
+            </w:r>
+          </w:p>
+        </w:tc>
+        <w:tc>
+          <w:tcPr>
+            <w:tcW w:w="7371" w:type="dxa"/>
+          </w:tcPr>
+          <w:p>
+            <w:pPr>
+              <w:spacing w:before="0" w:line="240" w:lineRule="auto"/>
+              <w:ind w:right="-18"/>
+              <w:jc w:val="center"/>
+              <w:rPr>
+                <w:b/>
+                <w:sz w:val="32"/>
+                <w:szCs w:val="32"/>
+              </w:rPr>
+            </w:pPr>
+            <w:r>
+              <w:rPr>
+                <w:b/>
+                <w:sz w:val="32"/>
+                <w:szCs w:val="32"/>
+              </w:rPr>
+              <w:t>To be read as or corrected as</w:t>
+            </w:r>
+            <w:r>
+              <w:rPr>
+                <w:b/>
+                <w:sz w:val="32"/>
+                <w:szCs w:val="32"/>
+              </w:rPr>
+              <w:t xml:space="preserve"> </w:t>
+            </w:r>
+          </w:p>
+        </w:tc>
+      </w:tr>
+      <w:tr>
+        <w:tc>
+          <w:tcPr>
+            <w:tcW w:w="7308" w:type="dxa"/>
+          </w:tcPr>
+          <w:p>
+            <w:pPr>
+              <w:widowControl w:val="0"/>
+              <w:autoSpaceDE w:val="0"/>
+              <w:autoSpaceDN w:val="0"/>
+              <w:adjustRightInd w:val="0"/>
+              <w:spacing w:line="240" w:lineRule="auto"/>
+              <w:rPr>
+                <w:rFonts w:ascii="BRH Malayalam Extra" w:hAnsi="BRH Malayalam Extra" w:cs="BRH Malayalam Extra"/>
+                <w:color w:val="000000"/>
+                <w:sz w:val="32"/>
+                <w:szCs w:val="40"/>
+              </w:rPr>
+            </w:pPr>
+            <w:r>
+              <w:rPr>
+                <w:rFonts w:cs="BRH Malayalam Extra"/>
+                <w:color w:val="000000"/>
+                <w:szCs w:val="40"/>
+              </w:rPr>
+              <w:t>17</w:t>
+            </w:r>
+            <w:r>
+              <w:rPr>
+                <w:rFonts w:ascii="BRH Malayalam Extra" w:hAnsi="BRH Malayalam Extra" w:cs="BRH Malayalam Extra"/>
+                <w:color w:val="000000"/>
+                <w:sz w:val="32"/>
+                <w:szCs w:val="40"/>
+              </w:rPr>
+              <w:t>)</w:t>
+            </w:r>
+            <w:r>
+              <w:rPr>
+                <w:rFonts w:ascii="BRH Malayalam Extra" w:hAnsi="BRH Malayalam Extra" w:cs="BRH Malayalam Extra"/>
+                <w:color w:val="000000"/>
+                <w:sz w:val="32"/>
+                <w:szCs w:val="40"/>
+              </w:rPr>
+              <w:tab/>
+            </w:r>
+            <w:r>
+              <w:rPr>
+                <w:rFonts w:cs="BRH Malayalam Extra"/>
+                <w:color w:val="000000"/>
+                <w:szCs w:val="40"/>
+              </w:rPr>
+              <w:t>2</w:t>
+            </w:r>
+            <w:r>
+              <w:rPr>
+                <w:rFonts w:ascii="BRH Malayalam Extra" w:hAnsi="BRH Malayalam Extra" w:cs="BRH Malayalam Extra"/>
+                <w:color w:val="000000"/>
+                <w:sz w:val="32"/>
+                <w:szCs w:val="40"/>
+              </w:rPr>
+              <w:t>.</w:t>
+            </w:r>
+            <w:r>
+              <w:rPr>
+                <w:rFonts w:cs="BRH Malayalam Extra"/>
+                <w:color w:val="000000"/>
+                <w:szCs w:val="40"/>
+              </w:rPr>
+              <w:t>4</w:t>
+            </w:r>
+            <w:r>
+              <w:rPr>
+                <w:rFonts w:ascii="BRH Malayalam Extra" w:hAnsi="BRH Malayalam Extra" w:cs="BRH Malayalam Extra"/>
+                <w:color w:val="000000"/>
+                <w:sz w:val="32"/>
+                <w:szCs w:val="40"/>
+              </w:rPr>
+              <w:t>.</w:t>
+            </w:r>
+            <w:r>
+              <w:rPr>
+                <w:rFonts w:cs="BRH Malayalam Extra"/>
+                <w:color w:val="000000"/>
+                <w:szCs w:val="40"/>
+              </w:rPr>
+              <w:t>8</w:t>
+            </w:r>
+            <w:r>
+              <w:rPr>
+                <w:rFonts w:ascii="BRH Malayalam Extra" w:hAnsi="BRH Malayalam Extra" w:cs="BRH Malayalam Extra"/>
+                <w:color w:val="000000"/>
+                <w:sz w:val="32"/>
+                <w:szCs w:val="40"/>
+              </w:rPr>
+              <w:t>.</w:t>
+            </w:r>
+            <w:r>
+              <w:rPr>
+                <w:rFonts w:cs="BRH Malayalam Extra"/>
+                <w:color w:val="000000"/>
+                <w:szCs w:val="40"/>
+              </w:rPr>
+              <w:t>1</w:t>
+            </w:r>
+            <w:r>
+              <w:rPr>
+                <w:rFonts w:ascii="BRH Malayalam Extra" w:hAnsi="BRH Malayalam Extra" w:cs="BRH Malayalam Extra"/>
+                <w:color w:val="000000"/>
+                <w:sz w:val="32"/>
+                <w:szCs w:val="40"/>
+              </w:rPr>
+              <w:t>(</w:t>
+            </w:r>
+            <w:r>
+              <w:rPr>
+                <w:rFonts w:cs="BRH Malayalam Extra"/>
+                <w:color w:val="000000"/>
+                <w:szCs w:val="40"/>
+              </w:rPr>
+              <w:t>15</w:t>
+            </w:r>
+            <w:r>
+              <w:rPr>
+                <w:rFonts w:ascii="BRH Malayalam Extra" w:hAnsi="BRH Malayalam Extra" w:cs="BRH Malayalam Extra"/>
+                <w:color w:val="000000"/>
+                <w:sz w:val="32"/>
+                <w:szCs w:val="40"/>
+              </w:rPr>
+              <w:t>)-  D</w:t>
+            </w:r>
+            <w:r>
+              <w:rPr>
+                <w:rFonts w:ascii="BRH Malayalam Extra" w:hAnsi="BRH Malayalam Extra" w:cs="BRH Malayalam Extra"/>
+                <w:color w:val="000000"/>
+                <w:sz w:val="26"/>
+                <w:szCs w:val="40"/>
+              </w:rPr>
+              <w:t>–</w:t>
+            </w:r>
+            <w:r>
+              <w:rPr>
+                <w:rFonts w:ascii="BRH Malayalam Extra" w:hAnsi="BRH Malayalam Extra" w:cs="BRH Malayalam Extra"/>
+                <w:color w:val="000000"/>
+                <w:sz w:val="32"/>
+                <w:szCs w:val="40"/>
+              </w:rPr>
+              <w:t>b§dJ | b</w:t>
+            </w:r>
+            <w:r>
+              <w:rPr>
+                <w:rFonts w:ascii="BRH Malayalam Extra" w:hAnsi="BRH Malayalam Extra" w:cs="BRH Malayalam Extra"/>
+                <w:color w:val="000000"/>
+                <w:sz w:val="26"/>
+                <w:szCs w:val="40"/>
+              </w:rPr>
+              <w:t>–</w:t>
+            </w:r>
+            <w:r>
+              <w:rPr>
+                <w:rFonts w:ascii="BRH Malayalam Extra" w:hAnsi="BRH Malayalam Extra" w:cs="BRH Malayalam Extra"/>
+                <w:color w:val="000000"/>
+                <w:sz w:val="32"/>
+                <w:szCs w:val="40"/>
+                <w:highlight w:val="yellow"/>
+              </w:rPr>
+              <w:t>À</w:t>
+            </w:r>
+            <w:r>
+              <w:rPr>
+                <w:rFonts w:ascii="BRH Malayalam Extra" w:hAnsi="BRH Malayalam Extra" w:cs="BRH Malayalam Extra"/>
+                <w:color w:val="000000"/>
+                <w:sz w:val="32"/>
+                <w:szCs w:val="40"/>
+              </w:rPr>
+              <w:t xml:space="preserve"> |</w:t>
+            </w:r>
+          </w:p>
+          <w:p>
+            <w:pPr>
+              <w:widowControl w:val="0"/>
+              <w:autoSpaceDE w:val="0"/>
+              <w:autoSpaceDN w:val="0"/>
+              <w:adjustRightInd w:val="0"/>
+              <w:spacing w:line="240" w:lineRule="auto"/>
+              <w:rPr>
+                <w:rFonts w:ascii="BRH Malayalam Extra" w:hAnsi="BRH Malayalam Extra" w:cs="BRH Malayalam Extra"/>
+                <w:color w:val="000000"/>
+                <w:sz w:val="32"/>
+                <w:szCs w:val="40"/>
+              </w:rPr>
+            </w:pPr>
+            <w:r>
+              <w:rPr>
+                <w:rFonts w:ascii="BRH Malayalam Extra" w:hAnsi="BRH Malayalam Extra" w:cs="BRH Malayalam Extra"/>
+                <w:color w:val="000000"/>
+                <w:sz w:val="32"/>
+                <w:szCs w:val="40"/>
+              </w:rPr>
+              <w:t>D</w:t>
+            </w:r>
+            <w:r>
+              <w:rPr>
+                <w:rFonts w:ascii="BRH Malayalam Extra" w:hAnsi="BRH Malayalam Extra" w:cs="BRH Malayalam Extra"/>
+                <w:color w:val="000000"/>
+                <w:sz w:val="26"/>
+                <w:szCs w:val="40"/>
+              </w:rPr>
+              <w:t>–</w:t>
+            </w:r>
+            <w:r>
+              <w:rPr>
+                <w:rFonts w:ascii="BRH Malayalam Extra" w:hAnsi="BRH Malayalam Extra" w:cs="BRH Malayalam Extra"/>
+                <w:color w:val="000000"/>
+                <w:sz w:val="32"/>
+                <w:szCs w:val="40"/>
+              </w:rPr>
+              <w:t xml:space="preserve">b§¥dx </w:t>
+            </w:r>
+            <w:r>
+              <w:rPr>
+                <w:rFonts w:ascii="BRH Malayalam Extra" w:hAnsi="BRH Malayalam Extra" w:cs="BRH Malayalam Extra"/>
+                <w:color w:val="000000"/>
+                <w:sz w:val="32"/>
+                <w:szCs w:val="40"/>
+                <w:highlight w:val="yellow"/>
+              </w:rPr>
+              <w:t>b</w:t>
+            </w:r>
+            <w:r>
+              <w:rPr>
+                <w:rFonts w:ascii="BRH Malayalam Extra" w:hAnsi="BRH Malayalam Extra" w:cs="BRH Malayalam Extra"/>
+                <w:color w:val="000000"/>
+                <w:sz w:val="26"/>
+                <w:szCs w:val="40"/>
+              </w:rPr>
+              <w:t>–</w:t>
+            </w:r>
+            <w:r>
+              <w:rPr>
+                <w:rFonts w:ascii="BRH Malayalam Extra" w:hAnsi="BRH Malayalam Extra" w:cs="BRH Malayalam Extra"/>
+                <w:color w:val="000000"/>
+                <w:sz w:val="32"/>
+                <w:szCs w:val="40"/>
+              </w:rPr>
+              <w:t xml:space="preserve">À </w:t>
+            </w:r>
+            <w:r>
+              <w:rPr>
+                <w:rFonts w:ascii="BRH Malayalam Extra" w:hAnsi="BRH Malayalam Extra" w:cs="BRH Malayalam Extra"/>
+                <w:color w:val="000000"/>
+                <w:sz w:val="32"/>
+                <w:szCs w:val="40"/>
+                <w:highlight w:val="yellow"/>
+              </w:rPr>
+              <w:t>b</w:t>
+            </w:r>
+            <w:r>
+              <w:rPr>
+                <w:rFonts w:ascii="BRH Malayalam Extra" w:hAnsi="BRH Malayalam Extra" w:cs="BRH Malayalam Extra"/>
+                <w:color w:val="000000"/>
+                <w:sz w:val="26"/>
+                <w:szCs w:val="40"/>
+              </w:rPr>
+              <w:t>–</w:t>
+            </w:r>
+            <w:r>
+              <w:rPr>
+                <w:rFonts w:ascii="BRH Malayalam Extra" w:hAnsi="BRH Malayalam Extra" w:cs="BRH Malayalam Extra"/>
+                <w:color w:val="000000"/>
+                <w:sz w:val="32"/>
+                <w:szCs w:val="40"/>
+              </w:rPr>
+              <w:t>¥</w:t>
+            </w:r>
+            <w:r>
+              <w:rPr>
+                <w:rFonts w:ascii="BRH Malayalam Extra" w:hAnsi="BRH Malayalam Extra" w:cs="BRH Malayalam Extra"/>
+                <w:color w:val="000000"/>
+                <w:sz w:val="32"/>
+                <w:szCs w:val="40"/>
+                <w:highlight w:val="yellow"/>
+              </w:rPr>
+              <w:t>À</w:t>
+            </w:r>
+            <w:r>
+              <w:rPr>
+                <w:rFonts w:ascii="BRH Malayalam Extra" w:hAnsi="BRH Malayalam Extra" w:cs="BRH Malayalam Extra"/>
+                <w:color w:val="000000"/>
+                <w:sz w:val="32"/>
+                <w:szCs w:val="40"/>
+              </w:rPr>
+              <w:t>xb§d D</w:t>
+            </w:r>
+            <w:r>
+              <w:rPr>
+                <w:rFonts w:ascii="BRH Malayalam Extra" w:hAnsi="BRH Malayalam Extra" w:cs="BRH Malayalam Extra"/>
+                <w:color w:val="000000"/>
+                <w:sz w:val="26"/>
+                <w:szCs w:val="40"/>
+              </w:rPr>
+              <w:t>–</w:t>
+            </w:r>
+            <w:r>
+              <w:rPr>
+                <w:rFonts w:ascii="BRH Malayalam Extra" w:hAnsi="BRH Malayalam Extra" w:cs="BRH Malayalam Extra"/>
+                <w:color w:val="000000"/>
+                <w:sz w:val="32"/>
+                <w:szCs w:val="40"/>
+              </w:rPr>
+              <w:t xml:space="preserve">b§¥dx </w:t>
+            </w:r>
+            <w:r>
+              <w:rPr>
+                <w:rFonts w:ascii="BRH Malayalam Extra" w:hAnsi="BRH Malayalam Extra" w:cs="BRH Malayalam Extra"/>
+                <w:color w:val="000000"/>
+                <w:sz w:val="32"/>
+                <w:szCs w:val="40"/>
+                <w:highlight w:val="yellow"/>
+              </w:rPr>
+              <w:t>b</w:t>
+            </w:r>
+            <w:r>
+              <w:rPr>
+                <w:rFonts w:ascii="BRH Malayalam Extra" w:hAnsi="BRH Malayalam Extra" w:cs="BRH Malayalam Extra"/>
+                <w:color w:val="000000"/>
+                <w:sz w:val="26"/>
+                <w:szCs w:val="40"/>
+              </w:rPr>
+              <w:t>–</w:t>
+            </w:r>
+            <w:r>
+              <w:rPr>
+                <w:rFonts w:ascii="BRH Malayalam Extra" w:hAnsi="BRH Malayalam Extra" w:cs="BRH Malayalam Extra"/>
+                <w:color w:val="000000"/>
+                <w:sz w:val="32"/>
+                <w:szCs w:val="40"/>
+              </w:rPr>
+              <w:t xml:space="preserve">À | </w:t>
+            </w:r>
+          </w:p>
+          <w:p>
+            <w:pPr>
+              <w:widowControl w:val="0"/>
+              <w:autoSpaceDE w:val="0"/>
+              <w:autoSpaceDN w:val="0"/>
+              <w:adjustRightInd w:val="0"/>
+              <w:spacing w:line="240" w:lineRule="auto"/>
+              <w:rPr>
+                <w:rFonts w:ascii="BRH Malayalam Extra" w:hAnsi="BRH Malayalam Extra" w:cs="BRH Malayalam Extra"/>
+                <w:color w:val="000000"/>
+                <w:sz w:val="32"/>
+                <w:szCs w:val="40"/>
+              </w:rPr>
+            </w:pPr>
+            <w:r>
+              <w:rPr>
+                <w:rFonts w:cs="BRH Malayalam Extra"/>
+                <w:color w:val="000000"/>
+                <w:szCs w:val="40"/>
+              </w:rPr>
+              <w:t>18</w:t>
+            </w:r>
+            <w:r>
+              <w:rPr>
+                <w:rFonts w:ascii="BRH Malayalam Extra" w:hAnsi="BRH Malayalam Extra" w:cs="BRH Malayalam Extra"/>
+                <w:color w:val="000000"/>
+                <w:sz w:val="32"/>
+                <w:szCs w:val="40"/>
+              </w:rPr>
+              <w:t>)</w:t>
+            </w:r>
+            <w:r>
+              <w:rPr>
+                <w:rFonts w:ascii="BRH Malayalam Extra" w:hAnsi="BRH Malayalam Extra" w:cs="BRH Malayalam Extra"/>
+                <w:color w:val="000000"/>
+                <w:sz w:val="32"/>
+                <w:szCs w:val="40"/>
+              </w:rPr>
+              <w:tab/>
+            </w:r>
+            <w:r>
+              <w:rPr>
+                <w:rFonts w:cs="BRH Malayalam Extra"/>
+                <w:color w:val="000000"/>
+                <w:szCs w:val="40"/>
+              </w:rPr>
+              <w:t>2</w:t>
+            </w:r>
+            <w:r>
+              <w:rPr>
+                <w:rFonts w:ascii="BRH Malayalam Extra" w:hAnsi="BRH Malayalam Extra" w:cs="BRH Malayalam Extra"/>
+                <w:color w:val="000000"/>
+                <w:sz w:val="32"/>
+                <w:szCs w:val="40"/>
+              </w:rPr>
+              <w:t>.</w:t>
+            </w:r>
+            <w:r>
+              <w:rPr>
+                <w:rFonts w:cs="BRH Malayalam Extra"/>
+                <w:color w:val="000000"/>
+                <w:szCs w:val="40"/>
+              </w:rPr>
+              <w:t>4</w:t>
+            </w:r>
+            <w:r>
+              <w:rPr>
+                <w:rFonts w:ascii="BRH Malayalam Extra" w:hAnsi="BRH Malayalam Extra" w:cs="BRH Malayalam Extra"/>
+                <w:color w:val="000000"/>
+                <w:sz w:val="32"/>
+                <w:szCs w:val="40"/>
+              </w:rPr>
+              <w:t>.</w:t>
+            </w:r>
+            <w:r>
+              <w:rPr>
+                <w:rFonts w:cs="BRH Malayalam Extra"/>
+                <w:color w:val="000000"/>
+                <w:szCs w:val="40"/>
+              </w:rPr>
+              <w:t>8</w:t>
+            </w:r>
+            <w:r>
+              <w:rPr>
+                <w:rFonts w:ascii="BRH Malayalam Extra" w:hAnsi="BRH Malayalam Extra" w:cs="BRH Malayalam Extra"/>
+                <w:color w:val="000000"/>
+                <w:sz w:val="32"/>
+                <w:szCs w:val="40"/>
+              </w:rPr>
+              <w:t>.</w:t>
+            </w:r>
+            <w:r>
+              <w:rPr>
+                <w:rFonts w:cs="BRH Malayalam Extra"/>
+                <w:color w:val="000000"/>
+                <w:szCs w:val="40"/>
+              </w:rPr>
+              <w:t>1</w:t>
+            </w:r>
+            <w:r>
+              <w:rPr>
+                <w:rFonts w:ascii="BRH Malayalam Extra" w:hAnsi="BRH Malayalam Extra" w:cs="BRH Malayalam Extra"/>
+                <w:color w:val="000000"/>
+                <w:sz w:val="32"/>
+                <w:szCs w:val="40"/>
+              </w:rPr>
+              <w:t>(</w:t>
+            </w:r>
+            <w:r>
+              <w:rPr>
+                <w:rFonts w:cs="BRH Malayalam Extra"/>
+                <w:color w:val="000000"/>
+                <w:szCs w:val="40"/>
+              </w:rPr>
+              <w:t>16</w:t>
+            </w:r>
+            <w:r>
+              <w:rPr>
+                <w:rFonts w:ascii="BRH Malayalam Extra" w:hAnsi="BRH Malayalam Extra" w:cs="BRH Malayalam Extra"/>
+                <w:color w:val="000000"/>
+                <w:sz w:val="32"/>
+                <w:szCs w:val="40"/>
+              </w:rPr>
+              <w:t>)-  b</w:t>
+            </w:r>
+            <w:r>
+              <w:rPr>
+                <w:rFonts w:ascii="BRH Malayalam Extra" w:hAnsi="BRH Malayalam Extra" w:cs="BRH Malayalam Extra"/>
+                <w:color w:val="000000"/>
+                <w:sz w:val="26"/>
+                <w:szCs w:val="40"/>
+              </w:rPr>
+              <w:t>–</w:t>
+            </w:r>
+            <w:r>
+              <w:rPr>
+                <w:rFonts w:ascii="BRH Malayalam Extra" w:hAnsi="BRH Malayalam Extra" w:cs="BRH Malayalam Extra"/>
+                <w:color w:val="000000"/>
+                <w:sz w:val="32"/>
+                <w:szCs w:val="40"/>
+                <w:highlight w:val="yellow"/>
+              </w:rPr>
+              <w:t>À</w:t>
+            </w:r>
+            <w:r>
+              <w:rPr>
+                <w:rFonts w:ascii="BRH Malayalam Extra" w:hAnsi="BRH Malayalam Extra" w:cs="BRH Malayalam Extra"/>
+                <w:color w:val="000000"/>
+                <w:sz w:val="32"/>
+                <w:szCs w:val="40"/>
+              </w:rPr>
+              <w:t xml:space="preserve"> | D</w:t>
+            </w:r>
+            <w:r>
+              <w:rPr>
+                <w:rFonts w:ascii="BRH Malayalam Extra" w:hAnsi="BRH Malayalam Extra" w:cs="BRH Malayalam Extra"/>
+                <w:color w:val="000000"/>
+                <w:sz w:val="26"/>
+                <w:szCs w:val="40"/>
+              </w:rPr>
+              <w:t>–</w:t>
+            </w:r>
+            <w:r>
+              <w:rPr>
+                <w:rFonts w:ascii="BRH Malayalam Extra" w:hAnsi="BRH Malayalam Extra" w:cs="BRH Malayalam Extra"/>
+                <w:color w:val="000000"/>
+                <w:sz w:val="32"/>
+                <w:szCs w:val="40"/>
+              </w:rPr>
+              <w:t>b</w:t>
+            </w:r>
+            <w:r>
+              <w:rPr>
+                <w:rFonts w:ascii="BRH Malayalam Extra" w:hAnsi="BRH Malayalam Extra" w:cs="BRH Malayalam Extra"/>
+                <w:color w:val="000000"/>
+                <w:sz w:val="26"/>
+                <w:szCs w:val="40"/>
+              </w:rPr>
+              <w:t>–</w:t>
+            </w:r>
+            <w:r>
+              <w:rPr>
+                <w:rFonts w:ascii="BRH Malayalam Extra" w:hAnsi="BRH Malayalam Extra" w:cs="BRH Malayalam Extra"/>
+                <w:color w:val="000000"/>
+                <w:sz w:val="32"/>
+                <w:szCs w:val="40"/>
+              </w:rPr>
+              <w:t>cyI |</w:t>
+            </w:r>
+          </w:p>
+          <w:p>
+            <w:pPr>
+              <w:widowControl w:val="0"/>
+              <w:autoSpaceDE w:val="0"/>
+              <w:autoSpaceDN w:val="0"/>
+              <w:adjustRightInd w:val="0"/>
+              <w:spacing w:line="240" w:lineRule="auto"/>
+              <w:rPr>
+                <w:rFonts w:ascii="BRH Malayalam Extra" w:hAnsi="BRH Malayalam Extra" w:cs="BRH Malayalam Extra"/>
+                <w:color w:val="000000"/>
+                <w:sz w:val="32"/>
+                <w:szCs w:val="40"/>
+              </w:rPr>
+            </w:pPr>
+            <w:r>
+              <w:rPr>
+                <w:rFonts w:ascii="BRH Malayalam Extra" w:hAnsi="BRH Malayalam Extra" w:cs="BRH Malayalam Extra"/>
+                <w:color w:val="000000"/>
+                <w:sz w:val="32"/>
+                <w:szCs w:val="40"/>
+              </w:rPr>
+              <w:t>b</w:t>
+            </w:r>
+            <w:r>
+              <w:rPr>
+                <w:rFonts w:ascii="BRH Malayalam Extra" w:hAnsi="BRH Malayalam Extra" w:cs="BRH Malayalam Extra"/>
+                <w:color w:val="000000"/>
+                <w:sz w:val="26"/>
+                <w:szCs w:val="40"/>
+              </w:rPr>
+              <w:t>–</w:t>
+            </w:r>
+            <w:r>
+              <w:rPr>
+                <w:rFonts w:ascii="BRH Malayalam Extra" w:hAnsi="BRH Malayalam Extra" w:cs="BRH Malayalam Extra"/>
+                <w:color w:val="000000"/>
+                <w:sz w:val="32"/>
+                <w:szCs w:val="40"/>
+              </w:rPr>
+              <w:t>¥</w:t>
+            </w:r>
+            <w:r>
+              <w:rPr>
+                <w:rFonts w:ascii="BRH Malayalam Extra" w:hAnsi="BRH Malayalam Extra" w:cs="BRH Malayalam Extra"/>
+                <w:color w:val="000000"/>
+                <w:sz w:val="32"/>
+                <w:szCs w:val="40"/>
+                <w:highlight w:val="yellow"/>
+              </w:rPr>
+              <w:t>À</w:t>
+            </w:r>
+            <w:r>
+              <w:rPr>
+                <w:rFonts w:ascii="BRH Malayalam Extra" w:hAnsi="BRH Malayalam Extra" w:cs="BRH Malayalam Extra"/>
+                <w:color w:val="000000"/>
+                <w:sz w:val="32"/>
+                <w:szCs w:val="40"/>
+              </w:rPr>
+              <w:t>xb</w:t>
+            </w:r>
+            <w:r>
+              <w:rPr>
+                <w:rFonts w:ascii="BRH Malayalam Extra" w:hAnsi="BRH Malayalam Extra" w:cs="BRH Malayalam Extra"/>
+                <w:color w:val="000000"/>
+                <w:sz w:val="26"/>
+                <w:szCs w:val="40"/>
+              </w:rPr>
+              <w:t>–</w:t>
+            </w:r>
+            <w:r>
+              <w:rPr>
+                <w:rFonts w:ascii="BRH Malayalam Extra" w:hAnsi="BRH Malayalam Extra" w:cs="BRH Malayalam Extra"/>
+                <w:color w:val="000000"/>
+                <w:sz w:val="32"/>
+                <w:szCs w:val="40"/>
+              </w:rPr>
+              <w:t>cy i¡—b</w:t>
+            </w:r>
+            <w:r>
+              <w:rPr>
+                <w:rFonts w:ascii="BRH Malayalam Extra" w:hAnsi="BRH Malayalam Extra" w:cs="BRH Malayalam Extra"/>
+                <w:color w:val="000000"/>
+                <w:sz w:val="26"/>
+                <w:szCs w:val="40"/>
+              </w:rPr>
+              <w:t>–</w:t>
+            </w:r>
+            <w:r>
+              <w:rPr>
+                <w:rFonts w:ascii="BRH Malayalam Extra" w:hAnsi="BRH Malayalam Extra" w:cs="BRH Malayalam Extra"/>
+                <w:color w:val="000000"/>
+                <w:sz w:val="32"/>
+                <w:szCs w:val="40"/>
+              </w:rPr>
+              <w:t xml:space="preserve">cyI </w:t>
+            </w:r>
+            <w:r>
+              <w:rPr>
+                <w:rFonts w:ascii="BRH Malayalam Extra" w:hAnsi="BRH Malayalam Extra" w:cs="BRH Malayalam Extra"/>
+                <w:color w:val="000000"/>
+                <w:sz w:val="32"/>
+                <w:szCs w:val="40"/>
+                <w:highlight w:val="yellow"/>
+              </w:rPr>
+              <w:t>b</w:t>
+            </w:r>
+            <w:r>
+              <w:rPr>
+                <w:rFonts w:ascii="BRH Malayalam Extra" w:hAnsi="BRH Malayalam Extra" w:cs="BRH Malayalam Extra"/>
+                <w:color w:val="000000"/>
+                <w:sz w:val="26"/>
+                <w:szCs w:val="40"/>
+              </w:rPr>
+              <w:t>–</w:t>
+            </w:r>
+            <w:r>
+              <w:rPr>
+                <w:rFonts w:ascii="BRH Malayalam Extra" w:hAnsi="BRH Malayalam Extra" w:cs="BRH Malayalam Extra"/>
+                <w:color w:val="000000"/>
+                <w:sz w:val="32"/>
+                <w:szCs w:val="40"/>
+              </w:rPr>
+              <w:t xml:space="preserve">À </w:t>
+            </w:r>
+            <w:r>
+              <w:rPr>
+                <w:rFonts w:ascii="BRH Malayalam Extra" w:hAnsi="BRH Malayalam Extra" w:cs="BRH Malayalam Extra"/>
+                <w:color w:val="000000"/>
+                <w:sz w:val="32"/>
+                <w:szCs w:val="40"/>
+                <w:highlight w:val="yellow"/>
+              </w:rPr>
+              <w:t>b</w:t>
+            </w:r>
+            <w:r>
+              <w:rPr>
+                <w:rFonts w:ascii="BRH Malayalam Extra" w:hAnsi="BRH Malayalam Extra" w:cs="BRH Malayalam Extra"/>
+                <w:color w:val="000000"/>
+                <w:sz w:val="26"/>
+                <w:szCs w:val="40"/>
+              </w:rPr>
+              <w:t>–</w:t>
+            </w:r>
+            <w:r>
+              <w:rPr>
+                <w:rFonts w:ascii="BRH Malayalam Extra" w:hAnsi="BRH Malayalam Extra" w:cs="BRH Malayalam Extra"/>
+                <w:color w:val="000000"/>
+                <w:sz w:val="32"/>
+                <w:szCs w:val="40"/>
+              </w:rPr>
+              <w:t>¥Àxb</w:t>
+            </w:r>
+            <w:r>
+              <w:rPr>
+                <w:rFonts w:ascii="BRH Malayalam Extra" w:hAnsi="BRH Malayalam Extra" w:cs="BRH Malayalam Extra"/>
+                <w:color w:val="000000"/>
+                <w:sz w:val="26"/>
+                <w:szCs w:val="40"/>
+              </w:rPr>
+              <w:t>–</w:t>
+            </w:r>
+            <w:r>
+              <w:rPr>
+                <w:rFonts w:ascii="BRH Malayalam Extra" w:hAnsi="BRH Malayalam Extra" w:cs="BRH Malayalam Extra"/>
+                <w:color w:val="000000"/>
+                <w:sz w:val="32"/>
+                <w:szCs w:val="40"/>
+              </w:rPr>
+              <w:t xml:space="preserve">cyI | </w:t>
+            </w:r>
+          </w:p>
+          <w:p>
+            <w:pPr>
+              <w:widowControl w:val="0"/>
+              <w:autoSpaceDE w:val="0"/>
+              <w:autoSpaceDN w:val="0"/>
+              <w:adjustRightInd w:val="0"/>
+              <w:spacing w:before="0" w:line="240" w:lineRule="auto"/>
+              <w:rPr>
+                <w:rFonts w:cs="BRH Malayalam Extra"/>
+                <w:color w:val="000000"/>
+                <w:szCs w:val="40"/>
+              </w:rPr>
+            </w:pPr>
+          </w:p>
+        </w:tc>
+        <w:tc>
+          <w:tcPr>
+            <w:tcW w:w="7513" w:type="dxa"/>
+            <w:gridSpan w:val="2"/>
+          </w:tcPr>
+          <w:p>
+            <w:pPr>
+              <w:widowControl w:val="0"/>
+              <w:autoSpaceDE w:val="0"/>
+              <w:autoSpaceDN w:val="0"/>
+              <w:adjustRightInd w:val="0"/>
+              <w:spacing w:line="240" w:lineRule="auto"/>
+              <w:rPr>
+                <w:rFonts w:ascii="BRH Malayalam Extra" w:hAnsi="BRH Malayalam Extra" w:cs="BRH Malayalam Extra"/>
+                <w:color w:val="000000"/>
+                <w:sz w:val="32"/>
+                <w:szCs w:val="40"/>
+              </w:rPr>
+            </w:pPr>
+            <w:r>
+              <w:rPr>
+                <w:rFonts w:cs="BRH Malayalam Extra"/>
+                <w:color w:val="000000"/>
+                <w:szCs w:val="40"/>
+              </w:rPr>
+              <w:t>17</w:t>
+            </w:r>
+            <w:r>
+              <w:rPr>
+                <w:rFonts w:ascii="BRH Malayalam Extra" w:hAnsi="BRH Malayalam Extra" w:cs="BRH Malayalam Extra"/>
+                <w:color w:val="000000"/>
+                <w:sz w:val="32"/>
+                <w:szCs w:val="40"/>
+              </w:rPr>
+              <w:t>)</w:t>
+            </w:r>
+            <w:r>
+              <w:rPr>
+                <w:rFonts w:ascii="BRH Malayalam Extra" w:hAnsi="BRH Malayalam Extra" w:cs="BRH Malayalam Extra"/>
+                <w:color w:val="000000"/>
+                <w:sz w:val="32"/>
+                <w:szCs w:val="40"/>
+              </w:rPr>
+              <w:tab/>
+            </w:r>
+            <w:r>
+              <w:rPr>
+                <w:rFonts w:cs="BRH Malayalam Extra"/>
+                <w:color w:val="000000"/>
+                <w:szCs w:val="40"/>
+              </w:rPr>
+              <w:t>2</w:t>
+            </w:r>
+            <w:r>
+              <w:rPr>
+                <w:rFonts w:ascii="BRH Malayalam Extra" w:hAnsi="BRH Malayalam Extra" w:cs="BRH Malayalam Extra"/>
+                <w:color w:val="000000"/>
+                <w:sz w:val="32"/>
+                <w:szCs w:val="40"/>
+              </w:rPr>
+              <w:t>.</w:t>
+            </w:r>
+            <w:r>
+              <w:rPr>
+                <w:rFonts w:cs="BRH Malayalam Extra"/>
+                <w:color w:val="000000"/>
+                <w:szCs w:val="40"/>
+              </w:rPr>
+              <w:t>4</w:t>
+            </w:r>
+            <w:r>
+              <w:rPr>
+                <w:rFonts w:ascii="BRH Malayalam Extra" w:hAnsi="BRH Malayalam Extra" w:cs="BRH Malayalam Extra"/>
+                <w:color w:val="000000"/>
+                <w:sz w:val="32"/>
+                <w:szCs w:val="40"/>
+              </w:rPr>
+              <w:t>.</w:t>
+            </w:r>
+            <w:r>
+              <w:rPr>
+                <w:rFonts w:cs="BRH Malayalam Extra"/>
+                <w:color w:val="000000"/>
+                <w:szCs w:val="40"/>
+              </w:rPr>
+              <w:t>8</w:t>
+            </w:r>
+            <w:r>
+              <w:rPr>
+                <w:rFonts w:ascii="BRH Malayalam Extra" w:hAnsi="BRH Malayalam Extra" w:cs="BRH Malayalam Extra"/>
+                <w:color w:val="000000"/>
+                <w:sz w:val="32"/>
+                <w:szCs w:val="40"/>
+              </w:rPr>
+              <w:t>.</w:t>
+            </w:r>
+            <w:r>
+              <w:rPr>
+                <w:rFonts w:cs="BRH Malayalam Extra"/>
+                <w:color w:val="000000"/>
+                <w:szCs w:val="40"/>
+              </w:rPr>
+              <w:t>1</w:t>
+            </w:r>
+            <w:r>
+              <w:rPr>
+                <w:rFonts w:ascii="BRH Malayalam Extra" w:hAnsi="BRH Malayalam Extra" w:cs="BRH Malayalam Extra"/>
+                <w:color w:val="000000"/>
+                <w:sz w:val="32"/>
+                <w:szCs w:val="40"/>
+              </w:rPr>
+              <w:t>(</w:t>
+            </w:r>
+            <w:r>
+              <w:rPr>
+                <w:rFonts w:cs="BRH Malayalam Extra"/>
+                <w:color w:val="000000"/>
+                <w:szCs w:val="40"/>
+              </w:rPr>
+              <w:t>15</w:t>
+            </w:r>
+            <w:r>
+              <w:rPr>
+                <w:rFonts w:ascii="BRH Malayalam Extra" w:hAnsi="BRH Malayalam Extra" w:cs="BRH Malayalam Extra"/>
+                <w:color w:val="000000"/>
+                <w:sz w:val="32"/>
+                <w:szCs w:val="40"/>
+              </w:rPr>
+              <w:t>)-  D</w:t>
+            </w:r>
+            <w:r>
+              <w:rPr>
+                <w:rFonts w:ascii="BRH Malayalam Extra" w:hAnsi="BRH Malayalam Extra" w:cs="BRH Malayalam Extra"/>
+                <w:color w:val="000000"/>
+                <w:sz w:val="26"/>
+                <w:szCs w:val="40"/>
+              </w:rPr>
+              <w:t>–</w:t>
+            </w:r>
+            <w:r>
+              <w:rPr>
+                <w:rFonts w:ascii="BRH Malayalam Extra" w:hAnsi="BRH Malayalam Extra" w:cs="BRH Malayalam Extra"/>
+                <w:color w:val="000000"/>
+                <w:sz w:val="32"/>
+                <w:szCs w:val="40"/>
+              </w:rPr>
+              <w:t>b§dJ | b</w:t>
+            </w:r>
+            <w:r>
+              <w:rPr>
+                <w:rFonts w:ascii="BRH Malayalam Extra" w:hAnsi="BRH Malayalam Extra" w:cs="BRH Malayalam Extra"/>
+                <w:color w:val="000000"/>
+                <w:sz w:val="26"/>
+                <w:szCs w:val="40"/>
+              </w:rPr>
+              <w:t>–</w:t>
+            </w:r>
+            <w:r>
+              <w:rPr>
+                <w:rFonts w:ascii="BRH Malayalam Extra" w:hAnsi="BRH Malayalam Extra" w:cs="BRH Malayalam Extra"/>
+                <w:color w:val="000000"/>
+                <w:sz w:val="32"/>
+                <w:szCs w:val="40"/>
+                <w:highlight w:val="green"/>
+              </w:rPr>
+              <w:t>À</w:t>
+            </w:r>
+            <w:r>
+              <w:rPr>
+                <w:rFonts w:ascii="BRH Malayalam Extra" w:hAnsi="BRH Malayalam Extra" w:cs="BRH Malayalam Extra"/>
+                <w:color w:val="000000"/>
+                <w:sz w:val="26"/>
+                <w:szCs w:val="40"/>
+              </w:rPr>
+              <w:t>–</w:t>
+            </w:r>
+            <w:r>
+              <w:rPr>
+                <w:rFonts w:ascii="BRH Malayalam Extra" w:hAnsi="BRH Malayalam Extra" w:cs="BRH Malayalam Extra"/>
+                <w:color w:val="000000"/>
+                <w:sz w:val="32"/>
+                <w:szCs w:val="40"/>
+              </w:rPr>
+              <w:t xml:space="preserve"> |</w:t>
+            </w:r>
+          </w:p>
+          <w:p>
+            <w:pPr>
+              <w:widowControl w:val="0"/>
+              <w:autoSpaceDE w:val="0"/>
+              <w:autoSpaceDN w:val="0"/>
+              <w:adjustRightInd w:val="0"/>
+              <w:spacing w:line="240" w:lineRule="auto"/>
+              <w:rPr>
+                <w:rFonts w:ascii="BRH Malayalam Extra" w:hAnsi="BRH Malayalam Extra" w:cs="BRH Malayalam Extra"/>
+                <w:color w:val="000000"/>
+                <w:sz w:val="32"/>
+                <w:szCs w:val="40"/>
+              </w:rPr>
+            </w:pPr>
+            <w:r>
+              <w:rPr>
+                <w:rFonts w:ascii="BRH Malayalam Extra" w:hAnsi="BRH Malayalam Extra" w:cs="BRH Malayalam Extra"/>
+                <w:color w:val="000000"/>
+                <w:sz w:val="32"/>
+                <w:szCs w:val="40"/>
+              </w:rPr>
+              <w:t>D</w:t>
+            </w:r>
+            <w:r>
+              <w:rPr>
+                <w:rFonts w:ascii="BRH Malayalam Extra" w:hAnsi="BRH Malayalam Extra" w:cs="BRH Malayalam Extra"/>
+                <w:color w:val="000000"/>
+                <w:sz w:val="26"/>
+                <w:szCs w:val="40"/>
+              </w:rPr>
+              <w:t>–</w:t>
+            </w:r>
+            <w:r>
+              <w:rPr>
+                <w:rFonts w:ascii="BRH Malayalam Extra" w:hAnsi="BRH Malayalam Extra" w:cs="BRH Malayalam Extra"/>
+                <w:color w:val="000000"/>
+                <w:sz w:val="32"/>
+                <w:szCs w:val="40"/>
+              </w:rPr>
+              <w:t xml:space="preserve">b§¥dx </w:t>
+            </w:r>
+            <w:r>
+              <w:rPr>
+                <w:rFonts w:ascii="BRH Malayalam Extra" w:hAnsi="BRH Malayalam Extra" w:cs="BRH Malayalam Extra"/>
+                <w:color w:val="000000"/>
+                <w:sz w:val="32"/>
+                <w:szCs w:val="40"/>
+                <w:highlight w:val="green"/>
+              </w:rPr>
+              <w:t>b—</w:t>
+            </w:r>
+            <w:r>
+              <w:rPr>
+                <w:rFonts w:ascii="BRH Malayalam Extra" w:hAnsi="BRH Malayalam Extra" w:cs="BRH Malayalam Extra"/>
+                <w:color w:val="000000"/>
+                <w:sz w:val="32"/>
+                <w:szCs w:val="40"/>
+              </w:rPr>
+              <w:t xml:space="preserve">À </w:t>
+            </w:r>
+            <w:r>
+              <w:rPr>
+                <w:rFonts w:ascii="BRH Malayalam Extra" w:hAnsi="BRH Malayalam Extra" w:cs="BRH Malayalam Extra"/>
+                <w:color w:val="000000"/>
+                <w:sz w:val="32"/>
+                <w:szCs w:val="40"/>
+                <w:highlight w:val="green"/>
+              </w:rPr>
+              <w:t>b¥Àx</w:t>
+            </w:r>
+            <w:r>
+              <w:rPr>
+                <w:rFonts w:ascii="BRH Malayalam Extra" w:hAnsi="BRH Malayalam Extra" w:cs="BRH Malayalam Extra"/>
+                <w:color w:val="000000"/>
+                <w:sz w:val="26"/>
+                <w:szCs w:val="40"/>
+              </w:rPr>
+              <w:t>–</w:t>
+            </w:r>
+            <w:r>
+              <w:rPr>
+                <w:rFonts w:ascii="BRH Malayalam Extra" w:hAnsi="BRH Malayalam Extra" w:cs="BRH Malayalam Extra"/>
+                <w:color w:val="000000"/>
+                <w:sz w:val="32"/>
+                <w:szCs w:val="40"/>
+              </w:rPr>
+              <w:t>b§d D</w:t>
+            </w:r>
+            <w:r>
+              <w:rPr>
+                <w:rFonts w:ascii="BRH Malayalam Extra" w:hAnsi="BRH Malayalam Extra" w:cs="BRH Malayalam Extra"/>
+                <w:color w:val="000000"/>
+                <w:sz w:val="26"/>
+                <w:szCs w:val="40"/>
+              </w:rPr>
+              <w:t>–</w:t>
+            </w:r>
+            <w:r>
+              <w:rPr>
+                <w:rFonts w:ascii="BRH Malayalam Extra" w:hAnsi="BRH Malayalam Extra" w:cs="BRH Malayalam Extra"/>
+                <w:color w:val="000000"/>
+                <w:sz w:val="32"/>
+                <w:szCs w:val="40"/>
+              </w:rPr>
+              <w:t xml:space="preserve">b§¥dx </w:t>
+            </w:r>
+            <w:r>
+              <w:rPr>
+                <w:rFonts w:ascii="BRH Malayalam Extra" w:hAnsi="BRH Malayalam Extra" w:cs="BRH Malayalam Extra"/>
+                <w:color w:val="000000"/>
+                <w:sz w:val="32"/>
+                <w:szCs w:val="40"/>
+                <w:highlight w:val="green"/>
+              </w:rPr>
+              <w:t>b</w:t>
+            </w:r>
+            <w:r>
+              <w:rPr>
+                <w:rFonts w:ascii="BRH Malayalam Extra" w:hAnsi="BRH Malayalam Extra" w:cs="BRH Malayalam Extra"/>
+                <w:color w:val="000000"/>
+                <w:sz w:val="32"/>
+                <w:szCs w:val="40"/>
+              </w:rPr>
+              <w:t xml:space="preserve">—À | </w:t>
+            </w:r>
+          </w:p>
+          <w:p>
+            <w:pPr>
+              <w:widowControl w:val="0"/>
+              <w:autoSpaceDE w:val="0"/>
+              <w:autoSpaceDN w:val="0"/>
+              <w:adjustRightInd w:val="0"/>
+              <w:spacing w:line="240" w:lineRule="auto"/>
+              <w:rPr>
+                <w:rFonts w:ascii="BRH Malayalam Extra" w:hAnsi="BRH Malayalam Extra" w:cs="BRH Malayalam Extra"/>
+                <w:color w:val="000000"/>
+                <w:sz w:val="32"/>
+                <w:szCs w:val="40"/>
+              </w:rPr>
+            </w:pPr>
+            <w:r>
+              <w:rPr>
+                <w:rFonts w:cs="BRH Malayalam Extra"/>
+                <w:color w:val="000000"/>
+                <w:szCs w:val="40"/>
+              </w:rPr>
+              <w:t>18</w:t>
+            </w:r>
+            <w:r>
+              <w:rPr>
+                <w:rFonts w:ascii="BRH Malayalam Extra" w:hAnsi="BRH Malayalam Extra" w:cs="BRH Malayalam Extra"/>
+                <w:color w:val="000000"/>
+                <w:sz w:val="32"/>
+                <w:szCs w:val="40"/>
+              </w:rPr>
+              <w:t>)</w:t>
+            </w:r>
+            <w:r>
+              <w:rPr>
+                <w:rFonts w:ascii="BRH Malayalam Extra" w:hAnsi="BRH Malayalam Extra" w:cs="BRH Malayalam Extra"/>
+                <w:color w:val="000000"/>
+                <w:sz w:val="32"/>
+                <w:szCs w:val="40"/>
+              </w:rPr>
+              <w:tab/>
+            </w:r>
+            <w:r>
+              <w:rPr>
+                <w:rFonts w:cs="BRH Malayalam Extra"/>
+                <w:color w:val="000000"/>
+                <w:szCs w:val="40"/>
+              </w:rPr>
+              <w:t>2</w:t>
+            </w:r>
+            <w:r>
+              <w:rPr>
+                <w:rFonts w:ascii="BRH Malayalam Extra" w:hAnsi="BRH Malayalam Extra" w:cs="BRH Malayalam Extra"/>
+                <w:color w:val="000000"/>
+                <w:sz w:val="32"/>
+                <w:szCs w:val="40"/>
+              </w:rPr>
+              <w:t>.</w:t>
+            </w:r>
+            <w:r>
+              <w:rPr>
+                <w:rFonts w:cs="BRH Malayalam Extra"/>
+                <w:color w:val="000000"/>
+                <w:szCs w:val="40"/>
+              </w:rPr>
+              <w:t>4</w:t>
+            </w:r>
+            <w:r>
+              <w:rPr>
+                <w:rFonts w:ascii="BRH Malayalam Extra" w:hAnsi="BRH Malayalam Extra" w:cs="BRH Malayalam Extra"/>
+                <w:color w:val="000000"/>
+                <w:sz w:val="32"/>
+                <w:szCs w:val="40"/>
+              </w:rPr>
+              <w:t>.</w:t>
+            </w:r>
+            <w:r>
+              <w:rPr>
+                <w:rFonts w:cs="BRH Malayalam Extra"/>
+                <w:color w:val="000000"/>
+                <w:szCs w:val="40"/>
+              </w:rPr>
+              <w:t>8</w:t>
+            </w:r>
+            <w:r>
+              <w:rPr>
+                <w:rFonts w:ascii="BRH Malayalam Extra" w:hAnsi="BRH Malayalam Extra" w:cs="BRH Malayalam Extra"/>
+                <w:color w:val="000000"/>
+                <w:sz w:val="32"/>
+                <w:szCs w:val="40"/>
+              </w:rPr>
+              <w:t>.</w:t>
+            </w:r>
+            <w:r>
+              <w:rPr>
+                <w:rFonts w:cs="BRH Malayalam Extra"/>
+                <w:color w:val="000000"/>
+                <w:szCs w:val="40"/>
+              </w:rPr>
+              <w:t>1</w:t>
+            </w:r>
+            <w:r>
+              <w:rPr>
+                <w:rFonts w:ascii="BRH Malayalam Extra" w:hAnsi="BRH Malayalam Extra" w:cs="BRH Malayalam Extra"/>
+                <w:color w:val="000000"/>
+                <w:sz w:val="32"/>
+                <w:szCs w:val="40"/>
+              </w:rPr>
+              <w:t>(</w:t>
+            </w:r>
+            <w:r>
+              <w:rPr>
+                <w:rFonts w:cs="BRH Malayalam Extra"/>
+                <w:color w:val="000000"/>
+                <w:szCs w:val="40"/>
+              </w:rPr>
+              <w:t>16</w:t>
+            </w:r>
+            <w:r>
+              <w:rPr>
+                <w:rFonts w:ascii="BRH Malayalam Extra" w:hAnsi="BRH Malayalam Extra" w:cs="BRH Malayalam Extra"/>
+                <w:color w:val="000000"/>
+                <w:sz w:val="32"/>
+                <w:szCs w:val="40"/>
+              </w:rPr>
+              <w:t>)-  b</w:t>
+            </w:r>
+            <w:r>
+              <w:rPr>
+                <w:rFonts w:ascii="BRH Malayalam Extra" w:hAnsi="BRH Malayalam Extra" w:cs="BRH Malayalam Extra"/>
+                <w:color w:val="000000"/>
+                <w:sz w:val="26"/>
+                <w:szCs w:val="40"/>
+              </w:rPr>
+              <w:t>–</w:t>
+            </w:r>
+            <w:r>
+              <w:rPr>
+                <w:rFonts w:ascii="BRH Malayalam Extra" w:hAnsi="BRH Malayalam Extra" w:cs="BRH Malayalam Extra"/>
+                <w:color w:val="000000"/>
+                <w:sz w:val="32"/>
+                <w:szCs w:val="40"/>
+                <w:highlight w:val="green"/>
+              </w:rPr>
+              <w:t>À</w:t>
+            </w:r>
+            <w:r>
+              <w:rPr>
+                <w:rFonts w:ascii="BRH Malayalam Extra" w:hAnsi="BRH Malayalam Extra" w:cs="BRH Malayalam Extra"/>
+                <w:color w:val="000000"/>
+                <w:sz w:val="26"/>
+                <w:szCs w:val="40"/>
+                <w:highlight w:val="green"/>
+              </w:rPr>
+              <w:t>–</w:t>
+            </w:r>
+            <w:r>
+              <w:rPr>
+                <w:rFonts w:ascii="BRH Malayalam Extra" w:hAnsi="BRH Malayalam Extra" w:cs="BRH Malayalam Extra"/>
+                <w:color w:val="000000"/>
+                <w:sz w:val="32"/>
+                <w:szCs w:val="40"/>
+              </w:rPr>
+              <w:t xml:space="preserve"> | D</w:t>
+            </w:r>
+            <w:r>
+              <w:rPr>
+                <w:rFonts w:ascii="BRH Malayalam Extra" w:hAnsi="BRH Malayalam Extra" w:cs="BRH Malayalam Extra"/>
+                <w:color w:val="000000"/>
+                <w:sz w:val="26"/>
+                <w:szCs w:val="40"/>
+              </w:rPr>
+              <w:t>–</w:t>
+            </w:r>
+            <w:r>
+              <w:rPr>
+                <w:rFonts w:ascii="BRH Malayalam Extra" w:hAnsi="BRH Malayalam Extra" w:cs="BRH Malayalam Extra"/>
+                <w:color w:val="000000"/>
+                <w:sz w:val="32"/>
+                <w:szCs w:val="40"/>
+              </w:rPr>
+              <w:t>b</w:t>
+            </w:r>
+            <w:r>
+              <w:rPr>
+                <w:rFonts w:ascii="BRH Malayalam Extra" w:hAnsi="BRH Malayalam Extra" w:cs="BRH Malayalam Extra"/>
+                <w:color w:val="000000"/>
+                <w:sz w:val="26"/>
+                <w:szCs w:val="40"/>
+              </w:rPr>
+              <w:t>–</w:t>
+            </w:r>
+            <w:r>
+              <w:rPr>
+                <w:rFonts w:ascii="BRH Malayalam Extra" w:hAnsi="BRH Malayalam Extra" w:cs="BRH Malayalam Extra"/>
+                <w:color w:val="000000"/>
+                <w:sz w:val="32"/>
+                <w:szCs w:val="40"/>
+              </w:rPr>
+              <w:t>cyI |</w:t>
+            </w:r>
+          </w:p>
+          <w:p>
+            <w:pPr>
+              <w:widowControl w:val="0"/>
+              <w:autoSpaceDE w:val="0"/>
+              <w:autoSpaceDN w:val="0"/>
+              <w:adjustRightInd w:val="0"/>
+              <w:spacing w:line="240" w:lineRule="auto"/>
+              <w:rPr>
+                <w:rFonts w:ascii="BRH Malayalam Extra" w:hAnsi="BRH Malayalam Extra" w:cs="BRH Malayalam Extra"/>
+                <w:color w:val="000000"/>
+                <w:sz w:val="32"/>
+                <w:szCs w:val="40"/>
+              </w:rPr>
+            </w:pPr>
+            <w:r>
+              <w:rPr>
+                <w:rFonts w:ascii="BRH Malayalam Extra" w:hAnsi="BRH Malayalam Extra" w:cs="BRH Malayalam Extra"/>
+                <w:color w:val="000000"/>
+                <w:sz w:val="32"/>
+                <w:szCs w:val="40"/>
+              </w:rPr>
+              <w:t>b</w:t>
+            </w:r>
+            <w:r>
+              <w:rPr>
+                <w:rFonts w:ascii="BRH Malayalam Extra" w:hAnsi="BRH Malayalam Extra" w:cs="BRH Malayalam Extra"/>
+                <w:color w:val="000000"/>
+                <w:sz w:val="26"/>
+                <w:szCs w:val="40"/>
+              </w:rPr>
+              <w:t>–</w:t>
+            </w:r>
+            <w:r>
+              <w:rPr>
+                <w:rFonts w:ascii="BRH Malayalam Extra" w:hAnsi="BRH Malayalam Extra" w:cs="BRH Malayalam Extra"/>
+                <w:color w:val="000000"/>
+                <w:sz w:val="32"/>
+                <w:szCs w:val="40"/>
+              </w:rPr>
+              <w:t>¥</w:t>
+            </w:r>
+            <w:r>
+              <w:rPr>
+                <w:rFonts w:ascii="BRH Malayalam Extra" w:hAnsi="BRH Malayalam Extra" w:cs="BRH Malayalam Extra"/>
+                <w:color w:val="000000"/>
+                <w:sz w:val="32"/>
+                <w:szCs w:val="40"/>
+                <w:highlight w:val="green"/>
+              </w:rPr>
+              <w:t>À</w:t>
+            </w:r>
+            <w:r>
+              <w:rPr>
+                <w:rFonts w:ascii="BRH Malayalam Extra" w:hAnsi="BRH Malayalam Extra" w:cs="BRH Malayalam Extra"/>
+                <w:color w:val="000000"/>
+                <w:sz w:val="32"/>
+                <w:szCs w:val="40"/>
+              </w:rPr>
+              <w:t>x</w:t>
+            </w:r>
+            <w:r>
+              <w:rPr>
+                <w:rFonts w:ascii="BRH Malayalam Extra" w:hAnsi="BRH Malayalam Extra" w:cs="BRH Malayalam Extra"/>
+                <w:color w:val="000000"/>
+                <w:sz w:val="26"/>
+                <w:szCs w:val="40"/>
+              </w:rPr>
+              <w:t>–</w:t>
+            </w:r>
+            <w:r>
+              <w:rPr>
+                <w:rFonts w:ascii="BRH Malayalam Extra" w:hAnsi="BRH Malayalam Extra" w:cs="BRH Malayalam Extra"/>
+                <w:color w:val="000000"/>
+                <w:sz w:val="32"/>
+                <w:szCs w:val="40"/>
+              </w:rPr>
+              <w:t>b</w:t>
+            </w:r>
+            <w:r>
+              <w:rPr>
+                <w:rFonts w:ascii="BRH Malayalam Extra" w:hAnsi="BRH Malayalam Extra" w:cs="BRH Malayalam Extra"/>
+                <w:color w:val="000000"/>
+                <w:sz w:val="26"/>
+                <w:szCs w:val="40"/>
+              </w:rPr>
+              <w:t>–</w:t>
+            </w:r>
+            <w:r>
+              <w:rPr>
+                <w:rFonts w:ascii="BRH Malayalam Extra" w:hAnsi="BRH Malayalam Extra" w:cs="BRH Malayalam Extra"/>
+                <w:color w:val="000000"/>
+                <w:sz w:val="32"/>
+                <w:szCs w:val="40"/>
+              </w:rPr>
+              <w:t>cy i¡—b</w:t>
+            </w:r>
+            <w:r>
+              <w:rPr>
+                <w:rFonts w:ascii="BRH Malayalam Extra" w:hAnsi="BRH Malayalam Extra" w:cs="BRH Malayalam Extra"/>
+                <w:color w:val="000000"/>
+                <w:sz w:val="26"/>
+                <w:szCs w:val="40"/>
+              </w:rPr>
+              <w:t>–</w:t>
+            </w:r>
+            <w:r>
+              <w:rPr>
+                <w:rFonts w:ascii="BRH Malayalam Extra" w:hAnsi="BRH Malayalam Extra" w:cs="BRH Malayalam Extra"/>
+                <w:color w:val="000000"/>
+                <w:sz w:val="32"/>
+                <w:szCs w:val="40"/>
+              </w:rPr>
+              <w:t xml:space="preserve">cyI </w:t>
+            </w:r>
+            <w:r>
+              <w:rPr>
+                <w:rFonts w:ascii="BRH Malayalam Extra" w:hAnsi="BRH Malayalam Extra" w:cs="BRH Malayalam Extra"/>
+                <w:color w:val="000000"/>
+                <w:sz w:val="32"/>
+                <w:szCs w:val="40"/>
+                <w:highlight w:val="green"/>
+              </w:rPr>
+              <w:t>b</w:t>
+            </w:r>
+            <w:r>
+              <w:rPr>
+                <w:rFonts w:ascii="BRH Malayalam Extra" w:hAnsi="BRH Malayalam Extra" w:cs="BRH Malayalam Extra"/>
+                <w:color w:val="000000"/>
+                <w:sz w:val="32"/>
+                <w:szCs w:val="40"/>
+              </w:rPr>
+              <w:t xml:space="preserve">—À </w:t>
+            </w:r>
+            <w:r>
+              <w:rPr>
+                <w:rFonts w:ascii="BRH Malayalam Extra" w:hAnsi="BRH Malayalam Extra" w:cs="BRH Malayalam Extra"/>
+                <w:color w:val="000000"/>
+                <w:sz w:val="32"/>
+                <w:szCs w:val="40"/>
+                <w:highlight w:val="green"/>
+              </w:rPr>
+              <w:t>b</w:t>
+            </w:r>
+            <w:r>
+              <w:rPr>
+                <w:rFonts w:ascii="BRH Malayalam Extra" w:hAnsi="BRH Malayalam Extra" w:cs="BRH Malayalam Extra"/>
+                <w:color w:val="000000"/>
+                <w:sz w:val="32"/>
+                <w:szCs w:val="40"/>
+              </w:rPr>
+              <w:t>¥Àxb</w:t>
+            </w:r>
+            <w:r>
+              <w:rPr>
+                <w:rFonts w:ascii="BRH Malayalam Extra" w:hAnsi="BRH Malayalam Extra" w:cs="BRH Malayalam Extra"/>
+                <w:color w:val="000000"/>
+                <w:sz w:val="26"/>
+                <w:szCs w:val="40"/>
+              </w:rPr>
+              <w:t>–</w:t>
+            </w:r>
+            <w:r>
+              <w:rPr>
+                <w:rFonts w:ascii="BRH Malayalam Extra" w:hAnsi="BRH Malayalam Extra" w:cs="BRH Malayalam Extra"/>
+                <w:color w:val="000000"/>
+                <w:sz w:val="32"/>
+                <w:szCs w:val="40"/>
+              </w:rPr>
+              <w:t xml:space="preserve">cyI | </w:t>
+            </w:r>
+          </w:p>
+          <w:p>
+            <w:pPr>
+              <w:widowControl w:val="0"/>
+              <w:autoSpaceDE w:val="0"/>
+              <w:autoSpaceDN w:val="0"/>
+              <w:adjustRightInd w:val="0"/>
+              <w:spacing w:before="0" w:line="240" w:lineRule="auto"/>
+              <w:rPr>
+                <w:rFonts w:cs="BRH Malayalam Extra"/>
+                <w:color w:val="000000"/>
+                <w:szCs w:val="40"/>
+              </w:rPr>
+            </w:pPr>
+          </w:p>
+        </w:tc>
+      </w:tr>
+      <w:tr>
+        <w:trPr>
+          <w:trHeight w:val="1393"/>
+        </w:trPr>
+        <w:tc>
+          <w:tcPr>
+            <w:tcW w:w="7308" w:type="dxa"/>
+          </w:tcPr>
+          <w:p>
+            <w:pPr>
+              <w:widowControl w:val="0"/>
+              <w:autoSpaceDE w:val="0"/>
+              <w:autoSpaceDN w:val="0"/>
+              <w:adjustRightInd w:val="0"/>
+              <w:spacing w:line="240" w:lineRule="auto"/>
+              <w:rPr>
+                <w:rFonts w:ascii="BRH Malayalam Extra" w:hAnsi="BRH Malayalam Extra" w:cs="BRH Malayalam Extra"/>
+                <w:color w:val="000000"/>
+                <w:sz w:val="32"/>
+                <w:szCs w:val="40"/>
+              </w:rPr>
+            </w:pPr>
+            <w:r>
+              <w:rPr>
+                <w:rFonts w:cs="BRH Malayalam Extra"/>
+                <w:color w:val="000000"/>
+                <w:szCs w:val="40"/>
+              </w:rPr>
+              <w:t>9</w:t>
+            </w:r>
+            <w:r>
+              <w:rPr>
+                <w:rFonts w:ascii="BRH Malayalam Extra" w:hAnsi="BRH Malayalam Extra" w:cs="BRH Malayalam Extra"/>
+                <w:color w:val="000000"/>
+                <w:sz w:val="32"/>
+                <w:szCs w:val="40"/>
+              </w:rPr>
+              <w:t>)</w:t>
+            </w:r>
+            <w:r>
+              <w:rPr>
+                <w:rFonts w:ascii="BRH Malayalam Extra" w:hAnsi="BRH Malayalam Extra" w:cs="BRH Malayalam Extra"/>
+                <w:color w:val="000000"/>
+                <w:sz w:val="32"/>
+                <w:szCs w:val="40"/>
+              </w:rPr>
+              <w:tab/>
+            </w:r>
+            <w:r>
+              <w:rPr>
+                <w:rFonts w:cs="BRH Malayalam Extra"/>
+                <w:color w:val="000000"/>
+                <w:szCs w:val="40"/>
+              </w:rPr>
+              <w:t>2</w:t>
+            </w:r>
+            <w:r>
+              <w:rPr>
+                <w:rFonts w:ascii="BRH Malayalam Extra" w:hAnsi="BRH Malayalam Extra" w:cs="BRH Malayalam Extra"/>
+                <w:color w:val="000000"/>
+                <w:sz w:val="32"/>
+                <w:szCs w:val="40"/>
+              </w:rPr>
+              <w:t>.</w:t>
+            </w:r>
+            <w:r>
+              <w:rPr>
+                <w:rFonts w:cs="BRH Malayalam Extra"/>
+                <w:color w:val="000000"/>
+                <w:szCs w:val="40"/>
+              </w:rPr>
+              <w:t>4</w:t>
+            </w:r>
+            <w:r>
+              <w:rPr>
+                <w:rFonts w:ascii="BRH Malayalam Extra" w:hAnsi="BRH Malayalam Extra" w:cs="BRH Malayalam Extra"/>
+                <w:color w:val="000000"/>
+                <w:sz w:val="32"/>
+                <w:szCs w:val="40"/>
+              </w:rPr>
+              <w:t>.</w:t>
+            </w:r>
+            <w:r>
+              <w:rPr>
+                <w:rFonts w:cs="BRH Malayalam Extra"/>
+                <w:color w:val="000000"/>
+                <w:szCs w:val="40"/>
+              </w:rPr>
+              <w:t>8</w:t>
+            </w:r>
+            <w:r>
+              <w:rPr>
+                <w:rFonts w:ascii="BRH Malayalam Extra" w:hAnsi="BRH Malayalam Extra" w:cs="BRH Malayalam Extra"/>
+                <w:color w:val="000000"/>
+                <w:sz w:val="32"/>
+                <w:szCs w:val="40"/>
+              </w:rPr>
+              <w:t>.</w:t>
+            </w:r>
+            <w:r>
+              <w:rPr>
+                <w:rFonts w:cs="BRH Malayalam Extra"/>
+                <w:color w:val="000000"/>
+                <w:szCs w:val="40"/>
+              </w:rPr>
+              <w:t>2</w:t>
+            </w:r>
+            <w:r>
+              <w:rPr>
+                <w:rFonts w:ascii="BRH Malayalam Extra" w:hAnsi="BRH Malayalam Extra" w:cs="BRH Malayalam Extra"/>
+                <w:color w:val="000000"/>
+                <w:sz w:val="32"/>
+                <w:szCs w:val="40"/>
+              </w:rPr>
+              <w:t>(</w:t>
+            </w:r>
+            <w:r>
+              <w:rPr>
+                <w:rFonts w:cs="BRH Malayalam Extra"/>
+                <w:color w:val="000000"/>
+                <w:szCs w:val="40"/>
+              </w:rPr>
+              <w:t>9</w:t>
+            </w:r>
+            <w:r>
+              <w:rPr>
+                <w:rFonts w:ascii="BRH Malayalam Extra" w:hAnsi="BRH Malayalam Extra" w:cs="BRH Malayalam Extra"/>
+                <w:color w:val="000000"/>
+                <w:sz w:val="32"/>
+                <w:szCs w:val="40"/>
+              </w:rPr>
+              <w:t>)-  e¡</w:t>
+            </w:r>
+            <w:r>
+              <w:rPr>
+                <w:rFonts w:ascii="BRH Malayalam Extra" w:hAnsi="BRH Malayalam Extra" w:cs="BRH Malayalam Extra"/>
+                <w:color w:val="000000"/>
+                <w:sz w:val="26"/>
+                <w:szCs w:val="40"/>
+              </w:rPr>
+              <w:t>–</w:t>
+            </w:r>
+            <w:r>
+              <w:rPr>
+                <w:rFonts w:ascii="BRH Malayalam Extra" w:hAnsi="BRH Malayalam Extra" w:cs="BRH Malayalam Extra"/>
+                <w:color w:val="000000"/>
+                <w:sz w:val="32"/>
+                <w:szCs w:val="40"/>
+              </w:rPr>
+              <w:t>kz</w:t>
+            </w:r>
+            <w:r>
+              <w:rPr>
+                <w:rFonts w:ascii="BRH Malayalam Extra" w:hAnsi="BRH Malayalam Extra" w:cs="BRH Malayalam Extra"/>
+                <w:color w:val="000000"/>
+                <w:sz w:val="26"/>
+                <w:szCs w:val="40"/>
+              </w:rPr>
+              <w:t>–</w:t>
+            </w:r>
+            <w:r>
+              <w:rPr>
+                <w:rFonts w:ascii="BRH Malayalam Extra" w:hAnsi="BRH Malayalam Extra" w:cs="BRH Malayalam Extra"/>
+                <w:color w:val="000000"/>
+                <w:sz w:val="32"/>
+                <w:szCs w:val="40"/>
+              </w:rPr>
+              <w:t>ry</w:t>
+            </w:r>
+            <w:r>
+              <w:rPr>
+                <w:rFonts w:ascii="BRH Malayalam Extra" w:hAnsi="BRH Malayalam Extra" w:cs="BRH Malayalam Extra"/>
+                <w:color w:val="000000"/>
+                <w:sz w:val="26"/>
+                <w:szCs w:val="40"/>
+              </w:rPr>
+              <w:t>–</w:t>
+            </w:r>
+            <w:r>
+              <w:rPr>
+                <w:rFonts w:ascii="BRH Malayalam Extra" w:hAnsi="BRH Malayalam Extra" w:cs="BRH Malayalam Extra"/>
+                <w:color w:val="000000"/>
+                <w:sz w:val="32"/>
+                <w:szCs w:val="40"/>
+              </w:rPr>
+              <w:t>Y</w:t>
+            </w:r>
+            <w:r>
+              <w:rPr>
+                <w:rFonts w:ascii="BRH Malayalam Extra" w:hAnsi="BRH Malayalam Extra" w:cs="BRH Malayalam Extra"/>
+                <w:color w:val="000000"/>
+                <w:sz w:val="26"/>
+                <w:szCs w:val="40"/>
+              </w:rPr>
+              <w:t>–</w:t>
+            </w:r>
+            <w:r>
+              <w:rPr>
+                <w:rFonts w:ascii="BRH Malayalam Extra" w:hAnsi="BRH Malayalam Extra" w:cs="BRH Malayalam Extra"/>
+                <w:color w:val="000000"/>
+                <w:sz w:val="32"/>
+                <w:szCs w:val="40"/>
+              </w:rPr>
+              <w:t>J ||</w:t>
+            </w:r>
+          </w:p>
+          <w:p>
+            <w:pPr>
+              <w:widowControl w:val="0"/>
+              <w:autoSpaceDE w:val="0"/>
+              <w:autoSpaceDN w:val="0"/>
+              <w:adjustRightInd w:val="0"/>
+              <w:spacing w:line="240" w:lineRule="auto"/>
+              <w:rPr>
+                <w:rFonts w:cs="BRH Malayalam Extra"/>
+                <w:color w:val="000000"/>
+                <w:szCs w:val="40"/>
+              </w:rPr>
+            </w:pPr>
+            <w:r>
+              <w:rPr>
+                <w:rFonts w:ascii="BRH Malayalam Extra" w:hAnsi="BRH Malayalam Extra" w:cs="BRH Malayalam Extra"/>
+                <w:color w:val="000000"/>
+                <w:sz w:val="32"/>
+                <w:szCs w:val="40"/>
+              </w:rPr>
+              <w:t>e¡</w:t>
+            </w:r>
+            <w:r>
+              <w:rPr>
+                <w:rFonts w:ascii="BRH Malayalam Extra" w:hAnsi="BRH Malayalam Extra" w:cs="BRH Malayalam Extra"/>
+                <w:color w:val="000000"/>
+                <w:sz w:val="26"/>
+                <w:szCs w:val="40"/>
+              </w:rPr>
+              <w:t>–</w:t>
+            </w:r>
+            <w:r>
+              <w:rPr>
+                <w:rFonts w:ascii="BRH Malayalam Extra" w:hAnsi="BRH Malayalam Extra" w:cs="BRH Malayalam Extra"/>
+                <w:color w:val="000000"/>
+                <w:sz w:val="32"/>
+                <w:szCs w:val="40"/>
+              </w:rPr>
+              <w:t>kz</w:t>
+            </w:r>
+            <w:r>
+              <w:rPr>
+                <w:rFonts w:ascii="BRH Malayalam Extra" w:hAnsi="BRH Malayalam Extra" w:cs="BRH Malayalam Extra"/>
+                <w:color w:val="000000"/>
+                <w:sz w:val="26"/>
+                <w:szCs w:val="40"/>
+              </w:rPr>
+              <w:t>–</w:t>
+            </w:r>
+            <w:r>
+              <w:rPr>
+                <w:rFonts w:ascii="BRH Malayalam Extra" w:hAnsi="BRH Malayalam Extra" w:cs="BRH Malayalam Extra"/>
+                <w:color w:val="000000"/>
+                <w:sz w:val="32"/>
+                <w:szCs w:val="40"/>
+                <w:highlight w:val="yellow"/>
+              </w:rPr>
+              <w:t>r</w:t>
+            </w:r>
+            <w:r>
+              <w:rPr>
+                <w:rFonts w:ascii="BRH Malayalam Extra" w:hAnsi="BRH Malayalam Extra" w:cs="BRH Malayalam Extra"/>
+                <w:color w:val="000000"/>
+                <w:sz w:val="26"/>
+                <w:szCs w:val="40"/>
+              </w:rPr>
+              <w:t>–</w:t>
+            </w:r>
+            <w:r>
+              <w:rPr>
+                <w:rFonts w:ascii="BRH Malayalam Extra" w:hAnsi="BRH Malayalam Extra" w:cs="BRH Malayalam Extra"/>
+                <w:color w:val="000000"/>
+                <w:sz w:val="32"/>
+                <w:szCs w:val="40"/>
+              </w:rPr>
+              <w:t>Y</w:t>
+            </w:r>
+            <w:r>
+              <w:rPr>
+                <w:rFonts w:ascii="BRH Malayalam Extra" w:hAnsi="BRH Malayalam Extra" w:cs="BRH Malayalam Extra"/>
+                <w:color w:val="000000"/>
+                <w:sz w:val="26"/>
+                <w:szCs w:val="40"/>
+              </w:rPr>
+              <w:t>–</w:t>
+            </w:r>
+            <w:r>
+              <w:rPr>
+                <w:rFonts w:ascii="BRH Malayalam Extra" w:hAnsi="BRH Malayalam Extra" w:cs="BRH Malayalam Extra"/>
+                <w:color w:val="000000"/>
+                <w:sz w:val="32"/>
+                <w:szCs w:val="40"/>
+              </w:rPr>
+              <w:t xml:space="preserve"> CZy— e¡kz</w:t>
+            </w:r>
+            <w:r>
+              <w:rPr>
+                <w:rFonts w:ascii="BRH Malayalam Extra" w:hAnsi="BRH Malayalam Extra" w:cs="BRH Malayalam Extra"/>
+                <w:color w:val="000000"/>
+                <w:sz w:val="32"/>
+                <w:szCs w:val="40"/>
+                <w:highlight w:val="yellow"/>
+              </w:rPr>
+              <w:t>r</w:t>
+            </w:r>
+            <w:r>
+              <w:rPr>
+                <w:rFonts w:ascii="BRH Malayalam Extra" w:hAnsi="BRH Malayalam Extra" w:cs="BRH Malayalam Extra"/>
+                <w:color w:val="000000"/>
+                <w:sz w:val="32"/>
+                <w:szCs w:val="40"/>
+              </w:rPr>
+              <w:t xml:space="preserve">YJ | </w:t>
+            </w:r>
+          </w:p>
+        </w:tc>
+        <w:tc>
+          <w:tcPr>
+            <w:tcW w:w="7513" w:type="dxa"/>
+            <w:gridSpan w:val="2"/>
+          </w:tcPr>
+          <w:p>
+            <w:pPr>
+              <w:widowControl w:val="0"/>
+              <w:autoSpaceDE w:val="0"/>
+              <w:autoSpaceDN w:val="0"/>
+              <w:adjustRightInd w:val="0"/>
+              <w:spacing w:line="240" w:lineRule="auto"/>
+              <w:rPr>
+                <w:rFonts w:ascii="BRH Malayalam Extra" w:hAnsi="BRH Malayalam Extra" w:cs="BRH Malayalam Extra"/>
+                <w:color w:val="000000"/>
+                <w:sz w:val="32"/>
+                <w:szCs w:val="40"/>
+              </w:rPr>
+            </w:pPr>
+            <w:r>
+              <w:rPr>
+                <w:rFonts w:cs="BRH Malayalam Extra"/>
+                <w:color w:val="000000"/>
+                <w:szCs w:val="40"/>
+              </w:rPr>
+              <w:t>9</w:t>
+            </w:r>
+            <w:r>
+              <w:rPr>
+                <w:rFonts w:ascii="BRH Malayalam Extra" w:hAnsi="BRH Malayalam Extra" w:cs="BRH Malayalam Extra"/>
+                <w:color w:val="000000"/>
+                <w:sz w:val="32"/>
+                <w:szCs w:val="40"/>
+              </w:rPr>
+              <w:t>)</w:t>
+            </w:r>
+            <w:r>
+              <w:rPr>
+                <w:rFonts w:ascii="BRH Malayalam Extra" w:hAnsi="BRH Malayalam Extra" w:cs="BRH Malayalam Extra"/>
+                <w:color w:val="000000"/>
+                <w:sz w:val="32"/>
+                <w:szCs w:val="40"/>
+              </w:rPr>
+              <w:tab/>
+            </w:r>
+            <w:r>
+              <w:rPr>
+                <w:rFonts w:cs="BRH Malayalam Extra"/>
+                <w:color w:val="000000"/>
+                <w:szCs w:val="40"/>
+              </w:rPr>
+              <w:t>2</w:t>
+            </w:r>
+            <w:r>
+              <w:rPr>
+                <w:rFonts w:ascii="BRH Malayalam Extra" w:hAnsi="BRH Malayalam Extra" w:cs="BRH Malayalam Extra"/>
+                <w:color w:val="000000"/>
+                <w:sz w:val="32"/>
+                <w:szCs w:val="40"/>
+              </w:rPr>
+              <w:t>.</w:t>
+            </w:r>
+            <w:r>
+              <w:rPr>
+                <w:rFonts w:cs="BRH Malayalam Extra"/>
+                <w:color w:val="000000"/>
+                <w:szCs w:val="40"/>
+              </w:rPr>
+              <w:t>4</w:t>
+            </w:r>
+            <w:r>
+              <w:rPr>
+                <w:rFonts w:ascii="BRH Malayalam Extra" w:hAnsi="BRH Malayalam Extra" w:cs="BRH Malayalam Extra"/>
+                <w:color w:val="000000"/>
+                <w:sz w:val="32"/>
+                <w:szCs w:val="40"/>
+              </w:rPr>
+              <w:t>.</w:t>
+            </w:r>
+            <w:r>
+              <w:rPr>
+                <w:rFonts w:cs="BRH Malayalam Extra"/>
+                <w:color w:val="000000"/>
+                <w:szCs w:val="40"/>
+              </w:rPr>
+              <w:t>8</w:t>
+            </w:r>
+            <w:r>
+              <w:rPr>
+                <w:rFonts w:ascii="BRH Malayalam Extra" w:hAnsi="BRH Malayalam Extra" w:cs="BRH Malayalam Extra"/>
+                <w:color w:val="000000"/>
+                <w:sz w:val="32"/>
+                <w:szCs w:val="40"/>
+              </w:rPr>
+              <w:t>.</w:t>
+            </w:r>
+            <w:r>
+              <w:rPr>
+                <w:rFonts w:cs="BRH Malayalam Extra"/>
+                <w:color w:val="000000"/>
+                <w:szCs w:val="40"/>
+              </w:rPr>
+              <w:t>2</w:t>
+            </w:r>
+            <w:r>
+              <w:rPr>
+                <w:rFonts w:ascii="BRH Malayalam Extra" w:hAnsi="BRH Malayalam Extra" w:cs="BRH Malayalam Extra"/>
+                <w:color w:val="000000"/>
+                <w:sz w:val="32"/>
+                <w:szCs w:val="40"/>
+              </w:rPr>
+              <w:t>(</w:t>
+            </w:r>
+            <w:r>
+              <w:rPr>
+                <w:rFonts w:cs="BRH Malayalam Extra"/>
+                <w:color w:val="000000"/>
+                <w:szCs w:val="40"/>
+              </w:rPr>
+              <w:t>9</w:t>
+            </w:r>
+            <w:r>
+              <w:rPr>
+                <w:rFonts w:ascii="BRH Malayalam Extra" w:hAnsi="BRH Malayalam Extra" w:cs="BRH Malayalam Extra"/>
+                <w:color w:val="000000"/>
+                <w:sz w:val="32"/>
+                <w:szCs w:val="40"/>
+              </w:rPr>
+              <w:t>)-  e¡</w:t>
+            </w:r>
+            <w:r>
+              <w:rPr>
+                <w:rFonts w:ascii="BRH Malayalam Extra" w:hAnsi="BRH Malayalam Extra" w:cs="BRH Malayalam Extra"/>
+                <w:color w:val="000000"/>
+                <w:sz w:val="26"/>
+                <w:szCs w:val="40"/>
+              </w:rPr>
+              <w:t>–</w:t>
+            </w:r>
+            <w:r>
+              <w:rPr>
+                <w:rFonts w:ascii="BRH Malayalam Extra" w:hAnsi="BRH Malayalam Extra" w:cs="BRH Malayalam Extra"/>
+                <w:color w:val="000000"/>
+                <w:sz w:val="32"/>
+                <w:szCs w:val="40"/>
+              </w:rPr>
+              <w:t>kz</w:t>
+            </w:r>
+            <w:r>
+              <w:rPr>
+                <w:rFonts w:ascii="BRH Malayalam Extra" w:hAnsi="BRH Malayalam Extra" w:cs="BRH Malayalam Extra"/>
+                <w:color w:val="000000"/>
+                <w:sz w:val="26"/>
+                <w:szCs w:val="40"/>
+              </w:rPr>
+              <w:t>–</w:t>
+            </w:r>
+            <w:r>
+              <w:rPr>
+                <w:rFonts w:ascii="BRH Malayalam Extra" w:hAnsi="BRH Malayalam Extra" w:cs="BRH Malayalam Extra"/>
+                <w:color w:val="000000"/>
+                <w:sz w:val="32"/>
+                <w:szCs w:val="40"/>
+              </w:rPr>
+              <w:t>ry</w:t>
+            </w:r>
+            <w:r>
+              <w:rPr>
+                <w:rFonts w:ascii="BRH Malayalam Extra" w:hAnsi="BRH Malayalam Extra" w:cs="BRH Malayalam Extra"/>
+                <w:color w:val="000000"/>
+                <w:sz w:val="26"/>
+                <w:szCs w:val="40"/>
+              </w:rPr>
+              <w:t>–</w:t>
+            </w:r>
+            <w:r>
+              <w:rPr>
+                <w:rFonts w:ascii="BRH Malayalam Extra" w:hAnsi="BRH Malayalam Extra" w:cs="BRH Malayalam Extra"/>
+                <w:color w:val="000000"/>
+                <w:sz w:val="32"/>
+                <w:szCs w:val="40"/>
+              </w:rPr>
+              <w:t>Y</w:t>
+            </w:r>
+            <w:r>
+              <w:rPr>
+                <w:rFonts w:ascii="BRH Malayalam Extra" w:hAnsi="BRH Malayalam Extra" w:cs="BRH Malayalam Extra"/>
+                <w:color w:val="000000"/>
+                <w:sz w:val="26"/>
+                <w:szCs w:val="40"/>
+              </w:rPr>
+              <w:t>–</w:t>
+            </w:r>
+            <w:r>
+              <w:rPr>
+                <w:rFonts w:ascii="BRH Malayalam Extra" w:hAnsi="BRH Malayalam Extra" w:cs="BRH Malayalam Extra"/>
+                <w:color w:val="000000"/>
+                <w:sz w:val="32"/>
+                <w:szCs w:val="40"/>
+              </w:rPr>
+              <w:t>J ||</w:t>
+            </w:r>
+          </w:p>
+          <w:p>
+            <w:pPr>
+              <w:widowControl w:val="0"/>
+              <w:autoSpaceDE w:val="0"/>
+              <w:autoSpaceDN w:val="0"/>
+              <w:adjustRightInd w:val="0"/>
+              <w:spacing w:line="240" w:lineRule="auto"/>
+              <w:rPr>
+                <w:rFonts w:cs="BRH Malayalam Extra"/>
+                <w:color w:val="000000"/>
+                <w:szCs w:val="40"/>
+              </w:rPr>
+            </w:pPr>
+            <w:r>
+              <w:rPr>
+                <w:rFonts w:ascii="BRH Malayalam Extra" w:hAnsi="BRH Malayalam Extra" w:cs="BRH Malayalam Extra"/>
+                <w:color w:val="000000"/>
+                <w:sz w:val="32"/>
+                <w:szCs w:val="40"/>
+              </w:rPr>
+              <w:t>e¡</w:t>
+            </w:r>
+            <w:r>
+              <w:rPr>
+                <w:rFonts w:ascii="BRH Malayalam Extra" w:hAnsi="BRH Malayalam Extra" w:cs="BRH Malayalam Extra"/>
+                <w:color w:val="000000"/>
+                <w:sz w:val="26"/>
+                <w:szCs w:val="40"/>
+              </w:rPr>
+              <w:t>–</w:t>
+            </w:r>
+            <w:r>
+              <w:rPr>
+                <w:rFonts w:ascii="BRH Malayalam Extra" w:hAnsi="BRH Malayalam Extra" w:cs="BRH Malayalam Extra"/>
+                <w:color w:val="000000"/>
+                <w:sz w:val="32"/>
+                <w:szCs w:val="40"/>
+              </w:rPr>
+              <w:t>kz</w:t>
+            </w:r>
+            <w:r>
+              <w:rPr>
+                <w:rFonts w:ascii="BRH Malayalam Extra" w:hAnsi="BRH Malayalam Extra" w:cs="BRH Malayalam Extra"/>
+                <w:color w:val="000000"/>
+                <w:sz w:val="26"/>
+                <w:szCs w:val="40"/>
+              </w:rPr>
+              <w:t>–</w:t>
+            </w:r>
+            <w:r>
+              <w:rPr>
+                <w:rFonts w:ascii="BRH Malayalam Extra" w:hAnsi="BRH Malayalam Extra" w:cs="BRH Malayalam Extra"/>
+                <w:color w:val="000000"/>
+                <w:sz w:val="32"/>
+                <w:szCs w:val="40"/>
+                <w:highlight w:val="green"/>
+              </w:rPr>
+              <w:t>ry</w:t>
+            </w:r>
+            <w:r>
+              <w:rPr>
+                <w:rFonts w:ascii="BRH Malayalam Extra" w:hAnsi="BRH Malayalam Extra" w:cs="BRH Malayalam Extra"/>
+                <w:color w:val="000000"/>
+                <w:sz w:val="26"/>
+                <w:szCs w:val="40"/>
+                <w:highlight w:val="green"/>
+              </w:rPr>
+              <w:t>–</w:t>
+            </w:r>
+            <w:r>
+              <w:rPr>
+                <w:rFonts w:ascii="BRH Malayalam Extra" w:hAnsi="BRH Malayalam Extra" w:cs="BRH Malayalam Extra"/>
+                <w:color w:val="000000"/>
+                <w:sz w:val="32"/>
+                <w:szCs w:val="40"/>
+              </w:rPr>
+              <w:t>Y</w:t>
+            </w:r>
+            <w:r>
+              <w:rPr>
+                <w:rFonts w:ascii="BRH Malayalam Extra" w:hAnsi="BRH Malayalam Extra" w:cs="BRH Malayalam Extra"/>
+                <w:color w:val="000000"/>
+                <w:sz w:val="26"/>
+                <w:szCs w:val="40"/>
+              </w:rPr>
+              <w:t>–</w:t>
+            </w:r>
+            <w:r>
+              <w:rPr>
+                <w:rFonts w:ascii="BRH Malayalam Extra" w:hAnsi="BRH Malayalam Extra" w:cs="BRH Malayalam Extra"/>
+                <w:color w:val="000000"/>
+                <w:sz w:val="32"/>
+                <w:szCs w:val="40"/>
+              </w:rPr>
+              <w:t xml:space="preserve"> CZy— e¡kzr</w:t>
+            </w:r>
+            <w:r>
+              <w:rPr>
+                <w:rFonts w:ascii="BRH Malayalam Extra" w:hAnsi="BRH Malayalam Extra" w:cs="BRH Malayalam Extra"/>
+                <w:color w:val="000000"/>
+                <w:sz w:val="32"/>
+                <w:szCs w:val="40"/>
+                <w:highlight w:val="green"/>
+              </w:rPr>
+              <w:t>y</w:t>
+            </w:r>
+            <w:r>
+              <w:rPr>
+                <w:rFonts w:ascii="BRH Malayalam Extra" w:hAnsi="BRH Malayalam Extra" w:cs="BRH Malayalam Extra"/>
+                <w:color w:val="000000"/>
+                <w:sz w:val="32"/>
+                <w:szCs w:val="40"/>
+              </w:rPr>
+              <w:t xml:space="preserve">YJ | </w:t>
+            </w:r>
+          </w:p>
+        </w:tc>
+      </w:tr>
+    </w:tbl>
+    <w:p>
+      <w:pPr>
+        <w:spacing w:before="0" w:line="240" w:lineRule="auto"/>
+        <w:jc w:val="center"/>
+        <w:rPr>
+          <w:b/>
+          <w:bCs/>
+          <w:sz w:val="32"/>
+          <w:szCs w:val="32"/>
+          <w:u w:val="single"/>
+        </w:rPr>
+      </w:pPr>
+    </w:p>
+    <w:p>
+      <w:pPr>
+        <w:spacing w:before="0" w:line="240" w:lineRule="auto"/>
+        <w:jc w:val="center"/>
+        <w:rPr>
+          <w:b/>
+          <w:bCs/>
+          <w:sz w:val="32"/>
+          <w:szCs w:val="32"/>
+          <w:u w:val="single"/>
+        </w:rPr>
+      </w:pPr>
+    </w:p>
     <w:p>
       <w:pPr>
         <w:spacing w:before="0" w:line="240" w:lineRule="auto"/>
@@ -154,27 +2376,7 @@
           <w:sz w:val="28"/>
           <w:szCs w:val="32"/>
         </w:rPr>
-        <w:t>(</w:t>
-      </w:r>
-      <w:proofErr w:type="gramStart"/>
-      <w:r>
-        <w:rPr>
-          <w:b/>
-          <w:bCs/>
-          <w:sz w:val="28"/>
-          <w:szCs w:val="32"/>
-        </w:rPr>
-        <w:t>ignore</w:t>
-      </w:r>
-      <w:proofErr w:type="gramEnd"/>
-      <w:r>
-        <w:rPr>
-          <w:b/>
-          <w:bCs/>
-          <w:sz w:val="28"/>
-          <w:szCs w:val="32"/>
-        </w:rPr>
-        <w:t xml:space="preserve"> those which are already incorporated in your book’s version and date)</w:t>
+        <w:t>(ignore those which are already incorporated in your book’s version and date)</w:t>
       </w:r>
     </w:p>
     <w:tbl>
@@ -387,19 +2589,8 @@
                 <w:sz w:val="32"/>
                 <w:szCs w:val="40"/>
               </w:rPr>
-              <w:t>)</w:t>
-            </w:r>
-            <w:proofErr w:type="gramStart"/>
-            <w:r>
-              <w:rPr>
-                <w:rFonts w:ascii="BRH Malayalam Extra" w:hAnsi="BRH Malayalam Extra" w:cs="BRH Malayalam Extra"/>
-                <w:color w:val="000000"/>
-                <w:sz w:val="32"/>
-                <w:szCs w:val="40"/>
-              </w:rPr>
-              <w:t>-  A</w:t>
-            </w:r>
-            <w:proofErr w:type="gramEnd"/>
+              <w:t>)-  A</w:t>
+            </w:r>
             <w:r>
               <w:rPr>
                 <w:rFonts w:ascii="BRH Malayalam Extra" w:hAnsi="BRH Malayalam Extra" w:cs="BRH Malayalam Extra"/>
@@ -727,19 +2918,8 @@
                 <w:sz w:val="32"/>
                 <w:szCs w:val="40"/>
               </w:rPr>
-              <w:t>)</w:t>
-            </w:r>
-            <w:proofErr w:type="gramStart"/>
-            <w:r>
-              <w:rPr>
-                <w:rFonts w:ascii="BRH Malayalam Extra" w:hAnsi="BRH Malayalam Extra" w:cs="BRH Malayalam Extra"/>
-                <w:color w:val="000000"/>
-                <w:sz w:val="32"/>
-                <w:szCs w:val="40"/>
-              </w:rPr>
-              <w:t>-  A</w:t>
-            </w:r>
-            <w:proofErr w:type="gramEnd"/>
+              <w:t>)-  A</w:t>
+            </w:r>
             <w:r>
               <w:rPr>
                 <w:rFonts w:ascii="BRH Malayalam Extra" w:hAnsi="BRH Malayalam Extra" w:cs="BRH Malayalam Extra"/>
@@ -966,6 +3146,7 @@
                 <w:color w:val="000000"/>
                 <w:szCs w:val="40"/>
               </w:rPr>
+              <w:lastRenderedPageBreak/>
               <w:t>58</w:t>
             </w:r>
             <w:r>
@@ -1069,19 +3250,8 @@
                 <w:sz w:val="32"/>
                 <w:szCs w:val="40"/>
               </w:rPr>
-              <w:t>)</w:t>
-            </w:r>
-            <w:proofErr w:type="gramStart"/>
-            <w:r>
-              <w:rPr>
-                <w:rFonts w:ascii="BRH Malayalam Extra" w:hAnsi="BRH Malayalam Extra" w:cs="BRH Malayalam Extra"/>
-                <w:color w:val="000000"/>
-                <w:sz w:val="32"/>
-                <w:szCs w:val="40"/>
-              </w:rPr>
-              <w:t>-  C</w:t>
-            </w:r>
-            <w:proofErr w:type="gramEnd"/>
+              <w:t>)-  C</w:t>
+            </w:r>
             <w:r>
               <w:rPr>
                 <w:rFonts w:ascii="BRH Malayalam Extra" w:hAnsi="BRH Malayalam Extra" w:cs="BRH Malayalam Extra"/>
@@ -1509,19 +3679,8 @@
                 <w:sz w:val="32"/>
                 <w:szCs w:val="40"/>
               </w:rPr>
-              <w:t>)</w:t>
-            </w:r>
-            <w:proofErr w:type="gramStart"/>
-            <w:r>
-              <w:rPr>
-                <w:rFonts w:ascii="BRH Malayalam Extra" w:hAnsi="BRH Malayalam Extra" w:cs="BRH Malayalam Extra"/>
-                <w:color w:val="000000"/>
-                <w:sz w:val="32"/>
-                <w:szCs w:val="40"/>
-              </w:rPr>
-              <w:t>-  C</w:t>
-            </w:r>
-            <w:proofErr w:type="gramEnd"/>
+              <w:t>)-  C</w:t>
+            </w:r>
             <w:r>
               <w:rPr>
                 <w:rFonts w:ascii="BRH Malayalam Extra" w:hAnsi="BRH Malayalam Extra" w:cs="BRH Malayalam Extra"/>
@@ -1867,19 +4026,8 @@
                 <w:sz w:val="32"/>
                 <w:szCs w:val="40"/>
               </w:rPr>
-              <w:t>)</w:t>
-            </w:r>
-            <w:proofErr w:type="gramStart"/>
-            <w:r>
-              <w:rPr>
-                <w:rFonts w:ascii="BRH Malayalam Extra" w:hAnsi="BRH Malayalam Extra" w:cs="BRH Malayalam Extra"/>
-                <w:color w:val="000000"/>
-                <w:sz w:val="32"/>
-                <w:szCs w:val="40"/>
-              </w:rPr>
-              <w:t>-  C</w:t>
-            </w:r>
-            <w:proofErr w:type="gramEnd"/>
+              <w:t>)-  C</w:t>
+            </w:r>
             <w:r>
               <w:rPr>
                 <w:rFonts w:ascii="BRH Malayalam Extra" w:hAnsi="BRH Malayalam Extra" w:cs="BRH Malayalam Extra"/>
@@ -2256,19 +4404,8 @@
                 <w:sz w:val="32"/>
                 <w:szCs w:val="40"/>
               </w:rPr>
-              <w:t>)</w:t>
-            </w:r>
-            <w:proofErr w:type="gramStart"/>
-            <w:r>
-              <w:rPr>
-                <w:rFonts w:ascii="BRH Malayalam Extra" w:hAnsi="BRH Malayalam Extra" w:cs="BRH Malayalam Extra"/>
-                <w:color w:val="000000"/>
-                <w:sz w:val="32"/>
-                <w:szCs w:val="40"/>
-              </w:rPr>
-              <w:t>-  C</w:t>
-            </w:r>
-            <w:proofErr w:type="gramEnd"/>
+              <w:t>)-  C</w:t>
+            </w:r>
             <w:r>
               <w:rPr>
                 <w:rFonts w:ascii="BRH Malayalam Extra" w:hAnsi="BRH Malayalam Extra" w:cs="BRH Malayalam Extra"/>
@@ -2586,27 +4723,7 @@
                 <w:sz w:val="32"/>
                 <w:szCs w:val="40"/>
               </w:rPr>
-              <w:t>)</w:t>
-            </w:r>
-            <w:proofErr w:type="gramStart"/>
-            <w:r>
-              <w:rPr>
-                <w:rFonts w:ascii="BRH Malayalam Extra" w:hAnsi="BRH Malayalam Extra" w:cs="BRH Malayalam Extra"/>
-                <w:color w:val="000000"/>
-                <w:sz w:val="32"/>
-                <w:szCs w:val="40"/>
-              </w:rPr>
-              <w:t>-  CöÉx</w:t>
-            </w:r>
-            <w:proofErr w:type="gramEnd"/>
-            <w:r>
-              <w:rPr>
-                <w:rFonts w:ascii="BRH Malayalam Extra" w:hAnsi="BRH Malayalam Extra" w:cs="BRH Malayalam Extra"/>
-                <w:color w:val="000000"/>
-                <w:sz w:val="32"/>
-                <w:szCs w:val="40"/>
-              </w:rPr>
-              <w:t>—j | A</w:t>
+              <w:t>)-  CöÉx—j | A</w:t>
             </w:r>
             <w:r>
               <w:rPr>
@@ -2684,27 +4801,7 @@
                 <w:sz w:val="32"/>
                 <w:szCs w:val="40"/>
               </w:rPr>
-              <w:t>CöÉx—jx (³</w:t>
-            </w:r>
-            <w:proofErr w:type="gramStart"/>
-            <w:r>
-              <w:rPr>
-                <w:rFonts w:ascii="BRH Malayalam Extra" w:hAnsi="BRH Malayalam Extra" w:cs="BRH Malayalam Extra"/>
-                <w:color w:val="000000"/>
-                <w:sz w:val="32"/>
-                <w:szCs w:val="40"/>
-              </w:rPr>
-              <w:t>§)¥</w:t>
-            </w:r>
-            <w:proofErr w:type="gramEnd"/>
-            <w:r>
-              <w:rPr>
-                <w:rFonts w:ascii="BRH Malayalam Extra" w:hAnsi="BRH Malayalam Extra" w:cs="BRH Malayalam Extra"/>
-                <w:color w:val="000000"/>
-                <w:sz w:val="32"/>
-                <w:szCs w:val="40"/>
-              </w:rPr>
-              <w:t>tx</w:t>
+              <w:t>CöÉx—jx (³§)¥tx</w:t>
             </w:r>
             <w:r>
               <w:rPr>
@@ -2819,27 +4916,7 @@
                 <w:sz w:val="32"/>
                 <w:szCs w:val="40"/>
               </w:rPr>
-              <w:t>¥jöÉx—jx (³</w:t>
-            </w:r>
-            <w:proofErr w:type="gramStart"/>
-            <w:r>
-              <w:rPr>
-                <w:rFonts w:ascii="BRH Malayalam Extra" w:hAnsi="BRH Malayalam Extra" w:cs="BRH Malayalam Extra"/>
-                <w:color w:val="000000"/>
-                <w:sz w:val="32"/>
-                <w:szCs w:val="40"/>
-              </w:rPr>
-              <w:t>§)¥</w:t>
-            </w:r>
-            <w:proofErr w:type="gramEnd"/>
-            <w:r>
-              <w:rPr>
-                <w:rFonts w:ascii="BRH Malayalam Extra" w:hAnsi="BRH Malayalam Extra" w:cs="BRH Malayalam Extra"/>
-                <w:color w:val="000000"/>
-                <w:sz w:val="32"/>
-                <w:szCs w:val="40"/>
-              </w:rPr>
-              <w:t>tx</w:t>
+              <w:t>¥jöÉx—jx (³§)¥tx</w:t>
             </w:r>
             <w:r>
               <w:rPr>
@@ -2983,19 +5060,8 @@
                 <w:sz w:val="32"/>
                 <w:szCs w:val="40"/>
               </w:rPr>
-              <w:t>)</w:t>
-            </w:r>
-            <w:proofErr w:type="gramStart"/>
-            <w:r>
-              <w:rPr>
-                <w:rFonts w:ascii="BRH Malayalam Extra" w:hAnsi="BRH Malayalam Extra" w:cs="BRH Malayalam Extra"/>
-                <w:color w:val="000000"/>
-                <w:sz w:val="32"/>
-                <w:szCs w:val="40"/>
-              </w:rPr>
-              <w:t>-  A</w:t>
-            </w:r>
-            <w:proofErr w:type="gramEnd"/>
+              <w:t>)-  A</w:t>
+            </w:r>
             <w:r>
               <w:rPr>
                 <w:rFonts w:ascii="BRH Malayalam Extra" w:hAnsi="BRH Malayalam Extra" w:cs="BRH Malayalam Extra"/>
@@ -4166,6 +6232,7 @@
                 <w:rFonts w:cs="BRH Malayalam Extra"/>
                 <w:color w:val="000000"/>
                 <w:szCs w:val="40"/>
+                <w:lang w:val="it-IT"/>
               </w:rPr>
             </w:pPr>
           </w:p>
@@ -4195,6 +6262,7 @@
                 <w:rFonts w:cs="BRH Malayalam Extra"/>
                 <w:color w:val="000000"/>
                 <w:szCs w:val="40"/>
+                <w:lang w:val="it-IT"/>
               </w:rPr>
             </w:pPr>
           </w:p>
@@ -4218,7 +6286,6 @@
                 <w:color w:val="000000"/>
                 <w:szCs w:val="40"/>
               </w:rPr>
-              <w:lastRenderedPageBreak/>
               <w:t>21</w:t>
             </w:r>
             <w:r>
@@ -4322,19 +6389,8 @@
                 <w:sz w:val="32"/>
                 <w:szCs w:val="40"/>
               </w:rPr>
-              <w:t>)</w:t>
-            </w:r>
-            <w:proofErr w:type="gramStart"/>
-            <w:r>
-              <w:rPr>
-                <w:rFonts w:ascii="BRH Malayalam Extra" w:hAnsi="BRH Malayalam Extra" w:cs="BRH Malayalam Extra"/>
-                <w:color w:val="000000"/>
-                <w:sz w:val="32"/>
-                <w:szCs w:val="40"/>
-              </w:rPr>
-              <w:t>-  dy</w:t>
-            </w:r>
-            <w:proofErr w:type="gramEnd"/>
+              <w:t>)-  dy</w:t>
+            </w:r>
             <w:r>
               <w:rPr>
                 <w:rFonts w:ascii="BRH Malayalam Extra" w:hAnsi="BRH Malayalam Extra" w:cs="BRH Malayalam Extra"/>
@@ -4550,6 +6606,7 @@
                 <w:rFonts w:cs="BRH Malayalam Extra"/>
                 <w:color w:val="000000"/>
                 <w:szCs w:val="40"/>
+                <w:lang w:val="it-IT"/>
               </w:rPr>
             </w:pPr>
           </w:p>
@@ -4564,7 +6621,7 @@
                 <w:rFonts w:cs="BRH Malayalam Extra"/>
                 <w:color w:val="000000"/>
                 <w:szCs w:val="40"/>
-                <w:lang w:bidi="ta-IN"/>
+                <w:lang w:val="it-IT" w:bidi="ta-IN"/>
               </w:rPr>
             </w:pPr>
           </w:p>
@@ -4579,6 +6636,7 @@
                 <w:rFonts w:cs="BRH Malayalam Extra"/>
                 <w:color w:val="000000"/>
                 <w:szCs w:val="40"/>
+                <w:lang w:val="it-IT"/>
               </w:rPr>
             </w:pPr>
           </w:p>
@@ -4602,7 +6660,6 @@
                 <w:color w:val="000000"/>
                 <w:szCs w:val="40"/>
               </w:rPr>
-              <w:lastRenderedPageBreak/>
               <w:t>21</w:t>
             </w:r>
             <w:r>
@@ -4706,19 +6763,8 @@
                 <w:sz w:val="32"/>
                 <w:szCs w:val="40"/>
               </w:rPr>
-              <w:t>)</w:t>
-            </w:r>
-            <w:proofErr w:type="gramStart"/>
-            <w:r>
-              <w:rPr>
-                <w:rFonts w:ascii="BRH Malayalam Extra" w:hAnsi="BRH Malayalam Extra" w:cs="BRH Malayalam Extra"/>
-                <w:color w:val="000000"/>
-                <w:sz w:val="32"/>
-                <w:szCs w:val="40"/>
-              </w:rPr>
-              <w:t>-  dy</w:t>
-            </w:r>
-            <w:proofErr w:type="gramEnd"/>
+              <w:t>)-  dy</w:t>
+            </w:r>
             <w:r>
               <w:rPr>
                 <w:rFonts w:ascii="BRH Malayalam Extra" w:hAnsi="BRH Malayalam Extra" w:cs="BRH Malayalam Extra"/>
@@ -4750,6 +6796,7 @@
                 <w:color w:val="000000"/>
                 <w:sz w:val="32"/>
                 <w:szCs w:val="40"/>
+                <w:lang w:val="it-IT"/>
               </w:rPr>
             </w:pPr>
             <w:r>
@@ -4758,6 +6805,7 @@
                 <w:color w:val="000000"/>
                 <w:sz w:val="32"/>
                 <w:szCs w:val="40"/>
+                <w:lang w:val="it-IT"/>
               </w:rPr>
               <w:t>dy</w:t>
             </w:r>
@@ -4767,15 +6815,17 @@
                 <w:color w:val="000000"/>
                 <w:sz w:val="26"/>
                 <w:szCs w:val="40"/>
-              </w:rPr>
-              <w:t>–</w:t>
-            </w:r>
-            <w:r>
-              <w:rPr>
-                <w:rFonts w:ascii="BRH Malayalam Extra" w:hAnsi="BRH Malayalam Extra" w:cs="BRH Malayalam Extra"/>
-                <w:color w:val="000000"/>
-                <w:sz w:val="32"/>
-                <w:szCs w:val="40"/>
+                <w:lang w:val="it-IT"/>
+              </w:rPr>
+              <w:t>–</w:t>
+            </w:r>
+            <w:r>
+              <w:rPr>
+                <w:rFonts w:ascii="BRH Malayalam Extra" w:hAnsi="BRH Malayalam Extra" w:cs="BRH Malayalam Extra"/>
+                <w:color w:val="000000"/>
+                <w:sz w:val="32"/>
+                <w:szCs w:val="40"/>
+                <w:lang w:val="it-IT"/>
               </w:rPr>
               <w:t>kp—e</w:t>
             </w:r>
@@ -4785,27 +6835,19 @@
                 <w:color w:val="000000"/>
                 <w:sz w:val="26"/>
                 <w:szCs w:val="40"/>
-              </w:rPr>
-              <w:t>–</w:t>
-            </w:r>
-            <w:r>
-              <w:rPr>
-                <w:rFonts w:ascii="BRH Malayalam Extra" w:hAnsi="BRH Malayalam Extra" w:cs="BRH Malayalam Extra"/>
-                <w:color w:val="000000"/>
-                <w:sz w:val="32"/>
-                <w:szCs w:val="40"/>
-              </w:rPr>
-              <w:t>© d(³</w:t>
-            </w:r>
-            <w:proofErr w:type="gramStart"/>
-            <w:r>
-              <w:rPr>
-                <w:rFonts w:ascii="BRH Malayalam Extra" w:hAnsi="BRH Malayalam Extra" w:cs="BRH Malayalam Extra"/>
-                <w:color w:val="000000"/>
-                <w:sz w:val="32"/>
-                <w:szCs w:val="40"/>
-              </w:rPr>
-              <w:t>§)</w:t>
+                <w:lang w:val="it-IT"/>
+              </w:rPr>
+              <w:t>–</w:t>
+            </w:r>
+            <w:r>
+              <w:rPr>
+                <w:rFonts w:ascii="BRH Malayalam Extra" w:hAnsi="BRH Malayalam Extra" w:cs="BRH Malayalam Extra"/>
+                <w:color w:val="000000"/>
+                <w:sz w:val="32"/>
+                <w:szCs w:val="40"/>
+                <w:lang w:val="it-IT"/>
+              </w:rPr>
+              <w:t>© d(³§)</w:t>
             </w:r>
             <w:r>
               <w:rPr>
@@ -4814,10 +6856,10 @@
                 <w:sz w:val="32"/>
                 <w:szCs w:val="40"/>
                 <w:highlight w:val="green"/>
+                <w:lang w:val="it-IT"/>
               </w:rPr>
               <w:t>t</w:t>
             </w:r>
-            <w:proofErr w:type="gramEnd"/>
             <w:r>
               <w:rPr>
                 <w:rFonts w:ascii="BRH Malayalam Extra" w:hAnsi="BRH Malayalam Extra" w:cs="BRH Malayalam Extra"/>
@@ -4825,6 +6867,7 @@
                 <w:sz w:val="26"/>
                 <w:szCs w:val="40"/>
                 <w:highlight w:val="green"/>
+                <w:lang w:val="it-IT"/>
               </w:rPr>
               <w:t>–</w:t>
             </w:r>
@@ -4835,6 +6878,7 @@
                 <w:sz w:val="32"/>
                 <w:szCs w:val="40"/>
                 <w:highlight w:val="green"/>
+                <w:lang w:val="it-IT"/>
               </w:rPr>
               <w:t>¥sx</w:t>
             </w:r>
@@ -4844,6 +6888,7 @@
                 <w:color w:val="000000"/>
                 <w:sz w:val="32"/>
                 <w:szCs w:val="40"/>
+                <w:lang w:val="it-IT"/>
               </w:rPr>
               <w:t xml:space="preserve"> </w:t>
             </w:r>
@@ -4854,6 +6899,7 @@
                 <w:sz w:val="32"/>
                 <w:szCs w:val="40"/>
                 <w:highlight w:val="green"/>
+                <w:lang w:val="it-IT"/>
               </w:rPr>
               <w:t>„</w:t>
             </w:r>
@@ -4863,6 +6909,7 @@
                 <w:color w:val="000000"/>
                 <w:sz w:val="32"/>
                 <w:szCs w:val="40"/>
+                <w:lang w:val="it-IT"/>
               </w:rPr>
               <w:t>(³§)t—¥sx dy</w:t>
             </w:r>
@@ -4872,15 +6919,17 @@
                 <w:color w:val="000000"/>
                 <w:sz w:val="26"/>
                 <w:szCs w:val="40"/>
-              </w:rPr>
-              <w:t>–</w:t>
-            </w:r>
-            <w:r>
-              <w:rPr>
-                <w:rFonts w:ascii="BRH Malayalam Extra" w:hAnsi="BRH Malayalam Extra" w:cs="BRH Malayalam Extra"/>
-                <w:color w:val="000000"/>
-                <w:sz w:val="32"/>
-                <w:szCs w:val="40"/>
+                <w:lang w:val="it-IT"/>
+              </w:rPr>
+              <w:t>–</w:t>
+            </w:r>
+            <w:r>
+              <w:rPr>
+                <w:rFonts w:ascii="BRH Malayalam Extra" w:hAnsi="BRH Malayalam Extra" w:cs="BRH Malayalam Extra"/>
+                <w:color w:val="000000"/>
+                <w:sz w:val="32"/>
+                <w:szCs w:val="40"/>
+                <w:lang w:val="it-IT"/>
               </w:rPr>
               <w:t xml:space="preserve">kp—e© </w:t>
             </w:r>
@@ -4944,27 +6993,7 @@
                 <w:sz w:val="32"/>
                 <w:szCs w:val="40"/>
               </w:rPr>
-              <w:t>© d(³</w:t>
-            </w:r>
-            <w:proofErr w:type="gramStart"/>
-            <w:r>
-              <w:rPr>
-                <w:rFonts w:ascii="BRH Malayalam Extra" w:hAnsi="BRH Malayalam Extra" w:cs="BRH Malayalam Extra"/>
-                <w:color w:val="000000"/>
-                <w:sz w:val="32"/>
-                <w:szCs w:val="40"/>
-              </w:rPr>
-              <w:t>§)t</w:t>
-            </w:r>
-            <w:proofErr w:type="gramEnd"/>
-            <w:r>
-              <w:rPr>
-                <w:rFonts w:ascii="BRH Malayalam Extra" w:hAnsi="BRH Malayalam Extra" w:cs="BRH Malayalam Extra"/>
-                <w:color w:val="000000"/>
-                <w:sz w:val="32"/>
-                <w:szCs w:val="40"/>
-              </w:rPr>
-              <w:t>—sJ |</w:t>
+              <w:t>© d(³§)t—sJ |</w:t>
             </w:r>
             <w:r>
               <w:rPr>
@@ -5110,27 +7139,7 @@
                 <w:sz w:val="32"/>
                 <w:szCs w:val="40"/>
               </w:rPr>
-              <w:t>)</w:t>
-            </w:r>
-            <w:proofErr w:type="gramStart"/>
-            <w:r>
-              <w:rPr>
-                <w:rFonts w:ascii="BRH Malayalam Extra" w:hAnsi="BRH Malayalam Extra" w:cs="BRH Malayalam Extra"/>
-                <w:color w:val="000000"/>
-                <w:sz w:val="32"/>
-                <w:szCs w:val="40"/>
-              </w:rPr>
-              <w:t>-  CöÉx</w:t>
-            </w:r>
-            <w:proofErr w:type="gramEnd"/>
-            <w:r>
-              <w:rPr>
-                <w:rFonts w:ascii="BRH Malayalam Extra" w:hAnsi="BRH Malayalam Extra" w:cs="BRH Malayalam Extra"/>
-                <w:color w:val="000000"/>
-                <w:sz w:val="32"/>
-                <w:szCs w:val="40"/>
-              </w:rPr>
-              <w:t>—j | A</w:t>
+              <w:t>)-  CöÉx—j | A</w:t>
             </w:r>
             <w:r>
               <w:rPr>
@@ -5208,27 +7217,7 @@
                 <w:sz w:val="32"/>
                 <w:szCs w:val="40"/>
               </w:rPr>
-              <w:t>CöÉx—jx (³</w:t>
-            </w:r>
-            <w:proofErr w:type="gramStart"/>
-            <w:r>
-              <w:rPr>
-                <w:rFonts w:ascii="BRH Malayalam Extra" w:hAnsi="BRH Malayalam Extra" w:cs="BRH Malayalam Extra"/>
-                <w:color w:val="000000"/>
-                <w:sz w:val="32"/>
-                <w:szCs w:val="40"/>
-              </w:rPr>
-              <w:t>§)¥</w:t>
-            </w:r>
-            <w:proofErr w:type="gramEnd"/>
-            <w:r>
-              <w:rPr>
-                <w:rFonts w:ascii="BRH Malayalam Extra" w:hAnsi="BRH Malayalam Extra" w:cs="BRH Malayalam Extra"/>
-                <w:color w:val="000000"/>
-                <w:sz w:val="32"/>
-                <w:szCs w:val="40"/>
-              </w:rPr>
-              <w:t>tx</w:t>
+              <w:t>CöÉx—jx (³§)¥tx</w:t>
             </w:r>
             <w:r>
               <w:rPr>
@@ -5352,27 +7341,7 @@
                 <w:sz w:val="32"/>
                 <w:szCs w:val="40"/>
               </w:rPr>
-              <w:t>x—jx (³</w:t>
-            </w:r>
-            <w:proofErr w:type="gramStart"/>
-            <w:r>
-              <w:rPr>
-                <w:rFonts w:ascii="BRH Malayalam Extra" w:hAnsi="BRH Malayalam Extra" w:cs="BRH Malayalam Extra"/>
-                <w:color w:val="000000"/>
-                <w:sz w:val="32"/>
-                <w:szCs w:val="40"/>
-              </w:rPr>
-              <w:t>§)¥</w:t>
-            </w:r>
-            <w:proofErr w:type="gramEnd"/>
-            <w:r>
-              <w:rPr>
-                <w:rFonts w:ascii="BRH Malayalam Extra" w:hAnsi="BRH Malayalam Extra" w:cs="BRH Malayalam Extra"/>
-                <w:color w:val="000000"/>
-                <w:sz w:val="32"/>
-                <w:szCs w:val="40"/>
-              </w:rPr>
-              <w:t>tx</w:t>
+              <w:t>x—jx (³§)¥tx</w:t>
             </w:r>
             <w:r>
               <w:rPr>
@@ -5516,19 +7485,8 @@
                 <w:sz w:val="32"/>
                 <w:szCs w:val="40"/>
               </w:rPr>
-              <w:t>)</w:t>
-            </w:r>
-            <w:proofErr w:type="gramStart"/>
-            <w:r>
-              <w:rPr>
-                <w:rFonts w:ascii="BRH Malayalam Extra" w:hAnsi="BRH Malayalam Extra" w:cs="BRH Malayalam Extra"/>
-                <w:color w:val="000000"/>
-                <w:sz w:val="32"/>
-                <w:szCs w:val="40"/>
-              </w:rPr>
-              <w:t>-  A</w:t>
-            </w:r>
-            <w:proofErr w:type="gramEnd"/>
+              <w:t>)-  A</w:t>
+            </w:r>
             <w:r>
               <w:rPr>
                 <w:rFonts w:ascii="BRH Malayalam Extra" w:hAnsi="BRH Malayalam Extra" w:cs="BRH Malayalam Extra"/>
@@ -5730,27 +7688,7 @@
                 <w:sz w:val="32"/>
                 <w:szCs w:val="40"/>
               </w:rPr>
-              <w:t>Wxq— i(³</w:t>
-            </w:r>
-            <w:proofErr w:type="gramStart"/>
-            <w:r>
-              <w:rPr>
-                <w:rFonts w:ascii="BRH Malayalam Extra" w:hAnsi="BRH Malayalam Extra" w:cs="BRH Malayalam Extra"/>
-                <w:color w:val="000000"/>
-                <w:sz w:val="32"/>
-                <w:szCs w:val="40"/>
-              </w:rPr>
-              <w:t>§)¥</w:t>
-            </w:r>
-            <w:proofErr w:type="gramEnd"/>
-            <w:r>
-              <w:rPr>
-                <w:rFonts w:ascii="BRH Malayalam Extra" w:hAnsi="BRH Malayalam Extra" w:cs="BRH Malayalam Extra"/>
-                <w:color w:val="000000"/>
-                <w:sz w:val="32"/>
-                <w:szCs w:val="40"/>
-              </w:rPr>
-              <w:t>tx</w:t>
+              <w:t>Wxq— i(³§)¥tx</w:t>
             </w:r>
             <w:r>
               <w:rPr>
@@ -5955,27 +7893,7 @@
                 <w:sz w:val="32"/>
                 <w:szCs w:val="40"/>
               </w:rPr>
-              <w:t>)</w:t>
-            </w:r>
-            <w:proofErr w:type="gramStart"/>
-            <w:r>
-              <w:rPr>
-                <w:rFonts w:ascii="BRH Malayalam Extra" w:hAnsi="BRH Malayalam Extra" w:cs="BRH Malayalam Extra"/>
-                <w:color w:val="000000"/>
-                <w:sz w:val="32"/>
-                <w:szCs w:val="40"/>
-              </w:rPr>
-              <w:t>-  CöÉx</w:t>
-            </w:r>
-            <w:proofErr w:type="gramEnd"/>
-            <w:r>
-              <w:rPr>
-                <w:rFonts w:ascii="BRH Malayalam Extra" w:hAnsi="BRH Malayalam Extra" w:cs="BRH Malayalam Extra"/>
-                <w:color w:val="000000"/>
-                <w:sz w:val="32"/>
-                <w:szCs w:val="40"/>
-              </w:rPr>
-              <w:t>—j | A</w:t>
+              <w:t>)-  CöÉx—j | A</w:t>
             </w:r>
             <w:r>
               <w:rPr>
@@ -6053,27 +7971,7 @@
                 <w:sz w:val="32"/>
                 <w:szCs w:val="40"/>
               </w:rPr>
-              <w:t>CöÉx—jx (³</w:t>
-            </w:r>
-            <w:proofErr w:type="gramStart"/>
-            <w:r>
-              <w:rPr>
-                <w:rFonts w:ascii="BRH Malayalam Extra" w:hAnsi="BRH Malayalam Extra" w:cs="BRH Malayalam Extra"/>
-                <w:color w:val="000000"/>
-                <w:sz w:val="32"/>
-                <w:szCs w:val="40"/>
-              </w:rPr>
-              <w:t>§)¥</w:t>
-            </w:r>
-            <w:proofErr w:type="gramEnd"/>
-            <w:r>
-              <w:rPr>
-                <w:rFonts w:ascii="BRH Malayalam Extra" w:hAnsi="BRH Malayalam Extra" w:cs="BRH Malayalam Extra"/>
-                <w:color w:val="000000"/>
-                <w:sz w:val="32"/>
-                <w:szCs w:val="40"/>
-              </w:rPr>
-              <w:t>tx</w:t>
+              <w:t>CöÉx—jx (³§)¥tx</w:t>
             </w:r>
             <w:r>
               <w:rPr>
@@ -6317,19 +8215,8 @@
                 <w:sz w:val="32"/>
                 <w:szCs w:val="40"/>
               </w:rPr>
-              <w:t>)</w:t>
-            </w:r>
-            <w:proofErr w:type="gramStart"/>
-            <w:r>
-              <w:rPr>
-                <w:rFonts w:ascii="BRH Malayalam Extra" w:hAnsi="BRH Malayalam Extra" w:cs="BRH Malayalam Extra"/>
-                <w:color w:val="000000"/>
-                <w:sz w:val="32"/>
-                <w:szCs w:val="40"/>
-              </w:rPr>
-              <w:t>-  A</w:t>
-            </w:r>
-            <w:proofErr w:type="gramEnd"/>
+              <w:t>)-  A</w:t>
+            </w:r>
             <w:r>
               <w:rPr>
                 <w:rFonts w:ascii="BRH Malayalam Extra" w:hAnsi="BRH Malayalam Extra" w:cs="BRH Malayalam Extra"/>
@@ -6555,27 +8442,7 @@
                 <w:sz w:val="32"/>
                 <w:szCs w:val="40"/>
               </w:rPr>
-              <w:t>i(³</w:t>
-            </w:r>
-            <w:proofErr w:type="gramStart"/>
-            <w:r>
-              <w:rPr>
-                <w:rFonts w:ascii="BRH Malayalam Extra" w:hAnsi="BRH Malayalam Extra" w:cs="BRH Malayalam Extra"/>
-                <w:color w:val="000000"/>
-                <w:sz w:val="32"/>
-                <w:szCs w:val="40"/>
-              </w:rPr>
-              <w:t>§)¥</w:t>
-            </w:r>
-            <w:proofErr w:type="gramEnd"/>
-            <w:r>
-              <w:rPr>
-                <w:rFonts w:ascii="BRH Malayalam Extra" w:hAnsi="BRH Malayalam Extra" w:cs="BRH Malayalam Extra"/>
-                <w:color w:val="000000"/>
-                <w:sz w:val="32"/>
-                <w:szCs w:val="40"/>
-              </w:rPr>
-              <w:t>tx</w:t>
+              <w:t>i(³§)¥tx</w:t>
             </w:r>
             <w:r>
               <w:rPr>
@@ -6784,27 +8651,7 @@
                 <w:sz w:val="32"/>
                 <w:szCs w:val="40"/>
               </w:rPr>
-              <w:t>)</w:t>
-            </w:r>
-            <w:proofErr w:type="gramStart"/>
-            <w:r>
-              <w:rPr>
-                <w:rFonts w:ascii="BRH Malayalam Extra" w:hAnsi="BRH Malayalam Extra" w:cs="BRH Malayalam Extra"/>
-                <w:color w:val="000000"/>
-                <w:sz w:val="32"/>
-                <w:szCs w:val="40"/>
-              </w:rPr>
-              <w:t>-  CöÉx</w:t>
-            </w:r>
-            <w:proofErr w:type="gramEnd"/>
-            <w:r>
-              <w:rPr>
-                <w:rFonts w:ascii="BRH Malayalam Extra" w:hAnsi="BRH Malayalam Extra" w:cs="BRH Malayalam Extra"/>
-                <w:color w:val="000000"/>
-                <w:sz w:val="32"/>
-                <w:szCs w:val="40"/>
-              </w:rPr>
-              <w:t>—j | A</w:t>
+              <w:t>)-  CöÉx—j | A</w:t>
             </w:r>
             <w:r>
               <w:rPr>
@@ -6882,27 +8729,7 @@
                 <w:sz w:val="32"/>
                 <w:szCs w:val="40"/>
               </w:rPr>
-              <w:t>CöÉx—jx (³</w:t>
-            </w:r>
-            <w:proofErr w:type="gramStart"/>
-            <w:r>
-              <w:rPr>
-                <w:rFonts w:ascii="BRH Malayalam Extra" w:hAnsi="BRH Malayalam Extra" w:cs="BRH Malayalam Extra"/>
-                <w:color w:val="000000"/>
-                <w:sz w:val="32"/>
-                <w:szCs w:val="40"/>
-              </w:rPr>
-              <w:t>§)¥</w:t>
-            </w:r>
-            <w:proofErr w:type="gramEnd"/>
-            <w:r>
-              <w:rPr>
-                <w:rFonts w:ascii="BRH Malayalam Extra" w:hAnsi="BRH Malayalam Extra" w:cs="BRH Malayalam Extra"/>
-                <w:color w:val="000000"/>
-                <w:sz w:val="32"/>
-                <w:szCs w:val="40"/>
-              </w:rPr>
-              <w:t>tx</w:t>
+              <w:t>CöÉx—jx (³§)¥tx</w:t>
             </w:r>
             <w:r>
               <w:rPr>
@@ -7026,27 +8853,7 @@
                 <w:sz w:val="32"/>
                 <w:szCs w:val="40"/>
               </w:rPr>
-              <w:t>x—jx (³</w:t>
-            </w:r>
-            <w:proofErr w:type="gramStart"/>
-            <w:r>
-              <w:rPr>
-                <w:rFonts w:ascii="BRH Malayalam Extra" w:hAnsi="BRH Malayalam Extra" w:cs="BRH Malayalam Extra"/>
-                <w:color w:val="000000"/>
-                <w:sz w:val="32"/>
-                <w:szCs w:val="40"/>
-              </w:rPr>
-              <w:t>§)¥</w:t>
-            </w:r>
-            <w:proofErr w:type="gramEnd"/>
-            <w:r>
-              <w:rPr>
-                <w:rFonts w:ascii="BRH Malayalam Extra" w:hAnsi="BRH Malayalam Extra" w:cs="BRH Malayalam Extra"/>
-                <w:color w:val="000000"/>
-                <w:sz w:val="32"/>
-                <w:szCs w:val="40"/>
-              </w:rPr>
-              <w:t>tx</w:t>
+              <w:t>x—jx (³§)¥tx</w:t>
             </w:r>
             <w:r>
               <w:rPr>
@@ -7190,19 +8997,8 @@
                 <w:sz w:val="32"/>
                 <w:szCs w:val="40"/>
               </w:rPr>
-              <w:t>)</w:t>
-            </w:r>
-            <w:proofErr w:type="gramStart"/>
-            <w:r>
-              <w:rPr>
-                <w:rFonts w:ascii="BRH Malayalam Extra" w:hAnsi="BRH Malayalam Extra" w:cs="BRH Malayalam Extra"/>
-                <w:color w:val="000000"/>
-                <w:sz w:val="32"/>
-                <w:szCs w:val="40"/>
-              </w:rPr>
-              <w:t>-  A</w:t>
-            </w:r>
-            <w:proofErr w:type="gramEnd"/>
+              <w:t>)-  A</w:t>
+            </w:r>
             <w:r>
               <w:rPr>
                 <w:rFonts w:ascii="BRH Malayalam Extra" w:hAnsi="BRH Malayalam Extra" w:cs="BRH Malayalam Extra"/>
@@ -7410,27 +9206,7 @@
                 <w:sz w:val="32"/>
                 <w:szCs w:val="40"/>
               </w:rPr>
-              <w:t>Zõ(³</w:t>
-            </w:r>
-            <w:proofErr w:type="gramStart"/>
-            <w:r>
-              <w:rPr>
-                <w:rFonts w:ascii="BRH Malayalam Extra" w:hAnsi="BRH Malayalam Extra" w:cs="BRH Malayalam Extra"/>
-                <w:color w:val="000000"/>
-                <w:sz w:val="32"/>
-                <w:szCs w:val="40"/>
-              </w:rPr>
-              <w:t>§)¥</w:t>
-            </w:r>
-            <w:proofErr w:type="gramEnd"/>
-            <w:r>
-              <w:rPr>
-                <w:rFonts w:ascii="BRH Malayalam Extra" w:hAnsi="BRH Malayalam Extra" w:cs="BRH Malayalam Extra"/>
-                <w:color w:val="000000"/>
-                <w:sz w:val="32"/>
-                <w:szCs w:val="40"/>
-              </w:rPr>
-              <w:t>tx</w:t>
+              <w:t>Zõ(³§)¥tx</w:t>
             </w:r>
             <w:r>
               <w:rPr>
@@ -7635,27 +9411,7 @@
                 <w:sz w:val="32"/>
                 <w:szCs w:val="40"/>
               </w:rPr>
-              <w:t>)</w:t>
-            </w:r>
-            <w:proofErr w:type="gramStart"/>
-            <w:r>
-              <w:rPr>
-                <w:rFonts w:ascii="BRH Malayalam Extra" w:hAnsi="BRH Malayalam Extra" w:cs="BRH Malayalam Extra"/>
-                <w:color w:val="000000"/>
-                <w:sz w:val="32"/>
-                <w:szCs w:val="40"/>
-              </w:rPr>
-              <w:t>-  CöÉx</w:t>
-            </w:r>
-            <w:proofErr w:type="gramEnd"/>
-            <w:r>
-              <w:rPr>
-                <w:rFonts w:ascii="BRH Malayalam Extra" w:hAnsi="BRH Malayalam Extra" w:cs="BRH Malayalam Extra"/>
-                <w:color w:val="000000"/>
-                <w:sz w:val="32"/>
-                <w:szCs w:val="40"/>
-              </w:rPr>
-              <w:t>—j | A</w:t>
+              <w:t>)-  CöÉx—j | A</w:t>
             </w:r>
             <w:r>
               <w:rPr>
@@ -7733,27 +9489,7 @@
                 <w:sz w:val="32"/>
                 <w:szCs w:val="40"/>
               </w:rPr>
-              <w:t>CöÉx—jx (³</w:t>
-            </w:r>
-            <w:proofErr w:type="gramStart"/>
-            <w:r>
-              <w:rPr>
-                <w:rFonts w:ascii="BRH Malayalam Extra" w:hAnsi="BRH Malayalam Extra" w:cs="BRH Malayalam Extra"/>
-                <w:color w:val="000000"/>
-                <w:sz w:val="32"/>
-                <w:szCs w:val="40"/>
-              </w:rPr>
-              <w:t>§)¥</w:t>
-            </w:r>
-            <w:proofErr w:type="gramEnd"/>
-            <w:r>
-              <w:rPr>
-                <w:rFonts w:ascii="BRH Malayalam Extra" w:hAnsi="BRH Malayalam Extra" w:cs="BRH Malayalam Extra"/>
-                <w:color w:val="000000"/>
-                <w:sz w:val="32"/>
-                <w:szCs w:val="40"/>
-              </w:rPr>
-              <w:t>tx</w:t>
+              <w:t>CöÉx—jx (³§)¥tx</w:t>
             </w:r>
             <w:r>
               <w:rPr>
@@ -7877,27 +9613,7 @@
                 <w:sz w:val="32"/>
                 <w:szCs w:val="40"/>
               </w:rPr>
-              <w:t>x—jx (³</w:t>
-            </w:r>
-            <w:proofErr w:type="gramStart"/>
-            <w:r>
-              <w:rPr>
-                <w:rFonts w:ascii="BRH Malayalam Extra" w:hAnsi="BRH Malayalam Extra" w:cs="BRH Malayalam Extra"/>
-                <w:color w:val="000000"/>
-                <w:sz w:val="32"/>
-                <w:szCs w:val="40"/>
-              </w:rPr>
-              <w:t>§)¥</w:t>
-            </w:r>
-            <w:proofErr w:type="gramEnd"/>
-            <w:r>
-              <w:rPr>
-                <w:rFonts w:ascii="BRH Malayalam Extra" w:hAnsi="BRH Malayalam Extra" w:cs="BRH Malayalam Extra"/>
-                <w:color w:val="000000"/>
-                <w:sz w:val="32"/>
-                <w:szCs w:val="40"/>
-              </w:rPr>
-              <w:t>tx</w:t>
+              <w:t>x—jx (³§)¥tx</w:t>
             </w:r>
             <w:r>
               <w:rPr>
@@ -8041,19 +9757,8 @@
                 <w:sz w:val="32"/>
                 <w:szCs w:val="40"/>
               </w:rPr>
-              <w:t>)</w:t>
-            </w:r>
-            <w:proofErr w:type="gramStart"/>
-            <w:r>
-              <w:rPr>
-                <w:rFonts w:ascii="BRH Malayalam Extra" w:hAnsi="BRH Malayalam Extra" w:cs="BRH Malayalam Extra"/>
-                <w:color w:val="000000"/>
-                <w:sz w:val="32"/>
-                <w:szCs w:val="40"/>
-              </w:rPr>
-              <w:t>-  A</w:t>
-            </w:r>
-            <w:proofErr w:type="gramEnd"/>
+              <w:t>)-  A</w:t>
+            </w:r>
             <w:r>
               <w:rPr>
                 <w:rFonts w:ascii="BRH Malayalam Extra" w:hAnsi="BRH Malayalam Extra" w:cs="BRH Malayalam Extra"/>
@@ -8261,27 +9966,7 @@
                 <w:sz w:val="32"/>
                 <w:szCs w:val="40"/>
               </w:rPr>
-              <w:t>Zõ(³</w:t>
-            </w:r>
-            <w:proofErr w:type="gramStart"/>
-            <w:r>
-              <w:rPr>
-                <w:rFonts w:ascii="BRH Malayalam Extra" w:hAnsi="BRH Malayalam Extra" w:cs="BRH Malayalam Extra"/>
-                <w:color w:val="000000"/>
-                <w:sz w:val="32"/>
-                <w:szCs w:val="40"/>
-              </w:rPr>
-              <w:t>§)¥</w:t>
-            </w:r>
-            <w:proofErr w:type="gramEnd"/>
-            <w:r>
-              <w:rPr>
-                <w:rFonts w:ascii="BRH Malayalam Extra" w:hAnsi="BRH Malayalam Extra" w:cs="BRH Malayalam Extra"/>
-                <w:color w:val="000000"/>
-                <w:sz w:val="32"/>
-                <w:szCs w:val="40"/>
-              </w:rPr>
-              <w:t>tx</w:t>
+              <w:t>Zõ(³§)¥tx</w:t>
             </w:r>
             <w:r>
               <w:rPr>
@@ -8387,7 +10072,6 @@
                 <w:color w:val="000000"/>
                 <w:szCs w:val="40"/>
               </w:rPr>
-              <w:lastRenderedPageBreak/>
               <w:t>8</w:t>
             </w:r>
             <w:r>
@@ -8491,19 +10175,8 @@
                 <w:sz w:val="32"/>
                 <w:szCs w:val="40"/>
               </w:rPr>
-              <w:t>)</w:t>
-            </w:r>
-            <w:proofErr w:type="gramStart"/>
-            <w:r>
-              <w:rPr>
-                <w:rFonts w:ascii="BRH Malayalam Extra" w:hAnsi="BRH Malayalam Extra" w:cs="BRH Malayalam Extra"/>
-                <w:color w:val="000000"/>
-                <w:sz w:val="32"/>
-                <w:szCs w:val="40"/>
-              </w:rPr>
-              <w:t>-  s</w:t>
-            </w:r>
-            <w:proofErr w:type="gramEnd"/>
+              <w:t>)-  s</w:t>
+            </w:r>
             <w:r>
               <w:rPr>
                 <w:rFonts w:ascii="BRH Malayalam Extra" w:hAnsi="BRH Malayalam Extra" w:cs="BRH Malayalam Extra"/>
@@ -8793,19 +10466,8 @@
                 <w:sz w:val="32"/>
                 <w:szCs w:val="40"/>
               </w:rPr>
-              <w:t>)</w:t>
-            </w:r>
-            <w:proofErr w:type="gramStart"/>
-            <w:r>
-              <w:rPr>
-                <w:rFonts w:ascii="BRH Malayalam Extra" w:hAnsi="BRH Malayalam Extra" w:cs="BRH Malayalam Extra"/>
-                <w:color w:val="000000"/>
-                <w:sz w:val="32"/>
-                <w:szCs w:val="40"/>
-              </w:rPr>
-              <w:t>-  s</w:t>
-            </w:r>
-            <w:proofErr w:type="gramEnd"/>
+              <w:t>)-  s</w:t>
+            </w:r>
             <w:r>
               <w:rPr>
                 <w:rFonts w:ascii="BRH Malayalam Extra" w:hAnsi="BRH Malayalam Extra" w:cs="BRH Malayalam Extra"/>
@@ -8996,6 +10658,7 @@
                 <w:color w:val="000000"/>
                 <w:szCs w:val="40"/>
               </w:rPr>
+              <w:lastRenderedPageBreak/>
               <w:t>37</w:t>
             </w:r>
             <w:r>
@@ -9099,27 +10762,7 @@
                 <w:sz w:val="32"/>
                 <w:szCs w:val="40"/>
               </w:rPr>
-              <w:t>)</w:t>
-            </w:r>
-            <w:proofErr w:type="gramStart"/>
-            <w:r>
-              <w:rPr>
-                <w:rFonts w:ascii="BRH Malayalam Extra" w:hAnsi="BRH Malayalam Extra" w:cs="BRH Malayalam Extra"/>
-                <w:color w:val="000000"/>
-                <w:sz w:val="32"/>
-                <w:szCs w:val="40"/>
-              </w:rPr>
-              <w:t>-  ¥</w:t>
-            </w:r>
-            <w:proofErr w:type="gramEnd"/>
-            <w:r>
-              <w:rPr>
-                <w:rFonts w:ascii="BRH Malayalam Extra" w:hAnsi="BRH Malayalam Extra" w:cs="BRH Malayalam Extra"/>
-                <w:color w:val="000000"/>
-                <w:sz w:val="32"/>
-                <w:szCs w:val="40"/>
-              </w:rPr>
-              <w:t>c</w:t>
+              <w:t>)-  ¥c</w:t>
             </w:r>
             <w:r>
               <w:rPr>
@@ -9468,27 +11111,7 @@
                 <w:sz w:val="32"/>
                 <w:szCs w:val="40"/>
               </w:rPr>
-              <w:t>)</w:t>
-            </w:r>
-            <w:proofErr w:type="gramStart"/>
-            <w:r>
-              <w:rPr>
-                <w:rFonts w:ascii="BRH Malayalam Extra" w:hAnsi="BRH Malayalam Extra" w:cs="BRH Malayalam Extra"/>
-                <w:color w:val="000000"/>
-                <w:sz w:val="32"/>
-                <w:szCs w:val="40"/>
-              </w:rPr>
-              <w:t>-  öqrç</w:t>
-            </w:r>
-            <w:proofErr w:type="gramEnd"/>
-            <w:r>
-              <w:rPr>
-                <w:rFonts w:ascii="BRH Malayalam Extra" w:hAnsi="BRH Malayalam Extra" w:cs="BRH Malayalam Extra"/>
-                <w:color w:val="000000"/>
-                <w:sz w:val="32"/>
-                <w:szCs w:val="40"/>
-              </w:rPr>
-              <w:t>§jx˜Z§ | e</w:t>
+              <w:t>)-  öqrç§jx˜Z§ | e</w:t>
             </w:r>
             <w:r>
               <w:rPr>
@@ -9780,27 +11403,7 @@
                 <w:sz w:val="32"/>
                 <w:szCs w:val="40"/>
               </w:rPr>
-              <w:t>)</w:t>
-            </w:r>
-            <w:proofErr w:type="gramStart"/>
-            <w:r>
-              <w:rPr>
-                <w:rFonts w:ascii="BRH Malayalam Extra" w:hAnsi="BRH Malayalam Extra" w:cs="BRH Malayalam Extra"/>
-                <w:color w:val="000000"/>
-                <w:sz w:val="32"/>
-                <w:szCs w:val="40"/>
-              </w:rPr>
-              <w:t>-  ¥</w:t>
-            </w:r>
-            <w:proofErr w:type="gramEnd"/>
-            <w:r>
-              <w:rPr>
-                <w:rFonts w:ascii="BRH Malayalam Extra" w:hAnsi="BRH Malayalam Extra" w:cs="BRH Malayalam Extra"/>
-                <w:color w:val="000000"/>
-                <w:sz w:val="32"/>
-                <w:szCs w:val="40"/>
-              </w:rPr>
-              <w:t>c</w:t>
+              <w:t>)-  ¥c</w:t>
             </w:r>
             <w:r>
               <w:rPr>
@@ -10157,17 +11760,7 @@
                 <w:sz w:val="32"/>
                 <w:szCs w:val="40"/>
               </w:rPr>
-              <w:t>)</w:t>
-            </w:r>
-            <w:proofErr w:type="gramStart"/>
-            <w:r>
-              <w:rPr>
-                <w:rFonts w:ascii="BRH Malayalam Extra" w:hAnsi="BRH Malayalam Extra" w:cs="BRH Malayalam Extra"/>
-                <w:color w:val="000000"/>
-                <w:sz w:val="32"/>
-                <w:szCs w:val="40"/>
-              </w:rPr>
-              <w:t xml:space="preserve">-  </w:t>
+              <w:t xml:space="preserve">)-  </w:t>
             </w:r>
             <w:r>
               <w:rPr>
@@ -10177,18 +11770,7 @@
                 <w:szCs w:val="32"/>
                 <w:lang w:bidi="hi-IN"/>
               </w:rPr>
-              <w:t>¤</w:t>
-            </w:r>
-            <w:proofErr w:type="gramEnd"/>
-            <w:r>
-              <w:rPr>
-                <w:rFonts w:ascii="BRH Malayalam" w:hAnsi="BRH Malayalam" w:cs="BRH Malayalam"/>
-                <w:color w:val="000000"/>
-                <w:sz w:val="32"/>
-                <w:szCs w:val="32"/>
-                <w:lang w:bidi="hi-IN"/>
-              </w:rPr>
-              <w:t>¤</w:t>
+              <w:t>¤¤</w:t>
             </w:r>
             <w:r>
               <w:rPr>
@@ -10494,19 +12076,8 @@
                 <w:sz w:val="32"/>
                 <w:szCs w:val="40"/>
               </w:rPr>
-              <w:t>)</w:t>
-            </w:r>
-            <w:proofErr w:type="gramStart"/>
-            <w:r>
-              <w:rPr>
-                <w:rFonts w:ascii="BRH Malayalam Extra" w:hAnsi="BRH Malayalam Extra" w:cs="BRH Malayalam Extra"/>
-                <w:color w:val="000000"/>
-                <w:sz w:val="32"/>
-                <w:szCs w:val="40"/>
-              </w:rPr>
-              <w:t>-  px</w:t>
-            </w:r>
-            <w:proofErr w:type="gramEnd"/>
+              <w:t>)-  px</w:t>
+            </w:r>
             <w:r>
               <w:rPr>
                 <w:rFonts w:ascii="BRH Malayalam Extra" w:hAnsi="BRH Malayalam Extra" w:cs="BRH Malayalam Extra"/>
@@ -10582,19 +12153,8 @@
                 <w:sz w:val="32"/>
                 <w:szCs w:val="40"/>
               </w:rPr>
-              <w:t xml:space="preserve">b§ </w:t>
-            </w:r>
-            <w:proofErr w:type="gramStart"/>
-            <w:r>
-              <w:rPr>
-                <w:rFonts w:ascii="BRH Malayalam Extra" w:hAnsi="BRH Malayalam Extra" w:cs="BRH Malayalam Extra"/>
-                <w:color w:val="000000"/>
-                <w:sz w:val="32"/>
-                <w:szCs w:val="40"/>
-              </w:rPr>
-              <w:t>pª.r</w:t>
-            </w:r>
-            <w:proofErr w:type="gramEnd"/>
+              <w:t>b§ pª.r</w:t>
+            </w:r>
             <w:r>
               <w:rPr>
                 <w:rFonts w:ascii="BRH Malayalam Extra" w:hAnsi="BRH Malayalam Extra" w:cs="BRH Malayalam Extra"/>
@@ -10629,19 +12189,8 @@
                 <w:sz w:val="32"/>
                 <w:szCs w:val="40"/>
               </w:rPr>
-              <w:t xml:space="preserve">. </w:t>
-            </w:r>
-            <w:proofErr w:type="gramStart"/>
-            <w:r>
-              <w:rPr>
-                <w:rFonts w:ascii="BRH Malayalam Extra" w:hAnsi="BRH Malayalam Extra" w:cs="BRH Malayalam Extra"/>
-                <w:color w:val="000000"/>
-                <w:sz w:val="32"/>
-                <w:szCs w:val="40"/>
-              </w:rPr>
-              <w:t>pª.r</w:t>
-            </w:r>
-            <w:proofErr w:type="gramEnd"/>
+              <w:t>. pª.r</w:t>
+            </w:r>
             <w:r>
               <w:rPr>
                 <w:rFonts w:ascii="BRH Malayalam Extra" w:hAnsi="BRH Malayalam Extra" w:cs="BRH Malayalam Extra"/>
@@ -10713,27 +12262,7 @@
                 <w:sz w:val="32"/>
                 <w:szCs w:val="40"/>
               </w:rPr>
-              <w:t xml:space="preserve">b§ </w:t>
-            </w:r>
-            <w:proofErr w:type="gramStart"/>
-            <w:r>
-              <w:rPr>
-                <w:rFonts w:ascii="BRH Malayalam Extra" w:hAnsi="BRH Malayalam Extra" w:cs="BRH Malayalam Extra"/>
-                <w:color w:val="000000"/>
-                <w:sz w:val="32"/>
-                <w:szCs w:val="40"/>
-              </w:rPr>
-              <w:t>pª.rË</w:t>
-            </w:r>
-            <w:proofErr w:type="gramEnd"/>
-            <w:r>
-              <w:rPr>
-                <w:rFonts w:ascii="BRH Malayalam Extra" w:hAnsi="BRH Malayalam Extra" w:cs="BRH Malayalam Extra"/>
-                <w:color w:val="000000"/>
-                <w:sz w:val="32"/>
-                <w:szCs w:val="40"/>
-              </w:rPr>
-              <w:t xml:space="preserve">§— | </w:t>
+              <w:t xml:space="preserve">b§ pª.rË§— | </w:t>
             </w:r>
           </w:p>
         </w:tc>
@@ -10865,19 +12394,8 @@
                 <w:sz w:val="32"/>
                 <w:szCs w:val="40"/>
               </w:rPr>
-              <w:t>)</w:t>
-            </w:r>
-            <w:proofErr w:type="gramStart"/>
-            <w:r>
-              <w:rPr>
-                <w:rFonts w:ascii="BRH Malayalam Extra" w:hAnsi="BRH Malayalam Extra" w:cs="BRH Malayalam Extra"/>
-                <w:color w:val="000000"/>
-                <w:sz w:val="32"/>
-                <w:szCs w:val="40"/>
-              </w:rPr>
-              <w:t>-  px</w:t>
-            </w:r>
-            <w:proofErr w:type="gramEnd"/>
+              <w:t>)-  px</w:t>
+            </w:r>
             <w:r>
               <w:rPr>
                 <w:rFonts w:ascii="BRH Malayalam Extra" w:hAnsi="BRH Malayalam Extra" w:cs="BRH Malayalam Extra"/>
@@ -10953,19 +12471,8 @@
                 <w:sz w:val="32"/>
                 <w:szCs w:val="40"/>
               </w:rPr>
-              <w:t xml:space="preserve">b§ </w:t>
-            </w:r>
-            <w:proofErr w:type="gramStart"/>
-            <w:r>
-              <w:rPr>
-                <w:rFonts w:ascii="BRH Malayalam Extra" w:hAnsi="BRH Malayalam Extra" w:cs="BRH Malayalam Extra"/>
-                <w:color w:val="000000"/>
-                <w:sz w:val="32"/>
-                <w:szCs w:val="40"/>
-              </w:rPr>
-              <w:t>pª.r</w:t>
-            </w:r>
-            <w:proofErr w:type="gramEnd"/>
+              <w:t>b§ pª.r</w:t>
+            </w:r>
             <w:r>
               <w:rPr>
                 <w:rFonts w:ascii="BRH Malayalam Extra" w:hAnsi="BRH Malayalam Extra" w:cs="BRH Malayalam Extra"/>
@@ -11000,17 +12507,7 @@
                 <w:sz w:val="32"/>
                 <w:szCs w:val="40"/>
               </w:rPr>
-              <w:t xml:space="preserve">. </w:t>
-            </w:r>
-            <w:proofErr w:type="gramStart"/>
-            <w:r>
-              <w:rPr>
-                <w:rFonts w:ascii="BRH Malayalam Extra" w:hAnsi="BRH Malayalam Extra" w:cs="BRH Malayalam Extra"/>
-                <w:color w:val="000000"/>
-                <w:sz w:val="32"/>
-                <w:szCs w:val="40"/>
-              </w:rPr>
-              <w:t>pª.</w:t>
+              <w:t>. pª.</w:t>
             </w:r>
             <w:r>
               <w:rPr>
@@ -11020,18 +12517,7 @@
                 <w:szCs w:val="40"/>
                 <w:highlight w:val="green"/>
               </w:rPr>
-              <w:t>r</w:t>
-            </w:r>
-            <w:proofErr w:type="gramEnd"/>
-            <w:r>
-              <w:rPr>
-                <w:rFonts w:ascii="BRH Malayalam Extra" w:hAnsi="BRH Malayalam Extra" w:cs="BRH Malayalam Extra"/>
-                <w:color w:val="000000"/>
-                <w:sz w:val="32"/>
-                <w:szCs w:val="40"/>
-                <w:highlight w:val="green"/>
-              </w:rPr>
-              <w:t>—©.</w:t>
+              <w:t>r—©.</w:t>
             </w:r>
             <w:r>
               <w:rPr>
@@ -11094,27 +12580,7 @@
                 <w:sz w:val="32"/>
                 <w:szCs w:val="40"/>
               </w:rPr>
-              <w:t xml:space="preserve">b§ </w:t>
-            </w:r>
-            <w:proofErr w:type="gramStart"/>
-            <w:r>
-              <w:rPr>
-                <w:rFonts w:ascii="BRH Malayalam Extra" w:hAnsi="BRH Malayalam Extra" w:cs="BRH Malayalam Extra"/>
-                <w:color w:val="000000"/>
-                <w:sz w:val="32"/>
-                <w:szCs w:val="40"/>
-              </w:rPr>
-              <w:t>pª.rË</w:t>
-            </w:r>
-            <w:proofErr w:type="gramEnd"/>
-            <w:r>
-              <w:rPr>
-                <w:rFonts w:ascii="BRH Malayalam Extra" w:hAnsi="BRH Malayalam Extra" w:cs="BRH Malayalam Extra"/>
-                <w:color w:val="000000"/>
-                <w:sz w:val="32"/>
-                <w:szCs w:val="40"/>
-              </w:rPr>
-              <w:t xml:space="preserve">§— | </w:t>
+              <w:t xml:space="preserve">b§ pª.rË§— | </w:t>
             </w:r>
           </w:p>
         </w:tc>
@@ -11250,27 +12716,7 @@
                 <w:sz w:val="32"/>
                 <w:szCs w:val="40"/>
               </w:rPr>
-              <w:t>)</w:t>
-            </w:r>
-            <w:proofErr w:type="gramStart"/>
-            <w:r>
-              <w:rPr>
-                <w:rFonts w:ascii="BRH Malayalam Extra" w:hAnsi="BRH Malayalam Extra" w:cs="BRH Malayalam Extra"/>
-                <w:color w:val="000000"/>
-                <w:sz w:val="32"/>
-                <w:szCs w:val="40"/>
-              </w:rPr>
-              <w:t>-  ¤</w:t>
-            </w:r>
-            <w:proofErr w:type="gramEnd"/>
-            <w:r>
-              <w:rPr>
-                <w:rFonts w:ascii="BRH Malayalam Extra" w:hAnsi="BRH Malayalam Extra" w:cs="BRH Malayalam Extra"/>
-                <w:color w:val="000000"/>
-                <w:sz w:val="32"/>
-                <w:szCs w:val="40"/>
-              </w:rPr>
-              <w:t>¤p | Bt¡—</w:t>
+              <w:t>)-  ¤¤p | Bt¡—</w:t>
             </w:r>
             <w:r>
               <w:rPr>
@@ -11532,27 +12978,7 @@
                 <w:sz w:val="32"/>
                 <w:szCs w:val="40"/>
               </w:rPr>
-              <w:t>)</w:t>
-            </w:r>
-            <w:proofErr w:type="gramStart"/>
-            <w:r>
-              <w:rPr>
-                <w:rFonts w:ascii="BRH Malayalam Extra" w:hAnsi="BRH Malayalam Extra" w:cs="BRH Malayalam Extra"/>
-                <w:color w:val="000000"/>
-                <w:sz w:val="32"/>
-                <w:szCs w:val="40"/>
-              </w:rPr>
-              <w:t>-  Bt</w:t>
-            </w:r>
-            <w:proofErr w:type="gramEnd"/>
-            <w:r>
-              <w:rPr>
-                <w:rFonts w:ascii="BRH Malayalam Extra" w:hAnsi="BRH Malayalam Extra" w:cs="BRH Malayalam Extra"/>
-                <w:color w:val="000000"/>
-                <w:sz w:val="32"/>
-                <w:szCs w:val="40"/>
-              </w:rPr>
-              <w:t>¡—Z</w:t>
+              <w:t>)-  Bt¡—Z</w:t>
             </w:r>
             <w:r>
               <w:rPr>
@@ -11859,27 +13285,7 @@
                 <w:sz w:val="32"/>
                 <w:szCs w:val="40"/>
               </w:rPr>
-              <w:t>)</w:t>
-            </w:r>
-            <w:proofErr w:type="gramStart"/>
-            <w:r>
-              <w:rPr>
-                <w:rFonts w:ascii="BRH Malayalam Extra" w:hAnsi="BRH Malayalam Extra" w:cs="BRH Malayalam Extra"/>
-                <w:color w:val="000000"/>
-                <w:sz w:val="32"/>
-                <w:szCs w:val="40"/>
-              </w:rPr>
-              <w:t>-  Bt</w:t>
-            </w:r>
-            <w:proofErr w:type="gramEnd"/>
-            <w:r>
-              <w:rPr>
-                <w:rFonts w:ascii="BRH Malayalam Extra" w:hAnsi="BRH Malayalam Extra" w:cs="BRH Malayalam Extra"/>
-                <w:color w:val="000000"/>
-                <w:sz w:val="32"/>
-                <w:szCs w:val="40"/>
-              </w:rPr>
-              <w:t>¡—Z</w:t>
+              <w:t>)-  Bt¡—Z</w:t>
             </w:r>
             <w:r>
               <w:rPr>
@@ -12107,27 +13513,7 @@
                 <w:sz w:val="32"/>
                 <w:szCs w:val="40"/>
               </w:rPr>
-              <w:t>)</w:t>
-            </w:r>
-            <w:proofErr w:type="gramStart"/>
-            <w:r>
-              <w:rPr>
-                <w:rFonts w:ascii="BRH Malayalam Extra" w:hAnsi="BRH Malayalam Extra" w:cs="BRH Malayalam Extra"/>
-                <w:color w:val="000000"/>
-                <w:sz w:val="32"/>
-                <w:szCs w:val="40"/>
-              </w:rPr>
-              <w:t>-  ¤</w:t>
-            </w:r>
-            <w:proofErr w:type="gramEnd"/>
-            <w:r>
-              <w:rPr>
-                <w:rFonts w:ascii="BRH Malayalam Extra" w:hAnsi="BRH Malayalam Extra" w:cs="BRH Malayalam Extra"/>
-                <w:color w:val="000000"/>
-                <w:sz w:val="32"/>
-                <w:szCs w:val="40"/>
-              </w:rPr>
-              <w:t>¤p | Bt¡—</w:t>
+              <w:t>)-  ¤¤p | Bt¡—</w:t>
             </w:r>
             <w:r>
               <w:rPr>
@@ -12381,27 +13767,7 @@
                 <w:sz w:val="32"/>
                 <w:szCs w:val="40"/>
               </w:rPr>
-              <w:t>)</w:t>
-            </w:r>
-            <w:proofErr w:type="gramStart"/>
-            <w:r>
-              <w:rPr>
-                <w:rFonts w:ascii="BRH Malayalam Extra" w:hAnsi="BRH Malayalam Extra" w:cs="BRH Malayalam Extra"/>
-                <w:color w:val="000000"/>
-                <w:sz w:val="32"/>
-                <w:szCs w:val="40"/>
-              </w:rPr>
-              <w:t>-  Bt</w:t>
-            </w:r>
-            <w:proofErr w:type="gramEnd"/>
-            <w:r>
-              <w:rPr>
-                <w:rFonts w:ascii="BRH Malayalam Extra" w:hAnsi="BRH Malayalam Extra" w:cs="BRH Malayalam Extra"/>
-                <w:color w:val="000000"/>
-                <w:sz w:val="32"/>
-                <w:szCs w:val="40"/>
-              </w:rPr>
-              <w:t>¡—Z</w:t>
+              <w:t>)-  Bt¡—Z</w:t>
             </w:r>
             <w:r>
               <w:rPr>
@@ -12709,27 +14075,7 @@
                 <w:sz w:val="32"/>
                 <w:szCs w:val="40"/>
               </w:rPr>
-              <w:t>)</w:t>
-            </w:r>
-            <w:proofErr w:type="gramStart"/>
-            <w:r>
-              <w:rPr>
-                <w:rFonts w:ascii="BRH Malayalam Extra" w:hAnsi="BRH Malayalam Extra" w:cs="BRH Malayalam Extra"/>
-                <w:color w:val="000000"/>
-                <w:sz w:val="32"/>
-                <w:szCs w:val="40"/>
-              </w:rPr>
-              <w:t>-  Bt</w:t>
-            </w:r>
-            <w:proofErr w:type="gramEnd"/>
-            <w:r>
-              <w:rPr>
-                <w:rFonts w:ascii="BRH Malayalam Extra" w:hAnsi="BRH Malayalam Extra" w:cs="BRH Malayalam Extra"/>
-                <w:color w:val="000000"/>
-                <w:sz w:val="32"/>
-                <w:szCs w:val="40"/>
-              </w:rPr>
-              <w:t>¡—Z</w:t>
+              <w:t>)-  Bt¡—Z</w:t>
             </w:r>
             <w:r>
               <w:rPr>
@@ -12858,7 +14204,6 @@
                 <w:color w:val="000000"/>
                 <w:szCs w:val="40"/>
               </w:rPr>
-              <w:lastRenderedPageBreak/>
               <w:t>30</w:t>
             </w:r>
             <w:r>
@@ -12962,27 +14307,7 @@
                 <w:sz w:val="32"/>
                 <w:szCs w:val="40"/>
               </w:rPr>
-              <w:t>)</w:t>
-            </w:r>
-            <w:proofErr w:type="gramStart"/>
-            <w:r>
-              <w:rPr>
-                <w:rFonts w:ascii="BRH Malayalam Extra" w:hAnsi="BRH Malayalam Extra" w:cs="BRH Malayalam Extra"/>
-                <w:color w:val="000000"/>
-                <w:sz w:val="32"/>
-                <w:szCs w:val="40"/>
-              </w:rPr>
-              <w:t>-  Ap</w:t>
-            </w:r>
-            <w:proofErr w:type="gramEnd"/>
-            <w:r>
-              <w:rPr>
-                <w:rFonts w:ascii="BRH Malayalam Extra" w:hAnsi="BRH Malayalam Extra" w:cs="BRH Malayalam Extra"/>
-                <w:color w:val="000000"/>
-                <w:sz w:val="32"/>
-                <w:szCs w:val="40"/>
-              </w:rPr>
-              <w:t xml:space="preserve">—k¡¤¤Æõ || </w:t>
+              <w:t xml:space="preserve">)-  Ap—k¡¤¤Æõ || </w:t>
             </w:r>
           </w:p>
           <w:p>
@@ -13202,27 +14527,7 @@
                 <w:sz w:val="32"/>
                 <w:szCs w:val="40"/>
               </w:rPr>
-              <w:t>)</w:t>
-            </w:r>
-            <w:proofErr w:type="gramStart"/>
-            <w:r>
-              <w:rPr>
-                <w:rFonts w:ascii="BRH Malayalam Extra" w:hAnsi="BRH Malayalam Extra" w:cs="BRH Malayalam Extra"/>
-                <w:color w:val="000000"/>
-                <w:sz w:val="32"/>
-                <w:szCs w:val="40"/>
-              </w:rPr>
-              <w:t>-  Ap</w:t>
-            </w:r>
-            <w:proofErr w:type="gramEnd"/>
-            <w:r>
-              <w:rPr>
-                <w:rFonts w:ascii="BRH Malayalam Extra" w:hAnsi="BRH Malayalam Extra" w:cs="BRH Malayalam Extra"/>
-                <w:color w:val="000000"/>
-                <w:sz w:val="32"/>
-                <w:szCs w:val="40"/>
-              </w:rPr>
-              <w:t xml:space="preserve">—k¡¤¤Æõ || </w:t>
+              <w:t xml:space="preserve">)-  Ap—k¡¤¤Æõ || </w:t>
             </w:r>
           </w:p>
           <w:p>
@@ -13353,6 +14658,7 @@
                 <w:color w:val="000000"/>
                 <w:szCs w:val="40"/>
               </w:rPr>
+              <w:lastRenderedPageBreak/>
               <w:t>32</w:t>
             </w:r>
             <w:r>
@@ -13456,19 +14762,8 @@
                 <w:sz w:val="32"/>
                 <w:szCs w:val="40"/>
               </w:rPr>
-              <w:t>)</w:t>
-            </w:r>
-            <w:proofErr w:type="gramStart"/>
-            <w:r>
-              <w:rPr>
-                <w:rFonts w:ascii="BRH Malayalam Extra" w:hAnsi="BRH Malayalam Extra" w:cs="BRH Malayalam Extra"/>
-                <w:color w:val="000000"/>
-                <w:sz w:val="32"/>
-                <w:szCs w:val="40"/>
-              </w:rPr>
-              <w:t>-  B</w:t>
-            </w:r>
-            <w:proofErr w:type="gramEnd"/>
+              <w:t>)-  B</w:t>
+            </w:r>
             <w:r>
               <w:rPr>
                 <w:rFonts w:ascii="BRH Malayalam Extra" w:hAnsi="BRH Malayalam Extra" w:cs="BRH Malayalam Extra"/>
@@ -13788,27 +15083,7 @@
                 <w:sz w:val="32"/>
                 <w:szCs w:val="40"/>
               </w:rPr>
-              <w:t>)</w:t>
-            </w:r>
-            <w:proofErr w:type="gramStart"/>
-            <w:r>
-              <w:rPr>
-                <w:rFonts w:ascii="BRH Malayalam Extra" w:hAnsi="BRH Malayalam Extra" w:cs="BRH Malayalam Extra"/>
-                <w:color w:val="000000"/>
-                <w:sz w:val="32"/>
-                <w:szCs w:val="40"/>
-              </w:rPr>
-              <w:t>-  dõO</w:t>
-            </w:r>
-            <w:proofErr w:type="gramEnd"/>
-            <w:r>
-              <w:rPr>
-                <w:rFonts w:ascii="BRH Malayalam Extra" w:hAnsi="BRH Malayalam Extra" w:cs="BRH Malayalam Extra"/>
-                <w:color w:val="000000"/>
-                <w:sz w:val="32"/>
-                <w:szCs w:val="40"/>
-              </w:rPr>
-              <w:t>§— | k</w:t>
+              <w:t>)-  dõO§— | k</w:t>
             </w:r>
             <w:r>
               <w:rPr>
@@ -14098,19 +15373,8 @@
                 <w:sz w:val="32"/>
                 <w:szCs w:val="40"/>
               </w:rPr>
-              <w:t>)</w:t>
-            </w:r>
-            <w:proofErr w:type="gramStart"/>
-            <w:r>
-              <w:rPr>
-                <w:rFonts w:ascii="BRH Malayalam Extra" w:hAnsi="BRH Malayalam Extra" w:cs="BRH Malayalam Extra"/>
-                <w:color w:val="000000"/>
-                <w:sz w:val="32"/>
-                <w:szCs w:val="40"/>
-              </w:rPr>
-              <w:t>-  B</w:t>
-            </w:r>
-            <w:proofErr w:type="gramEnd"/>
+              <w:t>)-  B</w:t>
+            </w:r>
             <w:r>
               <w:rPr>
                 <w:rFonts w:ascii="BRH Malayalam Extra" w:hAnsi="BRH Malayalam Extra" w:cs="BRH Malayalam Extra"/>
@@ -14224,7 +15488,6 @@
               </w:rPr>
               <w:t>–</w:t>
             </w:r>
-            <w:proofErr w:type="gramStart"/>
             <w:r>
               <w:rPr>
                 <w:rFonts w:ascii="BRH Malayalam Extra" w:hAnsi="BRH Malayalam Extra" w:cs="BRH Malayalam Extra"/>
@@ -14252,18 +15515,7 @@
                 <w:szCs w:val="40"/>
                 <w:highlight w:val="green"/>
               </w:rPr>
-              <w:t>O</w:t>
-            </w:r>
-            <w:proofErr w:type="gramEnd"/>
-            <w:r>
-              <w:rPr>
-                <w:rFonts w:ascii="BRH Malayalam Extra" w:hAnsi="BRH Malayalam Extra" w:cs="BRH Malayalam Extra"/>
-                <w:color w:val="000000"/>
-                <w:sz w:val="32"/>
-                <w:szCs w:val="40"/>
-                <w:highlight w:val="green"/>
-              </w:rPr>
-              <w:t>§</w:t>
+              <w:t>O§</w:t>
             </w:r>
             <w:r>
               <w:rPr>
@@ -14461,27 +15713,7 @@
                 <w:sz w:val="32"/>
                 <w:szCs w:val="40"/>
               </w:rPr>
-              <w:t>)</w:t>
-            </w:r>
-            <w:proofErr w:type="gramStart"/>
-            <w:r>
-              <w:rPr>
-                <w:rFonts w:ascii="BRH Malayalam Extra" w:hAnsi="BRH Malayalam Extra" w:cs="BRH Malayalam Extra"/>
-                <w:color w:val="000000"/>
-                <w:sz w:val="32"/>
-                <w:szCs w:val="40"/>
-              </w:rPr>
-              <w:t>-  dõO</w:t>
-            </w:r>
-            <w:proofErr w:type="gramEnd"/>
-            <w:r>
-              <w:rPr>
-                <w:rFonts w:ascii="BRH Malayalam Extra" w:hAnsi="BRH Malayalam Extra" w:cs="BRH Malayalam Extra"/>
-                <w:color w:val="000000"/>
-                <w:sz w:val="32"/>
-                <w:szCs w:val="40"/>
-              </w:rPr>
-              <w:t>§— | k</w:t>
+              <w:t>)-  dõO§— | k</w:t>
             </w:r>
             <w:r>
               <w:rPr>
@@ -14595,7 +15827,6 @@
               </w:rPr>
               <w:t>–</w:t>
             </w:r>
-            <w:proofErr w:type="gramStart"/>
             <w:r>
               <w:rPr>
                 <w:rFonts w:ascii="BRH Malayalam Extra" w:hAnsi="BRH Malayalam Extra" w:cs="BRH Malayalam Extra"/>
@@ -14625,7 +15856,6 @@
               </w:rPr>
               <w:t>O</w:t>
             </w:r>
-            <w:proofErr w:type="gramEnd"/>
             <w:r>
               <w:rPr>
                 <w:rFonts w:ascii="BRH Malayalam Extra" w:hAnsi="BRH Malayalam Extra" w:cs="BRH Malayalam Extra"/>
@@ -14805,19 +16035,8 @@
                 <w:sz w:val="32"/>
                 <w:szCs w:val="40"/>
               </w:rPr>
-              <w:t>)</w:t>
-            </w:r>
-            <w:proofErr w:type="gramStart"/>
-            <w:r>
-              <w:rPr>
-                <w:rFonts w:ascii="BRH Malayalam Extra" w:hAnsi="BRH Malayalam Extra" w:cs="BRH Malayalam Extra"/>
-                <w:color w:val="000000"/>
-                <w:sz w:val="32"/>
-                <w:szCs w:val="40"/>
-              </w:rPr>
-              <w:t>-  j</w:t>
-            </w:r>
-            <w:proofErr w:type="gramEnd"/>
+              <w:t>)-  j</w:t>
+            </w:r>
             <w:r>
               <w:rPr>
                 <w:rFonts w:ascii="BRH Malayalam Extra" w:hAnsi="BRH Malayalam Extra" w:cs="BRH Malayalam Extra"/>
@@ -15188,19 +16407,8 @@
                 <w:sz w:val="32"/>
                 <w:szCs w:val="40"/>
               </w:rPr>
-              <w:t>)</w:t>
-            </w:r>
-            <w:proofErr w:type="gramStart"/>
-            <w:r>
-              <w:rPr>
-                <w:rFonts w:ascii="BRH Malayalam Extra" w:hAnsi="BRH Malayalam Extra" w:cs="BRH Malayalam Extra"/>
-                <w:color w:val="000000"/>
-                <w:sz w:val="32"/>
-                <w:szCs w:val="40"/>
-              </w:rPr>
-              <w:t>-  j</w:t>
-            </w:r>
-            <w:proofErr w:type="gramEnd"/>
+              <w:t>)-  j</w:t>
+            </w:r>
             <w:r>
               <w:rPr>
                 <w:rFonts w:ascii="BRH Malayalam Extra" w:hAnsi="BRH Malayalam Extra" w:cs="BRH Malayalam Extra"/>
@@ -15575,27 +16783,7 @@
                 <w:sz w:val="32"/>
                 <w:szCs w:val="40"/>
               </w:rPr>
-              <w:t>)</w:t>
-            </w:r>
-            <w:proofErr w:type="gramStart"/>
-            <w:r>
-              <w:rPr>
-                <w:rFonts w:ascii="BRH Malayalam Extra" w:hAnsi="BRH Malayalam Extra" w:cs="BRH Malayalam Extra"/>
-                <w:color w:val="000000"/>
-                <w:sz w:val="32"/>
-                <w:szCs w:val="40"/>
-              </w:rPr>
-              <w:t>-  eyg</w:t>
-            </w:r>
-            <w:proofErr w:type="gramEnd"/>
-            <w:r>
-              <w:rPr>
-                <w:rFonts w:ascii="BRH Malayalam Extra" w:hAnsi="BRH Malayalam Extra" w:cs="BRH Malayalam Extra"/>
-                <w:color w:val="000000"/>
-                <w:sz w:val="32"/>
-                <w:szCs w:val="40"/>
-              </w:rPr>
-              <w:t>—Çy ||</w:t>
+              <w:t>)-  eyg—Çy ||</w:t>
             </w:r>
           </w:p>
           <w:p>
@@ -15805,27 +16993,7 @@
                 <w:sz w:val="32"/>
                 <w:szCs w:val="40"/>
               </w:rPr>
-              <w:t>)</w:t>
-            </w:r>
-            <w:proofErr w:type="gramStart"/>
-            <w:r>
-              <w:rPr>
-                <w:rFonts w:ascii="BRH Malayalam Extra" w:hAnsi="BRH Malayalam Extra" w:cs="BRH Malayalam Extra"/>
-                <w:color w:val="000000"/>
-                <w:sz w:val="32"/>
-                <w:szCs w:val="40"/>
-              </w:rPr>
-              <w:t>-  eyg</w:t>
-            </w:r>
-            <w:proofErr w:type="gramEnd"/>
-            <w:r>
-              <w:rPr>
-                <w:rFonts w:ascii="BRH Malayalam Extra" w:hAnsi="BRH Malayalam Extra" w:cs="BRH Malayalam Extra"/>
-                <w:color w:val="000000"/>
-                <w:sz w:val="32"/>
-                <w:szCs w:val="40"/>
-              </w:rPr>
-              <w:t>—Çy ||</w:t>
+              <w:t>)-  eyg—Çy ||</w:t>
             </w:r>
           </w:p>
           <w:p>
@@ -16030,19 +17198,8 @@
                 <w:sz w:val="32"/>
                 <w:szCs w:val="40"/>
               </w:rPr>
-              <w:t>)</w:t>
-            </w:r>
-            <w:proofErr w:type="gramStart"/>
-            <w:r>
-              <w:rPr>
-                <w:rFonts w:ascii="BRH Malayalam Extra" w:hAnsi="BRH Malayalam Extra" w:cs="BRH Malayalam Extra"/>
-                <w:color w:val="000000"/>
-                <w:sz w:val="32"/>
-                <w:szCs w:val="40"/>
-              </w:rPr>
-              <w:t>-  t</w:t>
-            </w:r>
-            <w:proofErr w:type="gramEnd"/>
+              <w:t>)-  t</w:t>
+            </w:r>
             <w:r>
               <w:rPr>
                 <w:rFonts w:ascii="BRH Malayalam Extra" w:hAnsi="BRH Malayalam Extra" w:cs="BRH Malayalam Extra"/>
@@ -16351,19 +17508,8 @@
                 <w:sz w:val="32"/>
                 <w:szCs w:val="40"/>
               </w:rPr>
-              <w:t>)</w:t>
-            </w:r>
-            <w:proofErr w:type="gramStart"/>
-            <w:r>
-              <w:rPr>
-                <w:rFonts w:ascii="BRH Malayalam Extra" w:hAnsi="BRH Malayalam Extra" w:cs="BRH Malayalam Extra"/>
-                <w:color w:val="000000"/>
-                <w:sz w:val="32"/>
-                <w:szCs w:val="40"/>
-              </w:rPr>
-              <w:t>-  t</w:t>
-            </w:r>
-            <w:proofErr w:type="gramEnd"/>
+              <w:t>)-  t</w:t>
+            </w:r>
             <w:r>
               <w:rPr>
                 <w:rFonts w:ascii="BRH Malayalam Extra" w:hAnsi="BRH Malayalam Extra" w:cs="BRH Malayalam Extra"/>
@@ -17058,7 +18204,6 @@
                 <w:szCs w:val="40"/>
                 <w:lang w:val="it-IT"/>
               </w:rPr>
-              <w:lastRenderedPageBreak/>
               <w:t>4</w:t>
             </w:r>
             <w:r>
@@ -17690,6 +18835,7 @@
                 <w:szCs w:val="40"/>
                 <w:lang w:val="it-IT"/>
               </w:rPr>
+              <w:lastRenderedPageBreak/>
               <w:t>E</w:t>
             </w:r>
             <w:r>
@@ -17872,6 +19018,7 @@
                 <w:szCs w:val="40"/>
                 <w:lang w:val="it-IT"/>
               </w:rPr>
+              <w:lastRenderedPageBreak/>
               <w:t>4</w:t>
             </w:r>
             <w:r>
@@ -18513,6 +19660,7 @@
                 <w:szCs w:val="40"/>
                 <w:lang w:val="it-IT"/>
               </w:rPr>
+              <w:lastRenderedPageBreak/>
               <w:t>E</w:t>
             </w:r>
             <w:r>
@@ -18872,27 +20020,7 @@
           <w:sz w:val="28"/>
           <w:szCs w:val="32"/>
         </w:rPr>
-        <w:t>(</w:t>
-      </w:r>
-      <w:proofErr w:type="gramStart"/>
-      <w:r>
-        <w:rPr>
-          <w:b/>
-          <w:bCs/>
-          <w:sz w:val="28"/>
-          <w:szCs w:val="32"/>
-        </w:rPr>
-        <w:t>ignore</w:t>
-      </w:r>
-      <w:proofErr w:type="gramEnd"/>
-      <w:r>
-        <w:rPr>
-          <w:b/>
-          <w:bCs/>
-          <w:sz w:val="28"/>
-          <w:szCs w:val="32"/>
-        </w:rPr>
-        <w:t xml:space="preserve"> those which are already incorporated in your book’s version and date)</w:t>
+        <w:t>(ignore those which are already incorporated in your book’s version and date)</w:t>
       </w:r>
     </w:p>
     <w:tbl>
@@ -19176,7 +20304,7 @@
 </file>
 
 <file path=word/endnotes.xml><?xml version="1.0" encoding="utf-8"?>
-<w:endnotes xmlns:wpc="http://schemas.microsoft.com/office/word/2010/wordprocessingCanvas" xmlns:cx="http://schemas.microsoft.com/office/drawing/2014/chartex" xmlns:cx1="http://schemas.microsoft.com/office/drawing/2015/9/8/chartex" xmlns:cx2="http://schemas.microsoft.com/office/drawing/2015/10/21/chartex" xmlns:cx3="http://schemas.microsoft.com/office/drawing/2016/5/9/chartex" xmlns:cx4="http://schemas.microsoft.com/office/drawing/2016/5/10/chartex" xmlns:cx5="http://schemas.microsoft.com/office/drawing/2016/5/11/chartex" xmlns:cx6="http://schemas.microsoft.com/office/drawing/2016/5/12/chartex" xmlns:cx7="http://schemas.microsoft.com/office/drawing/2016/5/13/chartex" xmlns:cx8="http://schemas.microsoft.com/office/drawing/2016/5/14/chartex" xmlns:mc="http://schemas.openxmlformats.org/markup-compatibility/2006" xmlns:aink="http://schemas.microsoft.com/office/drawing/2016/ink" xmlns:am3d="http://schemas.microsoft.com/office/drawing/2017/model3d" xmlns:o="urn:schemas-microsoft-com:office:office" xmlns:oel="http://schemas.microsoft.com/office/2019/extlst" xmlns:r="http://schemas.openxmlformats.org/officeDocument/2006/relationships" xmlns:m="http://schemas.openxmlformats.org/officeDocument/2006/math" xmlns:v="urn:schemas-microsoft-com:vml" xmlns:wp14="http://schemas.microsoft.com/office/word/2010/wordprocessingDrawing" xmlns:wp="http://schemas.openxmlformats.org/drawingml/2006/wordprocessingDrawing" xmlns:w10="urn:schemas-microsoft-com:office:word" xmlns:w="http://schemas.openxmlformats.org/wordprocessingml/2006/main" xmlns:w14="http://schemas.microsoft.com/office/word/2010/wordml" xmlns:w15="http://schemas.microsoft.com/office/word/2012/wordml" xmlns:w16cex="http://schemas.microsoft.com/office/word/2018/wordml/cex" xmlns:w16cid="http://schemas.microsoft.com/office/word/2016/wordml/cid" xmlns:w16="http://schemas.microsoft.com/office/word/2018/wordml" xmlns:w16sdtdh="http://schemas.microsoft.com/office/word/2020/wordml/sdtdatahash" xmlns:w16se="http://schemas.microsoft.com/office/word/2015/wordml/symex" xmlns:wpg="http://schemas.microsoft.com/office/word/2010/wordprocessingGroup" xmlns:wpi="http://schemas.microsoft.com/office/word/2010/wordprocessingInk" xmlns:wne="http://schemas.microsoft.com/office/word/2006/wordml" xmlns:wps="http://schemas.microsoft.com/office/word/2010/wordprocessingShape" mc:Ignorable="w14 w15 w16se w16cid w16 w16cex w16sdtdh wp14">
+<w:endnotes xmlns:wpc="http://schemas.microsoft.com/office/word/2010/wordprocessingCanvas" xmlns:cx="http://schemas.microsoft.com/office/drawing/2014/chartex" xmlns:cx1="http://schemas.microsoft.com/office/drawing/2015/9/8/chartex" xmlns:cx2="http://schemas.microsoft.com/office/drawing/2015/10/21/chartex" xmlns:cx3="http://schemas.microsoft.com/office/drawing/2016/5/9/chartex" xmlns:cx4="http://schemas.microsoft.com/office/drawing/2016/5/10/chartex" xmlns:cx5="http://schemas.microsoft.com/office/drawing/2016/5/11/chartex" xmlns:cx6="http://schemas.microsoft.com/office/drawing/2016/5/12/chartex" xmlns:cx7="http://schemas.microsoft.com/office/drawing/2016/5/13/chartex" xmlns:cx8="http://schemas.microsoft.com/office/drawing/2016/5/14/chartex" xmlns:mc="http://schemas.openxmlformats.org/markup-compatibility/2006" xmlns:aink="http://schemas.microsoft.com/office/drawing/2016/ink" xmlns:am3d="http://schemas.microsoft.com/office/drawing/2017/model3d" xmlns:o="urn:schemas-microsoft-com:office:office" xmlns:oel="http://schemas.microsoft.com/office/2019/extlst" xmlns:r="http://schemas.openxmlformats.org/officeDocument/2006/relationships" xmlns:m="http://schemas.openxmlformats.org/officeDocument/2006/math" xmlns:v="urn:schemas-microsoft-com:vml" xmlns:wp14="http://schemas.microsoft.com/office/word/2010/wordprocessingDrawing" xmlns:wp="http://schemas.openxmlformats.org/drawingml/2006/wordprocessingDrawing" xmlns:w10="urn:schemas-microsoft-com:office:word" xmlns:w="http://schemas.openxmlformats.org/wordprocessingml/2006/main" xmlns:w14="http://schemas.microsoft.com/office/word/2010/wordml" xmlns:w15="http://schemas.microsoft.com/office/word/2012/wordml" xmlns:w16cex="http://schemas.microsoft.com/office/word/2018/wordml/cex" xmlns:w16cid="http://schemas.microsoft.com/office/word/2016/wordml/cid" xmlns:w16="http://schemas.microsoft.com/office/word/2018/wordml" xmlns:w16du="http://schemas.microsoft.com/office/word/2023/wordml/word16du" xmlns:w16sdtdh="http://schemas.microsoft.com/office/word/2020/wordml/sdtdatahash" xmlns:w16sdtfl="http://schemas.microsoft.com/office/word/2024/wordml/sdtformatlock" xmlns:w16se="http://schemas.microsoft.com/office/word/2015/wordml/symex" xmlns:wpg="http://schemas.microsoft.com/office/word/2010/wordprocessingGroup" xmlns:wpi="http://schemas.microsoft.com/office/word/2010/wordprocessingInk" xmlns:wne="http://schemas.microsoft.com/office/word/2006/wordml" xmlns:wps="http://schemas.microsoft.com/office/word/2010/wordprocessingShape" mc:Ignorable="w14 w15 w16se w16cid w16 w16cex w16sdtdh w16sdtfl w16du wp14">
   <w:endnote w:type="separator" w:id="-1">
     <w:p>
       <w:pPr>
@@ -19201,7 +20329,7 @@
 </file>
 
 <file path=word/footer1.xml><?xml version="1.0" encoding="utf-8"?>
-<w:ftr xmlns:wpc="http://schemas.microsoft.com/office/word/2010/wordprocessingCanvas" xmlns:cx="http://schemas.microsoft.com/office/drawing/2014/chartex" xmlns:cx1="http://schemas.microsoft.com/office/drawing/2015/9/8/chartex" xmlns:cx2="http://schemas.microsoft.com/office/drawing/2015/10/21/chartex" xmlns:cx3="http://schemas.microsoft.com/office/drawing/2016/5/9/chartex" xmlns:cx4="http://schemas.microsoft.com/office/drawing/2016/5/10/chartex" xmlns:cx5="http://schemas.microsoft.com/office/drawing/2016/5/11/chartex" xmlns:cx6="http://schemas.microsoft.com/office/drawing/2016/5/12/chartex" xmlns:cx7="http://schemas.microsoft.com/office/drawing/2016/5/13/chartex" xmlns:cx8="http://schemas.microsoft.com/office/drawing/2016/5/14/chartex" xmlns:mc="http://schemas.openxmlformats.org/markup-compatibility/2006" xmlns:aink="http://schemas.microsoft.com/office/drawing/2016/ink" xmlns:am3d="http://schemas.microsoft.com/office/drawing/2017/model3d" xmlns:o="urn:schemas-microsoft-com:office:office" xmlns:oel="http://schemas.microsoft.com/office/2019/extlst" xmlns:r="http://schemas.openxmlformats.org/officeDocument/2006/relationships" xmlns:m="http://schemas.openxmlformats.org/officeDocument/2006/math" xmlns:v="urn:schemas-microsoft-com:vml" xmlns:wp14="http://schemas.microsoft.com/office/word/2010/wordprocessingDrawing" xmlns:wp="http://schemas.openxmlformats.org/drawingml/2006/wordprocessingDrawing" xmlns:w10="urn:schemas-microsoft-com:office:word" xmlns:w="http://schemas.openxmlformats.org/wordprocessingml/2006/main" xmlns:w14="http://schemas.microsoft.com/office/word/2010/wordml" xmlns:w15="http://schemas.microsoft.com/office/word/2012/wordml" xmlns:w16cex="http://schemas.microsoft.com/office/word/2018/wordml/cex" xmlns:w16cid="http://schemas.microsoft.com/office/word/2016/wordml/cid" xmlns:w16="http://schemas.microsoft.com/office/word/2018/wordml" xmlns:w16sdtdh="http://schemas.microsoft.com/office/word/2020/wordml/sdtdatahash" xmlns:w16se="http://schemas.microsoft.com/office/word/2015/wordml/symex" xmlns:wpg="http://schemas.microsoft.com/office/word/2010/wordprocessingGroup" xmlns:wpi="http://schemas.microsoft.com/office/word/2010/wordprocessingInk" xmlns:wne="http://schemas.microsoft.com/office/word/2006/wordml" xmlns:wps="http://schemas.microsoft.com/office/word/2010/wordprocessingShape" mc:Ignorable="w14 w15 w16se w16cid w16 w16cex w16sdtdh wp14">
+<w:ftr xmlns:wpc="http://schemas.microsoft.com/office/word/2010/wordprocessingCanvas" xmlns:cx="http://schemas.microsoft.com/office/drawing/2014/chartex" xmlns:cx1="http://schemas.microsoft.com/office/drawing/2015/9/8/chartex" xmlns:cx2="http://schemas.microsoft.com/office/drawing/2015/10/21/chartex" xmlns:cx3="http://schemas.microsoft.com/office/drawing/2016/5/9/chartex" xmlns:cx4="http://schemas.microsoft.com/office/drawing/2016/5/10/chartex" xmlns:cx5="http://schemas.microsoft.com/office/drawing/2016/5/11/chartex" xmlns:cx6="http://schemas.microsoft.com/office/drawing/2016/5/12/chartex" xmlns:cx7="http://schemas.microsoft.com/office/drawing/2016/5/13/chartex" xmlns:cx8="http://schemas.microsoft.com/office/drawing/2016/5/14/chartex" xmlns:mc="http://schemas.openxmlformats.org/markup-compatibility/2006" xmlns:aink="http://schemas.microsoft.com/office/drawing/2016/ink" xmlns:am3d="http://schemas.microsoft.com/office/drawing/2017/model3d" xmlns:o="urn:schemas-microsoft-com:office:office" xmlns:oel="http://schemas.microsoft.com/office/2019/extlst" xmlns:r="http://schemas.openxmlformats.org/officeDocument/2006/relationships" xmlns:m="http://schemas.openxmlformats.org/officeDocument/2006/math" xmlns:v="urn:schemas-microsoft-com:vml" xmlns:wp14="http://schemas.microsoft.com/office/word/2010/wordprocessingDrawing" xmlns:wp="http://schemas.openxmlformats.org/drawingml/2006/wordprocessingDrawing" xmlns:w10="urn:schemas-microsoft-com:office:word" xmlns:w="http://schemas.openxmlformats.org/wordprocessingml/2006/main" xmlns:w14="http://schemas.microsoft.com/office/word/2010/wordml" xmlns:w15="http://schemas.microsoft.com/office/word/2012/wordml" xmlns:w16cex="http://schemas.microsoft.com/office/word/2018/wordml/cex" xmlns:w16cid="http://schemas.microsoft.com/office/word/2016/wordml/cid" xmlns:w16="http://schemas.microsoft.com/office/word/2018/wordml" xmlns:w16du="http://schemas.microsoft.com/office/word/2023/wordml/word16du" xmlns:w16sdtdh="http://schemas.microsoft.com/office/word/2020/wordml/sdtdatahash" xmlns:w16sdtfl="http://schemas.microsoft.com/office/word/2024/wordml/sdtformatlock" xmlns:w16se="http://schemas.microsoft.com/office/word/2015/wordml/symex" xmlns:wpg="http://schemas.microsoft.com/office/word/2010/wordprocessingGroup" xmlns:wpi="http://schemas.microsoft.com/office/word/2010/wordprocessingInk" xmlns:wne="http://schemas.microsoft.com/office/word/2006/wordml" xmlns:wps="http://schemas.microsoft.com/office/word/2010/wordprocessingShape" mc:Ignorable="w14 w15 w16se w16cid w16 w16cex w16sdtdh w16sdtfl w16du wp14">
   <w:p>
     <w:pPr>
       <w:pBdr>
@@ -19383,7 +20511,7 @@
 </file>
 
 <file path=word/footer2.xml><?xml version="1.0" encoding="utf-8"?>
-<w:ftr xmlns:wpc="http://schemas.microsoft.com/office/word/2010/wordprocessingCanvas" xmlns:cx="http://schemas.microsoft.com/office/drawing/2014/chartex" xmlns:cx1="http://schemas.microsoft.com/office/drawing/2015/9/8/chartex" xmlns:cx2="http://schemas.microsoft.com/office/drawing/2015/10/21/chartex" xmlns:cx3="http://schemas.microsoft.com/office/drawing/2016/5/9/chartex" xmlns:cx4="http://schemas.microsoft.com/office/drawing/2016/5/10/chartex" xmlns:cx5="http://schemas.microsoft.com/office/drawing/2016/5/11/chartex" xmlns:cx6="http://schemas.microsoft.com/office/drawing/2016/5/12/chartex" xmlns:cx7="http://schemas.microsoft.com/office/drawing/2016/5/13/chartex" xmlns:cx8="http://schemas.microsoft.com/office/drawing/2016/5/14/chartex" xmlns:mc="http://schemas.openxmlformats.org/markup-compatibility/2006" xmlns:aink="http://schemas.microsoft.com/office/drawing/2016/ink" xmlns:am3d="http://schemas.microsoft.com/office/drawing/2017/model3d" xmlns:o="urn:schemas-microsoft-com:office:office" xmlns:oel="http://schemas.microsoft.com/office/2019/extlst" xmlns:r="http://schemas.openxmlformats.org/officeDocument/2006/relationships" xmlns:m="http://schemas.openxmlformats.org/officeDocument/2006/math" xmlns:v="urn:schemas-microsoft-com:vml" xmlns:wp14="http://schemas.microsoft.com/office/word/2010/wordprocessingDrawing" xmlns:wp="http://schemas.openxmlformats.org/drawingml/2006/wordprocessingDrawing" xmlns:w10="urn:schemas-microsoft-com:office:word" xmlns:w="http://schemas.openxmlformats.org/wordprocessingml/2006/main" xmlns:w14="http://schemas.microsoft.com/office/word/2010/wordml" xmlns:w15="http://schemas.microsoft.com/office/word/2012/wordml" xmlns:w16cex="http://schemas.microsoft.com/office/word/2018/wordml/cex" xmlns:w16cid="http://schemas.microsoft.com/office/word/2016/wordml/cid" xmlns:w16="http://schemas.microsoft.com/office/word/2018/wordml" xmlns:w16sdtdh="http://schemas.microsoft.com/office/word/2020/wordml/sdtdatahash" xmlns:w16se="http://schemas.microsoft.com/office/word/2015/wordml/symex" xmlns:wpg="http://schemas.microsoft.com/office/word/2010/wordprocessingGroup" xmlns:wpi="http://schemas.microsoft.com/office/word/2010/wordprocessingInk" xmlns:wne="http://schemas.microsoft.com/office/word/2006/wordml" xmlns:wps="http://schemas.microsoft.com/office/word/2010/wordprocessingShape" mc:Ignorable="w14 w15 w16se w16cid w16 w16cex w16sdtdh wp14">
+<w:ftr xmlns:wpc="http://schemas.microsoft.com/office/word/2010/wordprocessingCanvas" xmlns:cx="http://schemas.microsoft.com/office/drawing/2014/chartex" xmlns:cx1="http://schemas.microsoft.com/office/drawing/2015/9/8/chartex" xmlns:cx2="http://schemas.microsoft.com/office/drawing/2015/10/21/chartex" xmlns:cx3="http://schemas.microsoft.com/office/drawing/2016/5/9/chartex" xmlns:cx4="http://schemas.microsoft.com/office/drawing/2016/5/10/chartex" xmlns:cx5="http://schemas.microsoft.com/office/drawing/2016/5/11/chartex" xmlns:cx6="http://schemas.microsoft.com/office/drawing/2016/5/12/chartex" xmlns:cx7="http://schemas.microsoft.com/office/drawing/2016/5/13/chartex" xmlns:cx8="http://schemas.microsoft.com/office/drawing/2016/5/14/chartex" xmlns:mc="http://schemas.openxmlformats.org/markup-compatibility/2006" xmlns:aink="http://schemas.microsoft.com/office/drawing/2016/ink" xmlns:am3d="http://schemas.microsoft.com/office/drawing/2017/model3d" xmlns:o="urn:schemas-microsoft-com:office:office" xmlns:oel="http://schemas.microsoft.com/office/2019/extlst" xmlns:r="http://schemas.openxmlformats.org/officeDocument/2006/relationships" xmlns:m="http://schemas.openxmlformats.org/officeDocument/2006/math" xmlns:v="urn:schemas-microsoft-com:vml" xmlns:wp14="http://schemas.microsoft.com/office/word/2010/wordprocessingDrawing" xmlns:wp="http://schemas.openxmlformats.org/drawingml/2006/wordprocessingDrawing" xmlns:w10="urn:schemas-microsoft-com:office:word" xmlns:w="http://schemas.openxmlformats.org/wordprocessingml/2006/main" xmlns:w14="http://schemas.microsoft.com/office/word/2010/wordml" xmlns:w15="http://schemas.microsoft.com/office/word/2012/wordml" xmlns:w16cex="http://schemas.microsoft.com/office/word/2018/wordml/cex" xmlns:w16cid="http://schemas.microsoft.com/office/word/2016/wordml/cid" xmlns:w16="http://schemas.microsoft.com/office/word/2018/wordml" xmlns:w16du="http://schemas.microsoft.com/office/word/2023/wordml/word16du" xmlns:w16sdtdh="http://schemas.microsoft.com/office/word/2020/wordml/sdtdatahash" xmlns:w16sdtfl="http://schemas.microsoft.com/office/word/2024/wordml/sdtformatlock" xmlns:w16se="http://schemas.microsoft.com/office/word/2015/wordml/symex" xmlns:wpg="http://schemas.microsoft.com/office/word/2010/wordprocessingGroup" xmlns:wpi="http://schemas.microsoft.com/office/word/2010/wordprocessingInk" xmlns:wne="http://schemas.microsoft.com/office/word/2006/wordml" xmlns:wps="http://schemas.microsoft.com/office/word/2010/wordprocessingShape" mc:Ignorable="w14 w15 w16se w16cid w16 w16cex w16sdtdh w16sdtfl w16du wp14">
   <w:p>
     <w:pPr>
       <w:pBdr>
@@ -19589,7 +20717,7 @@
 </file>
 
 <file path=word/footnotes.xml><?xml version="1.0" encoding="utf-8"?>
-<w:footnotes xmlns:wpc="http://schemas.microsoft.com/office/word/2010/wordprocessingCanvas" xmlns:cx="http://schemas.microsoft.com/office/drawing/2014/chartex" xmlns:cx1="http://schemas.microsoft.com/office/drawing/2015/9/8/chartex" xmlns:cx2="http://schemas.microsoft.com/office/drawing/2015/10/21/chartex" xmlns:cx3="http://schemas.microsoft.com/office/drawing/2016/5/9/chartex" xmlns:cx4="http://schemas.microsoft.com/office/drawing/2016/5/10/chartex" xmlns:cx5="http://schemas.microsoft.com/office/drawing/2016/5/11/chartex" xmlns:cx6="http://schemas.microsoft.com/office/drawing/2016/5/12/chartex" xmlns:cx7="http://schemas.microsoft.com/office/drawing/2016/5/13/chartex" xmlns:cx8="http://schemas.microsoft.com/office/drawing/2016/5/14/chartex" xmlns:mc="http://schemas.openxmlformats.org/markup-compatibility/2006" xmlns:aink="http://schemas.microsoft.com/office/drawing/2016/ink" xmlns:am3d="http://schemas.microsoft.com/office/drawing/2017/model3d" xmlns:o="urn:schemas-microsoft-com:office:office" xmlns:oel="http://schemas.microsoft.com/office/2019/extlst" xmlns:r="http://schemas.openxmlformats.org/officeDocument/2006/relationships" xmlns:m="http://schemas.openxmlformats.org/officeDocument/2006/math" xmlns:v="urn:schemas-microsoft-com:vml" xmlns:wp14="http://schemas.microsoft.com/office/word/2010/wordprocessingDrawing" xmlns:wp="http://schemas.openxmlformats.org/drawingml/2006/wordprocessingDrawing" xmlns:w10="urn:schemas-microsoft-com:office:word" xmlns:w="http://schemas.openxmlformats.org/wordprocessingml/2006/main" xmlns:w14="http://schemas.microsoft.com/office/word/2010/wordml" xmlns:w15="http://schemas.microsoft.com/office/word/2012/wordml" xmlns:w16cex="http://schemas.microsoft.com/office/word/2018/wordml/cex" xmlns:w16cid="http://schemas.microsoft.com/office/word/2016/wordml/cid" xmlns:w16="http://schemas.microsoft.com/office/word/2018/wordml" xmlns:w16sdtdh="http://schemas.microsoft.com/office/word/2020/wordml/sdtdatahash" xmlns:w16se="http://schemas.microsoft.com/office/word/2015/wordml/symex" xmlns:wpg="http://schemas.microsoft.com/office/word/2010/wordprocessingGroup" xmlns:wpi="http://schemas.microsoft.com/office/word/2010/wordprocessingInk" xmlns:wne="http://schemas.microsoft.com/office/word/2006/wordml" xmlns:wps="http://schemas.microsoft.com/office/word/2010/wordprocessingShape" mc:Ignorable="w14 w15 w16se w16cid w16 w16cex w16sdtdh wp14">
+<w:footnotes xmlns:wpc="http://schemas.microsoft.com/office/word/2010/wordprocessingCanvas" xmlns:cx="http://schemas.microsoft.com/office/drawing/2014/chartex" xmlns:cx1="http://schemas.microsoft.com/office/drawing/2015/9/8/chartex" xmlns:cx2="http://schemas.microsoft.com/office/drawing/2015/10/21/chartex" xmlns:cx3="http://schemas.microsoft.com/office/drawing/2016/5/9/chartex" xmlns:cx4="http://schemas.microsoft.com/office/drawing/2016/5/10/chartex" xmlns:cx5="http://schemas.microsoft.com/office/drawing/2016/5/11/chartex" xmlns:cx6="http://schemas.microsoft.com/office/drawing/2016/5/12/chartex" xmlns:cx7="http://schemas.microsoft.com/office/drawing/2016/5/13/chartex" xmlns:cx8="http://schemas.microsoft.com/office/drawing/2016/5/14/chartex" xmlns:mc="http://schemas.openxmlformats.org/markup-compatibility/2006" xmlns:aink="http://schemas.microsoft.com/office/drawing/2016/ink" xmlns:am3d="http://schemas.microsoft.com/office/drawing/2017/model3d" xmlns:o="urn:schemas-microsoft-com:office:office" xmlns:oel="http://schemas.microsoft.com/office/2019/extlst" xmlns:r="http://schemas.openxmlformats.org/officeDocument/2006/relationships" xmlns:m="http://schemas.openxmlformats.org/officeDocument/2006/math" xmlns:v="urn:schemas-microsoft-com:vml" xmlns:wp14="http://schemas.microsoft.com/office/word/2010/wordprocessingDrawing" xmlns:wp="http://schemas.openxmlformats.org/drawingml/2006/wordprocessingDrawing" xmlns:w10="urn:schemas-microsoft-com:office:word" xmlns:w="http://schemas.openxmlformats.org/wordprocessingml/2006/main" xmlns:w14="http://schemas.microsoft.com/office/word/2010/wordml" xmlns:w15="http://schemas.microsoft.com/office/word/2012/wordml" xmlns:w16cex="http://schemas.microsoft.com/office/word/2018/wordml/cex" xmlns:w16cid="http://schemas.microsoft.com/office/word/2016/wordml/cid" xmlns:w16="http://schemas.microsoft.com/office/word/2018/wordml" xmlns:w16du="http://schemas.microsoft.com/office/word/2023/wordml/word16du" xmlns:w16sdtdh="http://schemas.microsoft.com/office/word/2020/wordml/sdtdatahash" xmlns:w16sdtfl="http://schemas.microsoft.com/office/word/2024/wordml/sdtformatlock" xmlns:w16se="http://schemas.microsoft.com/office/word/2015/wordml/symex" xmlns:wpg="http://schemas.microsoft.com/office/word/2010/wordprocessingGroup" xmlns:wpi="http://schemas.microsoft.com/office/word/2010/wordprocessingInk" xmlns:wne="http://schemas.microsoft.com/office/word/2006/wordml" xmlns:wps="http://schemas.microsoft.com/office/word/2010/wordprocessingShape" mc:Ignorable="w14 w15 w16se w16cid w16 w16cex w16sdtdh w16sdtfl w16du wp14">
   <w:footnote w:type="separator" w:id="-1">
     <w:p>
       <w:pPr>
@@ -19614,7 +20742,7 @@
 </file>
 
 <file path=word/header1.xml><?xml version="1.0" encoding="utf-8"?>
-<w:hdr xmlns:wpc="http://schemas.microsoft.com/office/word/2010/wordprocessingCanvas" xmlns:cx="http://schemas.microsoft.com/office/drawing/2014/chartex" xmlns:cx1="http://schemas.microsoft.com/office/drawing/2015/9/8/chartex" xmlns:cx2="http://schemas.microsoft.com/office/drawing/2015/10/21/chartex" xmlns:cx3="http://schemas.microsoft.com/office/drawing/2016/5/9/chartex" xmlns:cx4="http://schemas.microsoft.com/office/drawing/2016/5/10/chartex" xmlns:cx5="http://schemas.microsoft.com/office/drawing/2016/5/11/chartex" xmlns:cx6="http://schemas.microsoft.com/office/drawing/2016/5/12/chartex" xmlns:cx7="http://schemas.microsoft.com/office/drawing/2016/5/13/chartex" xmlns:cx8="http://schemas.microsoft.com/office/drawing/2016/5/14/chartex" xmlns:mc="http://schemas.openxmlformats.org/markup-compatibility/2006" xmlns:aink="http://schemas.microsoft.com/office/drawing/2016/ink" xmlns:am3d="http://schemas.microsoft.com/office/drawing/2017/model3d" xmlns:o="urn:schemas-microsoft-com:office:office" xmlns:oel="http://schemas.microsoft.com/office/2019/extlst" xmlns:r="http://schemas.openxmlformats.org/officeDocument/2006/relationships" xmlns:m="http://schemas.openxmlformats.org/officeDocument/2006/math" xmlns:v="urn:schemas-microsoft-com:vml" xmlns:wp14="http://schemas.microsoft.com/office/word/2010/wordprocessingDrawing" xmlns:wp="http://schemas.openxmlformats.org/drawingml/2006/wordprocessingDrawing" xmlns:w10="urn:schemas-microsoft-com:office:word" xmlns:w="http://schemas.openxmlformats.org/wordprocessingml/2006/main" xmlns:w14="http://schemas.microsoft.com/office/word/2010/wordml" xmlns:w15="http://schemas.microsoft.com/office/word/2012/wordml" xmlns:w16cex="http://schemas.microsoft.com/office/word/2018/wordml/cex" xmlns:w16cid="http://schemas.microsoft.com/office/word/2016/wordml/cid" xmlns:w16="http://schemas.microsoft.com/office/word/2018/wordml" xmlns:w16sdtdh="http://schemas.microsoft.com/office/word/2020/wordml/sdtdatahash" xmlns:w16se="http://schemas.microsoft.com/office/word/2015/wordml/symex" xmlns:wpg="http://schemas.microsoft.com/office/word/2010/wordprocessingGroup" xmlns:wpi="http://schemas.microsoft.com/office/word/2010/wordprocessingInk" xmlns:wne="http://schemas.microsoft.com/office/word/2006/wordml" xmlns:wps="http://schemas.microsoft.com/office/word/2010/wordprocessingShape" mc:Ignorable="w14 w15 w16se w16cid w16 w16cex w16sdtdh wp14">
+<w:hdr xmlns:wpc="http://schemas.microsoft.com/office/word/2010/wordprocessingCanvas" xmlns:cx="http://schemas.microsoft.com/office/drawing/2014/chartex" xmlns:cx1="http://schemas.microsoft.com/office/drawing/2015/9/8/chartex" xmlns:cx2="http://schemas.microsoft.com/office/drawing/2015/10/21/chartex" xmlns:cx3="http://schemas.microsoft.com/office/drawing/2016/5/9/chartex" xmlns:cx4="http://schemas.microsoft.com/office/drawing/2016/5/10/chartex" xmlns:cx5="http://schemas.microsoft.com/office/drawing/2016/5/11/chartex" xmlns:cx6="http://schemas.microsoft.com/office/drawing/2016/5/12/chartex" xmlns:cx7="http://schemas.microsoft.com/office/drawing/2016/5/13/chartex" xmlns:cx8="http://schemas.microsoft.com/office/drawing/2016/5/14/chartex" xmlns:mc="http://schemas.openxmlformats.org/markup-compatibility/2006" xmlns:aink="http://schemas.microsoft.com/office/drawing/2016/ink" xmlns:am3d="http://schemas.microsoft.com/office/drawing/2017/model3d" xmlns:o="urn:schemas-microsoft-com:office:office" xmlns:oel="http://schemas.microsoft.com/office/2019/extlst" xmlns:r="http://schemas.openxmlformats.org/officeDocument/2006/relationships" xmlns:m="http://schemas.openxmlformats.org/officeDocument/2006/math" xmlns:v="urn:schemas-microsoft-com:vml" xmlns:wp14="http://schemas.microsoft.com/office/word/2010/wordprocessingDrawing" xmlns:wp="http://schemas.openxmlformats.org/drawingml/2006/wordprocessingDrawing" xmlns:w10="urn:schemas-microsoft-com:office:word" xmlns:w="http://schemas.openxmlformats.org/wordprocessingml/2006/main" xmlns:w14="http://schemas.microsoft.com/office/word/2010/wordml" xmlns:w15="http://schemas.microsoft.com/office/word/2012/wordml" xmlns:w16cex="http://schemas.microsoft.com/office/word/2018/wordml/cex" xmlns:w16cid="http://schemas.microsoft.com/office/word/2016/wordml/cid" xmlns:w16="http://schemas.microsoft.com/office/word/2018/wordml" xmlns:w16du="http://schemas.microsoft.com/office/word/2023/wordml/word16du" xmlns:w16sdtdh="http://schemas.microsoft.com/office/word/2020/wordml/sdtdatahash" xmlns:w16sdtfl="http://schemas.microsoft.com/office/word/2024/wordml/sdtformatlock" xmlns:w16se="http://schemas.microsoft.com/office/word/2015/wordml/symex" xmlns:wpg="http://schemas.microsoft.com/office/word/2010/wordprocessingGroup" xmlns:wpi="http://schemas.microsoft.com/office/word/2010/wordprocessingInk" xmlns:wne="http://schemas.microsoft.com/office/word/2006/wordml" xmlns:wps="http://schemas.microsoft.com/office/word/2010/wordprocessingShape" mc:Ignorable="w14 w15 w16se w16cid w16 w16cex w16sdtdh w16sdtfl w16du wp14">
   <w:p>
     <w:pPr>
       <w:pStyle w:val="Header"/>
@@ -19635,7 +20763,7 @@
 </file>
 
 <file path=word/header2.xml><?xml version="1.0" encoding="utf-8"?>
-<w:hdr xmlns:wpc="http://schemas.microsoft.com/office/word/2010/wordprocessingCanvas" xmlns:cx="http://schemas.microsoft.com/office/drawing/2014/chartex" xmlns:cx1="http://schemas.microsoft.com/office/drawing/2015/9/8/chartex" xmlns:cx2="http://schemas.microsoft.com/office/drawing/2015/10/21/chartex" xmlns:cx3="http://schemas.microsoft.com/office/drawing/2016/5/9/chartex" xmlns:cx4="http://schemas.microsoft.com/office/drawing/2016/5/10/chartex" xmlns:cx5="http://schemas.microsoft.com/office/drawing/2016/5/11/chartex" xmlns:cx6="http://schemas.microsoft.com/office/drawing/2016/5/12/chartex" xmlns:cx7="http://schemas.microsoft.com/office/drawing/2016/5/13/chartex" xmlns:cx8="http://schemas.microsoft.com/office/drawing/2016/5/14/chartex" xmlns:mc="http://schemas.openxmlformats.org/markup-compatibility/2006" xmlns:aink="http://schemas.microsoft.com/office/drawing/2016/ink" xmlns:am3d="http://schemas.microsoft.com/office/drawing/2017/model3d" xmlns:o="urn:schemas-microsoft-com:office:office" xmlns:oel="http://schemas.microsoft.com/office/2019/extlst" xmlns:r="http://schemas.openxmlformats.org/officeDocument/2006/relationships" xmlns:m="http://schemas.openxmlformats.org/officeDocument/2006/math" xmlns:v="urn:schemas-microsoft-com:vml" xmlns:wp14="http://schemas.microsoft.com/office/word/2010/wordprocessingDrawing" xmlns:wp="http://schemas.openxmlformats.org/drawingml/2006/wordprocessingDrawing" xmlns:w10="urn:schemas-microsoft-com:office:word" xmlns:w="http://schemas.openxmlformats.org/wordprocessingml/2006/main" xmlns:w14="http://schemas.microsoft.com/office/word/2010/wordml" xmlns:w15="http://schemas.microsoft.com/office/word/2012/wordml" xmlns:w16cex="http://schemas.microsoft.com/office/word/2018/wordml/cex" xmlns:w16cid="http://schemas.microsoft.com/office/word/2016/wordml/cid" xmlns:w16="http://schemas.microsoft.com/office/word/2018/wordml" xmlns:w16sdtdh="http://schemas.microsoft.com/office/word/2020/wordml/sdtdatahash" xmlns:w16se="http://schemas.microsoft.com/office/word/2015/wordml/symex" xmlns:wpg="http://schemas.microsoft.com/office/word/2010/wordprocessingGroup" xmlns:wpi="http://schemas.microsoft.com/office/word/2010/wordprocessingInk" xmlns:wne="http://schemas.microsoft.com/office/word/2006/wordml" xmlns:wps="http://schemas.microsoft.com/office/word/2010/wordprocessingShape" mc:Ignorable="w14 w15 w16se w16cid w16 w16cex w16sdtdh wp14">
+<w:hdr xmlns:wpc="http://schemas.microsoft.com/office/word/2010/wordprocessingCanvas" xmlns:cx="http://schemas.microsoft.com/office/drawing/2014/chartex" xmlns:cx1="http://schemas.microsoft.com/office/drawing/2015/9/8/chartex" xmlns:cx2="http://schemas.microsoft.com/office/drawing/2015/10/21/chartex" xmlns:cx3="http://schemas.microsoft.com/office/drawing/2016/5/9/chartex" xmlns:cx4="http://schemas.microsoft.com/office/drawing/2016/5/10/chartex" xmlns:cx5="http://schemas.microsoft.com/office/drawing/2016/5/11/chartex" xmlns:cx6="http://schemas.microsoft.com/office/drawing/2016/5/12/chartex" xmlns:cx7="http://schemas.microsoft.com/office/drawing/2016/5/13/chartex" xmlns:cx8="http://schemas.microsoft.com/office/drawing/2016/5/14/chartex" xmlns:mc="http://schemas.openxmlformats.org/markup-compatibility/2006" xmlns:aink="http://schemas.microsoft.com/office/drawing/2016/ink" xmlns:am3d="http://schemas.microsoft.com/office/drawing/2017/model3d" xmlns:o="urn:schemas-microsoft-com:office:office" xmlns:oel="http://schemas.microsoft.com/office/2019/extlst" xmlns:r="http://schemas.openxmlformats.org/officeDocument/2006/relationships" xmlns:m="http://schemas.openxmlformats.org/officeDocument/2006/math" xmlns:v="urn:schemas-microsoft-com:vml" xmlns:wp14="http://schemas.microsoft.com/office/word/2010/wordprocessingDrawing" xmlns:wp="http://schemas.openxmlformats.org/drawingml/2006/wordprocessingDrawing" xmlns:w10="urn:schemas-microsoft-com:office:word" xmlns:w="http://schemas.openxmlformats.org/wordprocessingml/2006/main" xmlns:w14="http://schemas.microsoft.com/office/word/2010/wordml" xmlns:w15="http://schemas.microsoft.com/office/word/2012/wordml" xmlns:w16cex="http://schemas.microsoft.com/office/word/2018/wordml/cex" xmlns:w16cid="http://schemas.microsoft.com/office/word/2016/wordml/cid" xmlns:w16="http://schemas.microsoft.com/office/word/2018/wordml" xmlns:w16du="http://schemas.microsoft.com/office/word/2023/wordml/word16du" xmlns:w16sdtdh="http://schemas.microsoft.com/office/word/2020/wordml/sdtdatahash" xmlns:w16sdtfl="http://schemas.microsoft.com/office/word/2024/wordml/sdtformatlock" xmlns:w16se="http://schemas.microsoft.com/office/word/2015/wordml/symex" xmlns:wpg="http://schemas.microsoft.com/office/word/2010/wordprocessingGroup" xmlns:wpi="http://schemas.microsoft.com/office/word/2010/wordprocessingInk" xmlns:wne="http://schemas.microsoft.com/office/word/2006/wordml" xmlns:wps="http://schemas.microsoft.com/office/word/2010/wordprocessingShape" mc:Ignorable="w14 w15 w16se w16cid w16 w16cex w16sdtdh w16sdtfl w16du wp14">
   <w:p>
     <w:pPr>
       <w:pStyle w:val="Header"/>
@@ -19648,7 +20776,7 @@
 </file>
 
 <file path=word/styles.xml><?xml version="1.0" encoding="utf-8"?>
-<w:styles xmlns:mc="http://schemas.openxmlformats.org/markup-compatibility/2006" xmlns:r="http://schemas.openxmlformats.org/officeDocument/2006/relationships" xmlns:w="http://schemas.openxmlformats.org/wordprocessingml/2006/main" xmlns:w14="http://schemas.microsoft.com/office/word/2010/wordml" xmlns:w15="http://schemas.microsoft.com/office/word/2012/wordml" xmlns:w16cex="http://schemas.microsoft.com/office/word/2018/wordml/cex" xmlns:w16cid="http://schemas.microsoft.com/office/word/2016/wordml/cid" xmlns:w16="http://schemas.microsoft.com/office/word/2018/wordml" xmlns:w16sdtdh="http://schemas.microsoft.com/office/word/2020/wordml/sdtdatahash" xmlns:w16se="http://schemas.microsoft.com/office/word/2015/wordml/symex" mc:Ignorable="w14 w15 w16se w16cid w16 w16cex w16sdtdh">
+<w:styles xmlns:mc="http://schemas.openxmlformats.org/markup-compatibility/2006" xmlns:r="http://schemas.openxmlformats.org/officeDocument/2006/relationships" xmlns:w="http://schemas.openxmlformats.org/wordprocessingml/2006/main" xmlns:w14="http://schemas.microsoft.com/office/word/2010/wordml" xmlns:w15="http://schemas.microsoft.com/office/word/2012/wordml" xmlns:w16cex="http://schemas.microsoft.com/office/word/2018/wordml/cex" xmlns:w16cid="http://schemas.microsoft.com/office/word/2016/wordml/cid" xmlns:w16="http://schemas.microsoft.com/office/word/2018/wordml" xmlns:w16du="http://schemas.microsoft.com/office/word/2023/wordml/word16du" xmlns:w16sdtdh="http://schemas.microsoft.com/office/word/2020/wordml/sdtdatahash" xmlns:w16sdtfl="http://schemas.microsoft.com/office/word/2024/wordml/sdtformatlock" xmlns:w16se="http://schemas.microsoft.com/office/word/2015/wordml/symex" mc:Ignorable="w14 w15 w16se w16cid w16 w16cex w16sdtdh w16sdtfl w16du">
   <w:docDefaults>
     <w:rPrDefault>
       <w:rPr>

</xml_diff>